<commit_message>
Convert inline formulas to equations and body code to screenshots
- render the inline mathematics in the body (intermediate values, the
  Hamming-weight model, the argmax selection, the Kyber product) as real
  Office equations via a new inline-math helper, so no formula remains as
  plain text
- replace the short code excerpts in the body with syntax-highlighted
  screenshots (Pygments); full listings stay as text in the appendices
- attach chapter page breaks to the heading (page_break_before) to avoid a
  blank page when a chapter fills its last page

All three member copies pass every check at 72 pages.
</commit_message>
<xml_diff>
--- a/report/CyberTrace_Project_Report_Lakshay.docx
+++ b/report/CyberTrace_Project_Report_Lakshay.docx
@@ -11,7 +11,7 @@
           <w:noProof/>
         </w:rPr>
         <w:drawing>
-          <wp:inline distT="0" distB="0" distL="0" distR="0" wp14:anchorId="07A7C895" wp14:editId="4AC6B633">
+          <wp:inline distT="0" distB="0" distL="0" distR="0" wp14:anchorId="1ABD3A5D" wp14:editId="6874B868">
             <wp:extent cx="2560320" cy="816494"/>
             <wp:effectExtent l="0" t="0" r="0" b="0"/>
             <wp:docPr id="1" name="Picture 1"/>
@@ -646,7 +646,7 @@
           <w:noProof/>
           <w:webHidden/>
         </w:rPr>
-        <w:instrText xml:space="preserve"> PAGEREF _Toc243341685 \h </w:instrText>
+        <w:instrText xml:space="preserve"> PAGEREF _Toc243342756 \h </w:instrText>
       </w:r>
       <w:r>
         <w:rPr>
@@ -717,7 +717,7 @@
           <w:noProof/>
           <w:webHidden/>
         </w:rPr>
-        <w:instrText xml:space="preserve"> PAGEREF _Toc243341686 \h </w:instrText>
+        <w:instrText xml:space="preserve"> PAGEREF _Toc243342757 \h </w:instrText>
       </w:r>
       <w:r>
         <w:rPr>
@@ -788,7 +788,7 @@
           <w:noProof/>
           <w:webHidden/>
         </w:rPr>
-        <w:instrText xml:space="preserve"> PAGEREF _Toc243341687 \h </w:instrText>
+        <w:instrText xml:space="preserve"> PAGEREF _Toc243342758 \h </w:instrText>
       </w:r>
       <w:r>
         <w:rPr>
@@ -859,7 +859,7 @@
           <w:noProof/>
           <w:webHidden/>
         </w:rPr>
-        <w:instrText xml:space="preserve"> PAGEREF _Toc243341688 \h </w:instrText>
+        <w:instrText xml:space="preserve"> PAGEREF _Toc243342759 \h </w:instrText>
       </w:r>
       <w:r>
         <w:rPr>
@@ -930,7 +930,7 @@
           <w:noProof/>
           <w:webHidden/>
         </w:rPr>
-        <w:instrText xml:space="preserve"> PAGEREF _Toc243341689 \h </w:instrText>
+        <w:instrText xml:space="preserve"> PAGEREF _Toc243342760 \h </w:instrText>
       </w:r>
       <w:r>
         <w:rPr>
@@ -1001,7 +1001,7 @@
           <w:noProof/>
           <w:webHidden/>
         </w:rPr>
-        <w:instrText xml:space="preserve"> PAGEREF _Toc243341690 \h </w:instrText>
+        <w:instrText xml:space="preserve"> PAGEREF _Toc243342761 \h </w:instrText>
       </w:r>
       <w:r>
         <w:rPr>
@@ -1072,7 +1072,7 @@
           <w:noProof/>
           <w:webHidden/>
         </w:rPr>
-        <w:instrText xml:space="preserve"> PAGEREF _Toc243341691 \h </w:instrText>
+        <w:instrText xml:space="preserve"> PAGEREF _Toc243342762 \h </w:instrText>
       </w:r>
       <w:r>
         <w:rPr>
@@ -1143,7 +1143,7 @@
           <w:noProof/>
           <w:webHidden/>
         </w:rPr>
-        <w:instrText xml:space="preserve"> PAGEREF _Toc243341692 \h </w:instrText>
+        <w:instrText xml:space="preserve"> PAGEREF _Toc243342763 \h </w:instrText>
       </w:r>
       <w:r>
         <w:rPr>
@@ -1214,7 +1214,7 @@
           <w:noProof/>
           <w:webHidden/>
         </w:rPr>
-        <w:instrText xml:space="preserve"> PAGEREF _Toc243341693 \h </w:instrText>
+        <w:instrText xml:space="preserve"> PAGEREF _Toc243342764 \h </w:instrText>
       </w:r>
       <w:r>
         <w:rPr>
@@ -1285,7 +1285,7 @@
           <w:noProof/>
           <w:webHidden/>
         </w:rPr>
-        <w:instrText xml:space="preserve"> PAGEREF _Toc243341694 \h </w:instrText>
+        <w:instrText xml:space="preserve"> PAGEREF _Toc243342765 \h </w:instrText>
       </w:r>
       <w:r>
         <w:rPr>
@@ -1356,7 +1356,7 @@
           <w:noProof/>
           <w:webHidden/>
         </w:rPr>
-        <w:instrText xml:space="preserve"> PAGEREF _Toc243341695 \h </w:instrText>
+        <w:instrText xml:space="preserve"> PAGEREF _Toc243342766 \h </w:instrText>
       </w:r>
       <w:r>
         <w:rPr>
@@ -1427,7 +1427,7 @@
           <w:noProof/>
           <w:webHidden/>
         </w:rPr>
-        <w:instrText xml:space="preserve"> PAGEREF _Toc243341696 \h </w:instrText>
+        <w:instrText xml:space="preserve"> PAGEREF _Toc243342767 \h </w:instrText>
       </w:r>
       <w:r>
         <w:rPr>
@@ -1498,7 +1498,7 @@
           <w:noProof/>
           <w:webHidden/>
         </w:rPr>
-        <w:instrText xml:space="preserve"> PAGEREF _Toc243341697 \h </w:instrText>
+        <w:instrText xml:space="preserve"> PAGEREF _Toc243342768 \h </w:instrText>
       </w:r>
       <w:r>
         <w:rPr>
@@ -1569,7 +1569,7 @@
           <w:noProof/>
           <w:webHidden/>
         </w:rPr>
-        <w:instrText xml:space="preserve"> PAGEREF _Toc243341698 \h </w:instrText>
+        <w:instrText xml:space="preserve"> PAGEREF _Toc243342769 \h </w:instrText>
       </w:r>
       <w:r>
         <w:rPr>
@@ -1640,7 +1640,7 @@
           <w:noProof/>
           <w:webHidden/>
         </w:rPr>
-        <w:instrText xml:space="preserve"> PAGEREF _Toc243341699 \h </w:instrText>
+        <w:instrText xml:space="preserve"> PAGEREF _Toc243342770 \h </w:instrText>
       </w:r>
       <w:r>
         <w:rPr>
@@ -1711,7 +1711,7 @@
           <w:noProof/>
           <w:webHidden/>
         </w:rPr>
-        <w:instrText xml:space="preserve"> PAGEREF _Toc243341700 \h </w:instrText>
+        <w:instrText xml:space="preserve"> PAGEREF _Toc243342771 \h </w:instrText>
       </w:r>
       <w:r>
         <w:rPr>
@@ -1782,7 +1782,7 @@
           <w:noProof/>
           <w:webHidden/>
         </w:rPr>
-        <w:instrText xml:space="preserve"> PAGEREF _Toc243341701 \h </w:instrText>
+        <w:instrText xml:space="preserve"> PAGEREF _Toc243342772 \h </w:instrText>
       </w:r>
       <w:r>
         <w:rPr>
@@ -1853,7 +1853,7 @@
           <w:noProof/>
           <w:webHidden/>
         </w:rPr>
-        <w:instrText xml:space="preserve"> PAGEREF _Toc243341702 \h </w:instrText>
+        <w:instrText xml:space="preserve"> PAGEREF _Toc243342773 \h </w:instrText>
       </w:r>
       <w:r>
         <w:rPr>
@@ -1924,7 +1924,7 @@
           <w:noProof/>
           <w:webHidden/>
         </w:rPr>
-        <w:instrText xml:space="preserve"> PAGEREF _Toc243341703 \h </w:instrText>
+        <w:instrText xml:space="preserve"> PAGEREF _Toc243342774 \h </w:instrText>
       </w:r>
       <w:r>
         <w:rPr>
@@ -1995,7 +1995,7 @@
           <w:noProof/>
           <w:webHidden/>
         </w:rPr>
-        <w:instrText xml:space="preserve"> PAGEREF _Toc243341704 \h </w:instrText>
+        <w:instrText xml:space="preserve"> PAGEREF _Toc243342775 \h </w:instrText>
       </w:r>
       <w:r>
         <w:rPr>
@@ -2066,7 +2066,7 @@
           <w:noProof/>
           <w:webHidden/>
         </w:rPr>
-        <w:instrText xml:space="preserve"> PAGEREF _Toc243341705 \h </w:instrText>
+        <w:instrText xml:space="preserve"> PAGEREF _Toc243342776 \h </w:instrText>
       </w:r>
       <w:r>
         <w:rPr>
@@ -2137,7 +2137,7 @@
           <w:noProof/>
           <w:webHidden/>
         </w:rPr>
-        <w:instrText xml:space="preserve"> PAGEREF _Toc243341706 \h </w:instrText>
+        <w:instrText xml:space="preserve"> PAGEREF _Toc243342777 \h </w:instrText>
       </w:r>
       <w:r>
         <w:rPr>
@@ -2208,7 +2208,7 @@
           <w:noProof/>
           <w:webHidden/>
         </w:rPr>
-        <w:instrText xml:space="preserve"> PAGEREF _Toc243341707 \h </w:instrText>
+        <w:instrText xml:space="preserve"> PAGEREF _Toc243342778 \h </w:instrText>
       </w:r>
       <w:r>
         <w:rPr>
@@ -2280,7 +2280,7 @@
           <w:noProof/>
           <w:webHidden/>
         </w:rPr>
-        <w:instrText xml:space="preserve"> PAGEREF _Toc243341708 \h </w:instrText>
+        <w:instrText xml:space="preserve"> PAGEREF _Toc243342779 \h </w:instrText>
       </w:r>
       <w:r>
         <w:rPr>
@@ -2351,7 +2351,7 @@
           <w:noProof/>
           <w:webHidden/>
         </w:rPr>
-        <w:instrText xml:space="preserve"> PAGEREF _Toc243341709 \h </w:instrText>
+        <w:instrText xml:space="preserve"> PAGEREF _Toc243342780 \h </w:instrText>
       </w:r>
       <w:r>
         <w:rPr>
@@ -2422,7 +2422,7 @@
           <w:noProof/>
           <w:webHidden/>
         </w:rPr>
-        <w:instrText xml:space="preserve"> PAGEREF _Toc243341710 \h </w:instrText>
+        <w:instrText xml:space="preserve"> PAGEREF _Toc243342781 \h </w:instrText>
       </w:r>
       <w:r>
         <w:rPr>
@@ -2493,7 +2493,7 @@
           <w:noProof/>
           <w:webHidden/>
         </w:rPr>
-        <w:instrText xml:space="preserve"> PAGEREF _Toc243341711 \h </w:instrText>
+        <w:instrText xml:space="preserve"> PAGEREF _Toc243342782 \h </w:instrText>
       </w:r>
       <w:r>
         <w:rPr>
@@ -2564,7 +2564,7 @@
           <w:noProof/>
           <w:webHidden/>
         </w:rPr>
-        <w:instrText xml:space="preserve"> PAGEREF _Toc243341712 \h </w:instrText>
+        <w:instrText xml:space="preserve"> PAGEREF _Toc243342783 \h </w:instrText>
       </w:r>
       <w:r>
         <w:rPr>
@@ -2635,7 +2635,7 @@
           <w:noProof/>
           <w:webHidden/>
         </w:rPr>
-        <w:instrText xml:space="preserve"> PAGEREF _Toc243341713 \h </w:instrText>
+        <w:instrText xml:space="preserve"> PAGEREF _Toc243342784 \h </w:instrText>
       </w:r>
       <w:r>
         <w:rPr>
@@ -2706,7 +2706,7 @@
           <w:noProof/>
           <w:webHidden/>
         </w:rPr>
-        <w:instrText xml:space="preserve"> PAGEREF _Toc243341714 \h </w:instrText>
+        <w:instrText xml:space="preserve"> PAGEREF _Toc243342785 \h </w:instrText>
       </w:r>
       <w:r>
         <w:rPr>
@@ -2777,7 +2777,7 @@
           <w:noProof/>
           <w:webHidden/>
         </w:rPr>
-        <w:instrText xml:space="preserve"> PAGEREF _Toc243341715 \h </w:instrText>
+        <w:instrText xml:space="preserve"> PAGEREF _Toc243342786 \h </w:instrText>
       </w:r>
       <w:r>
         <w:rPr>
@@ -2848,7 +2848,7 @@
           <w:noProof/>
           <w:webHidden/>
         </w:rPr>
-        <w:instrText xml:space="preserve"> PAGEREF _Toc243341716 \h </w:instrText>
+        <w:instrText xml:space="preserve"> PAGEREF _Toc243342787 \h </w:instrText>
       </w:r>
       <w:r>
         <w:rPr>
@@ -2919,7 +2919,7 @@
           <w:noProof/>
           <w:webHidden/>
         </w:rPr>
-        <w:instrText xml:space="preserve"> PAGEREF _Toc243341717 \h </w:instrText>
+        <w:instrText xml:space="preserve"> PAGEREF _Toc243342788 \h </w:instrText>
       </w:r>
       <w:r>
         <w:rPr>
@@ -2990,7 +2990,7 @@
           <w:noProof/>
           <w:webHidden/>
         </w:rPr>
-        <w:instrText xml:space="preserve"> PAGEREF _Toc243341718 \h </w:instrText>
+        <w:instrText xml:space="preserve"> PAGEREF _Toc243342789 \h </w:instrText>
       </w:r>
       <w:r>
         <w:rPr>
@@ -3061,7 +3061,7 @@
           <w:noProof/>
           <w:webHidden/>
         </w:rPr>
-        <w:instrText xml:space="preserve"> PAGEREF _Toc243341719 \h </w:instrText>
+        <w:instrText xml:space="preserve"> PAGEREF _Toc243342790 \h </w:instrText>
       </w:r>
       <w:r>
         <w:rPr>
@@ -3132,7 +3132,7 @@
           <w:noProof/>
           <w:webHidden/>
         </w:rPr>
-        <w:instrText xml:space="preserve"> PAGEREF _Toc243341720 \h </w:instrText>
+        <w:instrText xml:space="preserve"> PAGEREF _Toc243342791 \h </w:instrText>
       </w:r>
       <w:r>
         <w:rPr>
@@ -3203,7 +3203,7 @@
           <w:noProof/>
           <w:webHidden/>
         </w:rPr>
-        <w:instrText xml:space="preserve"> PAGEREF _Toc243341721 \h </w:instrText>
+        <w:instrText xml:space="preserve"> PAGEREF _Toc243342792 \h </w:instrText>
       </w:r>
       <w:r>
         <w:rPr>
@@ -3274,7 +3274,7 @@
           <w:noProof/>
           <w:webHidden/>
         </w:rPr>
-        <w:instrText xml:space="preserve"> PAGEREF _Toc243341722 \h </w:instrText>
+        <w:instrText xml:space="preserve"> PAGEREF _Toc243342793 \h </w:instrText>
       </w:r>
       <w:r>
         <w:rPr>
@@ -3345,7 +3345,7 @@
           <w:noProof/>
           <w:webHidden/>
         </w:rPr>
-        <w:instrText xml:space="preserve"> PAGEREF _Toc243341723 \h </w:instrText>
+        <w:instrText xml:space="preserve"> PAGEREF _Toc243342794 \h </w:instrText>
       </w:r>
       <w:r>
         <w:rPr>
@@ -3365,7 +3365,7 @@
           <w:noProof/>
           <w:webHidden/>
         </w:rPr>
-        <w:t>26</w:t>
+        <w:t>27</w:t>
       </w:r>
       <w:r>
         <w:rPr>
@@ -3416,7 +3416,7 @@
           <w:noProof/>
           <w:webHidden/>
         </w:rPr>
-        <w:instrText xml:space="preserve"> PAGEREF _Toc243341724 \h </w:instrText>
+        <w:instrText xml:space="preserve"> PAGEREF _Toc243342795 \h </w:instrText>
       </w:r>
       <w:r>
         <w:rPr>
@@ -3487,7 +3487,7 @@
           <w:noProof/>
           <w:webHidden/>
         </w:rPr>
-        <w:instrText xml:space="preserve"> PAGEREF _Toc243341725 \h </w:instrText>
+        <w:instrText xml:space="preserve"> PAGEREF _Toc243342796 \h </w:instrText>
       </w:r>
       <w:r>
         <w:rPr>
@@ -3558,7 +3558,7 @@
           <w:noProof/>
           <w:webHidden/>
         </w:rPr>
-        <w:instrText xml:space="preserve"> PAGEREF _Toc243341726 \h </w:instrText>
+        <w:instrText xml:space="preserve"> PAGEREF _Toc243342797 \h </w:instrText>
       </w:r>
       <w:r>
         <w:rPr>
@@ -3629,7 +3629,7 @@
           <w:noProof/>
           <w:webHidden/>
         </w:rPr>
-        <w:instrText xml:space="preserve"> PAGEREF _Toc243341727 \h </w:instrText>
+        <w:instrText xml:space="preserve"> PAGEREF _Toc243342798 \h </w:instrText>
       </w:r>
       <w:r>
         <w:rPr>
@@ -3700,7 +3700,7 @@
           <w:noProof/>
           <w:webHidden/>
         </w:rPr>
-        <w:instrText xml:space="preserve"> PAGEREF _Toc243341728 \h </w:instrText>
+        <w:instrText xml:space="preserve"> PAGEREF _Toc243342799 \h </w:instrText>
       </w:r>
       <w:r>
         <w:rPr>
@@ -3771,7 +3771,7 @@
           <w:noProof/>
           <w:webHidden/>
         </w:rPr>
-        <w:instrText xml:space="preserve"> PAGEREF _Toc243341729 \h </w:instrText>
+        <w:instrText xml:space="preserve"> PAGEREF _Toc243342800 \h </w:instrText>
       </w:r>
       <w:r>
         <w:rPr>
@@ -3842,7 +3842,7 @@
           <w:noProof/>
           <w:webHidden/>
         </w:rPr>
-        <w:instrText xml:space="preserve"> PAGEREF _Toc243341730 \h </w:instrText>
+        <w:instrText xml:space="preserve"> PAGEREF _Toc243342801 \h </w:instrText>
       </w:r>
       <w:r>
         <w:rPr>
@@ -3913,7 +3913,7 @@
           <w:noProof/>
           <w:webHidden/>
         </w:rPr>
-        <w:instrText xml:space="preserve"> PAGEREF _Toc243341731 \h </w:instrText>
+        <w:instrText xml:space="preserve"> PAGEREF _Toc243342802 \h </w:instrText>
       </w:r>
       <w:r>
         <w:rPr>
@@ -3984,7 +3984,7 @@
           <w:noProof/>
           <w:webHidden/>
         </w:rPr>
-        <w:instrText xml:space="preserve"> PAGEREF _Toc243341732 \h </w:instrText>
+        <w:instrText xml:space="preserve"> PAGEREF _Toc243342803 \h </w:instrText>
       </w:r>
       <w:r>
         <w:rPr>
@@ -4056,7 +4056,7 @@
           <w:noProof/>
           <w:webHidden/>
         </w:rPr>
-        <w:instrText xml:space="preserve"> PAGEREF _Toc243341733 \h </w:instrText>
+        <w:instrText xml:space="preserve"> PAGEREF _Toc243342804 \h </w:instrText>
       </w:r>
       <w:r>
         <w:rPr>
@@ -4127,7 +4127,7 @@
           <w:noProof/>
           <w:webHidden/>
         </w:rPr>
-        <w:instrText xml:space="preserve"> PAGEREF _Toc243341734 \h </w:instrText>
+        <w:instrText xml:space="preserve"> PAGEREF _Toc243342805 \h </w:instrText>
       </w:r>
       <w:r>
         <w:rPr>
@@ -4198,7 +4198,7 @@
           <w:noProof/>
           <w:webHidden/>
         </w:rPr>
-        <w:instrText xml:space="preserve"> PAGEREF _Toc243341735 \h </w:instrText>
+        <w:instrText xml:space="preserve"> PAGEREF _Toc243342806 \h </w:instrText>
       </w:r>
       <w:r>
         <w:rPr>
@@ -4269,7 +4269,7 @@
           <w:noProof/>
           <w:webHidden/>
         </w:rPr>
-        <w:instrText xml:space="preserve"> PAGEREF _Toc243341736 \h </w:instrText>
+        <w:instrText xml:space="preserve"> PAGEREF _Toc243342807 \h </w:instrText>
       </w:r>
       <w:r>
         <w:rPr>
@@ -4340,7 +4340,7 @@
           <w:noProof/>
           <w:webHidden/>
         </w:rPr>
-        <w:instrText xml:space="preserve"> PAGEREF _Toc243341737 \h </w:instrText>
+        <w:instrText xml:space="preserve"> PAGEREF _Toc243342808 \h </w:instrText>
       </w:r>
       <w:r>
         <w:rPr>
@@ -4411,7 +4411,7 @@
           <w:noProof/>
           <w:webHidden/>
         </w:rPr>
-        <w:instrText xml:space="preserve"> PAGEREF _Toc243341738 \h </w:instrText>
+        <w:instrText xml:space="preserve"> PAGEREF _Toc243342809 \h </w:instrText>
       </w:r>
       <w:r>
         <w:rPr>
@@ -4482,7 +4482,7 @@
           <w:noProof/>
           <w:webHidden/>
         </w:rPr>
-        <w:instrText xml:space="preserve"> PAGEREF _Toc243341739 \h </w:instrText>
+        <w:instrText xml:space="preserve"> PAGEREF _Toc243342810 \h </w:instrText>
       </w:r>
       <w:r>
         <w:rPr>
@@ -4553,7 +4553,7 @@
           <w:noProof/>
           <w:webHidden/>
         </w:rPr>
-        <w:instrText xml:space="preserve"> PAGEREF _Toc243341740 \h </w:instrText>
+        <w:instrText xml:space="preserve"> PAGEREF _Toc243342811 \h </w:instrText>
       </w:r>
       <w:r>
         <w:rPr>
@@ -4624,7 +4624,7 @@
           <w:noProof/>
           <w:webHidden/>
         </w:rPr>
-        <w:instrText xml:space="preserve"> PAGEREF _Toc243341741 \h </w:instrText>
+        <w:instrText xml:space="preserve"> PAGEREF _Toc243342812 \h </w:instrText>
       </w:r>
       <w:r>
         <w:rPr>
@@ -4695,7 +4695,7 @@
           <w:noProof/>
           <w:webHidden/>
         </w:rPr>
-        <w:instrText xml:space="preserve"> PAGEREF _Toc243341742 \h </w:instrText>
+        <w:instrText xml:space="preserve"> PAGEREF _Toc243342813 \h </w:instrText>
       </w:r>
       <w:r>
         <w:rPr>
@@ -4766,7 +4766,7 @@
           <w:noProof/>
           <w:webHidden/>
         </w:rPr>
-        <w:instrText xml:space="preserve"> PAGEREF _Toc243341743 \h </w:instrText>
+        <w:instrText xml:space="preserve"> PAGEREF _Toc243342814 \h </w:instrText>
       </w:r>
       <w:r>
         <w:rPr>
@@ -4837,7 +4837,7 @@
           <w:noProof/>
           <w:webHidden/>
         </w:rPr>
-        <w:instrText xml:space="preserve"> PAGEREF _Toc243341744 \h </w:instrText>
+        <w:instrText xml:space="preserve"> PAGEREF _Toc243342815 \h </w:instrText>
       </w:r>
       <w:r>
         <w:rPr>
@@ -4908,7 +4908,7 @@
           <w:noProof/>
           <w:webHidden/>
         </w:rPr>
-        <w:instrText xml:space="preserve"> PAGEREF _Toc243341745 \h </w:instrText>
+        <w:instrText xml:space="preserve"> PAGEREF _Toc243342816 \h </w:instrText>
       </w:r>
       <w:r>
         <w:rPr>
@@ -4979,7 +4979,7 @@
           <w:noProof/>
           <w:webHidden/>
         </w:rPr>
-        <w:instrText xml:space="preserve"> PAGEREF _Toc243341746 \h </w:instrText>
+        <w:instrText xml:space="preserve"> PAGEREF _Toc243342817 \h </w:instrText>
       </w:r>
       <w:r>
         <w:rPr>
@@ -5050,7 +5050,7 @@
           <w:noProof/>
           <w:webHidden/>
         </w:rPr>
-        <w:instrText xml:space="preserve"> PAGEREF _Toc243341747 \h </w:instrText>
+        <w:instrText xml:space="preserve"> PAGEREF _Toc243342818 \h </w:instrText>
       </w:r>
       <w:r>
         <w:rPr>
@@ -5121,7 +5121,7 @@
           <w:noProof/>
           <w:webHidden/>
         </w:rPr>
-        <w:instrText xml:space="preserve"> PAGEREF _Toc243341748 \h </w:instrText>
+        <w:instrText xml:space="preserve"> PAGEREF _Toc243342819 \h </w:instrText>
       </w:r>
       <w:r>
         <w:rPr>
@@ -5192,7 +5192,7 @@
           <w:noProof/>
           <w:webHidden/>
         </w:rPr>
-        <w:instrText xml:space="preserve"> PAGEREF _Toc243341749 \h </w:instrText>
+        <w:instrText xml:space="preserve"> PAGEREF _Toc243342820 \h </w:instrText>
       </w:r>
       <w:r>
         <w:rPr>
@@ -5263,7 +5263,7 @@
           <w:noProof/>
           <w:webHidden/>
         </w:rPr>
-        <w:instrText xml:space="preserve"> PAGEREF _Toc243341750 \h </w:instrText>
+        <w:instrText xml:space="preserve"> PAGEREF _Toc243342821 \h </w:instrText>
       </w:r>
       <w:r>
         <w:rPr>
@@ -5334,7 +5334,7 @@
           <w:noProof/>
           <w:webHidden/>
         </w:rPr>
-        <w:instrText xml:space="preserve"> PAGEREF _Toc243341751 \h </w:instrText>
+        <w:instrText xml:space="preserve"> PAGEREF _Toc243342822 \h </w:instrText>
       </w:r>
       <w:r>
         <w:rPr>
@@ -5405,7 +5405,7 @@
           <w:noProof/>
           <w:webHidden/>
         </w:rPr>
-        <w:instrText xml:space="preserve"> PAGEREF _Toc243341752 \h </w:instrText>
+        <w:instrText xml:space="preserve"> PAGEREF _Toc243342823 \h </w:instrText>
       </w:r>
       <w:r>
         <w:rPr>
@@ -5476,7 +5476,7 @@
           <w:noProof/>
           <w:webHidden/>
         </w:rPr>
-        <w:instrText xml:space="preserve"> PAGEREF _Toc243341753 \h </w:instrText>
+        <w:instrText xml:space="preserve"> PAGEREF _Toc243342824 \h </w:instrText>
       </w:r>
       <w:r>
         <w:rPr>
@@ -5547,7 +5547,7 @@
           <w:noProof/>
           <w:webHidden/>
         </w:rPr>
-        <w:instrText xml:space="preserve"> PAGEREF _Toc243341754 \h </w:instrText>
+        <w:instrText xml:space="preserve"> PAGEREF _Toc243342825 \h </w:instrText>
       </w:r>
       <w:r>
         <w:rPr>
@@ -5618,7 +5618,7 @@
           <w:noProof/>
           <w:webHidden/>
         </w:rPr>
-        <w:instrText xml:space="preserve"> PAGEREF _Toc243341755 \h </w:instrText>
+        <w:instrText xml:space="preserve"> PAGEREF _Toc243342826 \h </w:instrText>
       </w:r>
       <w:r>
         <w:rPr>
@@ -5689,7 +5689,7 @@
           <w:noProof/>
           <w:webHidden/>
         </w:rPr>
-        <w:instrText xml:space="preserve"> PAGEREF _Toc243341756 \h </w:instrText>
+        <w:instrText xml:space="preserve"> PAGEREF _Toc243342827 \h </w:instrText>
       </w:r>
       <w:r>
         <w:rPr>
@@ -5760,7 +5760,7 @@
           <w:noProof/>
           <w:webHidden/>
         </w:rPr>
-        <w:instrText xml:space="preserve"> PAGEREF _Toc243341757 \h </w:instrText>
+        <w:instrText xml:space="preserve"> PAGEREF _Toc243342828 \h </w:instrText>
       </w:r>
       <w:r>
         <w:rPr>
@@ -5832,7 +5832,7 @@
           <w:noProof/>
           <w:webHidden/>
         </w:rPr>
-        <w:instrText xml:space="preserve"> PAGEREF _Toc243341758 \h </w:instrText>
+        <w:instrText xml:space="preserve"> PAGEREF _Toc243342829 \h </w:instrText>
       </w:r>
       <w:r>
         <w:rPr>
@@ -5903,7 +5903,7 @@
           <w:noProof/>
           <w:webHidden/>
         </w:rPr>
-        <w:instrText xml:space="preserve"> PAGEREF _Toc243341759 \h </w:instrText>
+        <w:instrText xml:space="preserve"> PAGEREF _Toc243342830 \h </w:instrText>
       </w:r>
       <w:r>
         <w:rPr>
@@ -5974,7 +5974,7 @@
           <w:noProof/>
           <w:webHidden/>
         </w:rPr>
-        <w:instrText xml:space="preserve"> PAGEREF _Toc243341760 \h </w:instrText>
+        <w:instrText xml:space="preserve"> PAGEREF _Toc243342831 \h </w:instrText>
       </w:r>
       <w:r>
         <w:rPr>
@@ -6045,7 +6045,7 @@
           <w:noProof/>
           <w:webHidden/>
         </w:rPr>
-        <w:instrText xml:space="preserve"> PAGEREF _Toc243341761 \h </w:instrText>
+        <w:instrText xml:space="preserve"> PAGEREF _Toc243342832 \h </w:instrText>
       </w:r>
       <w:r>
         <w:rPr>
@@ -6116,7 +6116,7 @@
           <w:noProof/>
           <w:webHidden/>
         </w:rPr>
-        <w:instrText xml:space="preserve"> PAGEREF _Toc243341762 \h </w:instrText>
+        <w:instrText xml:space="preserve"> PAGEREF _Toc243342833 \h </w:instrText>
       </w:r>
       <w:r>
         <w:rPr>
@@ -7266,7 +7266,7 @@
         <w:pStyle w:val="Heading1"/>
         <w:jc w:val="center"/>
       </w:pPr>
-      <w:bookmarkStart w:id="0" w:name="_Toc243341685"/>
+      <w:bookmarkStart w:id="0" w:name="_Toc243342756"/>
       <w:r>
         <w:rPr>
           <w:rFonts w:ascii="Times New Roman" w:hAnsi="Times New Roman"/>
@@ -7295,7 +7295,7 @@
       <w:pPr>
         <w:pStyle w:val="Heading2"/>
       </w:pPr>
-      <w:bookmarkStart w:id="1" w:name="_Toc243341686"/>
+      <w:bookmarkStart w:id="1" w:name="_Toc243342757"/>
       <w:r>
         <w:rPr>
           <w:rFonts w:ascii="Times New Roman" w:hAnsi="Times New Roman"/>
@@ -7347,7 +7347,7 @@
       <w:pPr>
         <w:pStyle w:val="Heading2"/>
       </w:pPr>
-      <w:bookmarkStart w:id="2" w:name="_Toc243341687"/>
+      <w:bookmarkStart w:id="2" w:name="_Toc243342758"/>
       <w:r>
         <w:rPr>
           <w:rFonts w:ascii="Times New Roman" w:hAnsi="Times New Roman"/>
@@ -7383,7 +7383,7 @@
       <w:pPr>
         <w:pStyle w:val="Heading2"/>
       </w:pPr>
-      <w:bookmarkStart w:id="3" w:name="_Toc243341688"/>
+      <w:bookmarkStart w:id="3" w:name="_Toc243342759"/>
       <w:r>
         <w:rPr>
           <w:rFonts w:ascii="Times New Roman" w:hAnsi="Times New Roman"/>
@@ -7423,7 +7423,7 @@
       <w:pPr>
         <w:pStyle w:val="Heading2"/>
       </w:pPr>
-      <w:bookmarkStart w:id="4" w:name="_Toc243341689"/>
+      <w:bookmarkStart w:id="4" w:name="_Toc243342760"/>
       <w:r>
         <w:rPr>
           <w:rFonts w:ascii="Times New Roman" w:hAnsi="Times New Roman"/>
@@ -7447,7 +7447,7 @@
       <w:pPr>
         <w:pStyle w:val="Heading2"/>
       </w:pPr>
-      <w:bookmarkStart w:id="5" w:name="_Toc243341690"/>
+      <w:bookmarkStart w:id="5" w:name="_Toc243342761"/>
       <w:r>
         <w:rPr>
           <w:rFonts w:ascii="Times New Roman" w:hAnsi="Times New Roman"/>
@@ -7517,7 +7517,7 @@
       <w:pPr>
         <w:pStyle w:val="Heading2"/>
       </w:pPr>
-      <w:bookmarkStart w:id="6" w:name="_Toc243341691"/>
+      <w:bookmarkStart w:id="6" w:name="_Toc243342762"/>
       <w:r>
         <w:rPr>
           <w:rFonts w:ascii="Times New Roman" w:hAnsi="Times New Roman"/>
@@ -7544,7 +7544,7 @@
       <w:pPr>
         <w:pStyle w:val="Heading2"/>
       </w:pPr>
-      <w:bookmarkStart w:id="7" w:name="_Toc243341692"/>
+      <w:bookmarkStart w:id="7" w:name="_Toc243342763"/>
       <w:r>
         <w:rPr>
           <w:rFonts w:ascii="Times New Roman" w:hAnsi="Times New Roman"/>
@@ -7571,7 +7571,7 @@
       <w:pPr>
         <w:pStyle w:val="Heading2"/>
       </w:pPr>
-      <w:bookmarkStart w:id="8" w:name="_Toc243341693"/>
+      <w:bookmarkStart w:id="8" w:name="_Toc243342764"/>
       <w:r>
         <w:rPr>
           <w:rFonts w:ascii="Times New Roman" w:hAnsi="Times New Roman"/>
@@ -7599,16 +7599,12 @@
       </w:r>
     </w:p>
     <w:p>
-      <w:r>
-        <w:br w:type="page"/>
-      </w:r>
-    </w:p>
-    <w:p>
       <w:pPr>
         <w:pStyle w:val="Heading1"/>
+        <w:pageBreakBefore/>
         <w:jc w:val="center"/>
       </w:pPr>
-      <w:bookmarkStart w:id="9" w:name="_Toc243341694"/>
+      <w:bookmarkStart w:id="9" w:name="_Toc243342765"/>
       <w:r>
         <w:rPr>
           <w:rFonts w:ascii="Times New Roman" w:hAnsi="Times New Roman"/>
@@ -7637,7 +7633,7 @@
       <w:pPr>
         <w:pStyle w:val="Heading2"/>
       </w:pPr>
-      <w:bookmarkStart w:id="10" w:name="_Toc243341695"/>
+      <w:bookmarkStart w:id="10" w:name="_Toc243342766"/>
       <w:r>
         <w:rPr>
           <w:rFonts w:ascii="Times New Roman" w:hAnsi="Times New Roman"/>
@@ -7661,7 +7657,7 @@
       <w:pPr>
         <w:pStyle w:val="Heading2"/>
       </w:pPr>
-      <w:bookmarkStart w:id="11" w:name="_Toc243341696"/>
+      <w:bookmarkStart w:id="11" w:name="_Toc243342767"/>
       <w:r>
         <w:rPr>
           <w:rFonts w:ascii="Times New Roman" w:hAnsi="Times New Roman"/>
@@ -7693,21 +7689,18 @@
         <w:jc w:val="both"/>
       </w:pPr>
       <w:r>
-        <w:t xml:space="preserve">The distinction between the two models is not merely academic. A value held in a register or driven onto a precharged bus tends to leak its Hamming weight, whereas a value that overwrites a previous one on a static bus tends to leak the Hamming distance between the old and the new contents. A real device usually exhibits a combination of the two, and an attacker who assumes the wrong model will see a weaker correlation, or none at all. In this project the amplified-leakage mechanism was constructed so that </w:t>
-      </w:r>
-      <w:r>
-        <w:t xml:space="preserve">it leaks the </w:t>
+        <w:t xml:space="preserve">The distinction between the two models is not merely academic. A value held in a register or driven onto a precharged bus tends to leak its Hamming weight, whereas a value that overwrites a previous one on a static bus tends to leak the Hamming distance between the old and the new contents. A real device usually exhibits a combination of the two, and an attacker who assumes the wrong model will see a weaker correlation, or none </w:t>
       </w:r>
       <w:r>
         <w:lastRenderedPageBreak/>
-        <w:t>Hamming weight explicitly, by driving a number of output lines equal to the number of one-bits in the targeted value, which removes the uncertainty about the model and lets the attack proceed under the simpler Hamming-weight assumption. On a device without such amplification an evaluator would ordinarily test both models and retain whichever yields the stronger correlation.</w:t>
+        <w:t>at all. In this project the amplified-leakage mechanism was constructed so that it leaks the Hamming weight explicitly, by driving a number of output lines equal to the number of one-bits in the targeted value, which removes the uncertainty about the model and lets the attack proceed under the simpler Hamming-weight assumption. On a device without such amplification an evaluator would ordinarily test both models and retain whichever yields the stronger correlation.</w:t>
       </w:r>
     </w:p>
     <w:p>
       <w:pPr>
         <w:pStyle w:val="Heading2"/>
       </w:pPr>
-      <w:bookmarkStart w:id="12" w:name="_Toc243341697"/>
+      <w:bookmarkStart w:id="12" w:name="_Toc243342768"/>
       <w:r>
         <w:rPr>
           <w:rFonts w:ascii="Times New Roman" w:hAnsi="Times New Roman"/>
@@ -7746,7 +7739,7 @@
       <w:pPr>
         <w:pStyle w:val="Heading2"/>
       </w:pPr>
-      <w:bookmarkStart w:id="13" w:name="_Toc243341698"/>
+      <w:bookmarkStart w:id="13" w:name="_Toc243342769"/>
       <w:r>
         <w:rPr>
           <w:rFonts w:ascii="Times New Roman" w:hAnsi="Times New Roman"/>
@@ -7789,7 +7782,7 @@
       <w:pPr>
         <w:pStyle w:val="Heading2"/>
       </w:pPr>
-      <w:bookmarkStart w:id="14" w:name="_Toc243341699"/>
+      <w:bookmarkStart w:id="14" w:name="_Toc243342770"/>
       <w:r>
         <w:rPr>
           <w:rFonts w:ascii="Times New Roman" w:hAnsi="Times New Roman"/>
@@ -7820,7 +7813,7 @@
       <w:pPr>
         <w:pStyle w:val="Heading2"/>
       </w:pPr>
-      <w:bookmarkStart w:id="15" w:name="_Toc243341700"/>
+      <w:bookmarkStart w:id="15" w:name="_Toc243342771"/>
       <w:r>
         <w:rPr>
           <w:rFonts w:ascii="Times New Roman" w:hAnsi="Times New Roman"/>
@@ -7850,7 +7843,7 @@
       <w:pPr>
         <w:pStyle w:val="Heading2"/>
       </w:pPr>
-      <w:bookmarkStart w:id="16" w:name="_Toc243341701"/>
+      <w:bookmarkStart w:id="16" w:name="_Toc243342772"/>
       <w:r>
         <w:rPr>
           <w:rFonts w:ascii="Times New Roman" w:hAnsi="Times New Roman"/>
@@ -7887,7 +7880,7 @@
       <w:pPr>
         <w:pStyle w:val="Heading2"/>
       </w:pPr>
-      <w:bookmarkStart w:id="17" w:name="_Toc243341702"/>
+      <w:bookmarkStart w:id="17" w:name="_Toc243342773"/>
       <w:r>
         <w:rPr>
           <w:rFonts w:ascii="Times New Roman" w:hAnsi="Times New Roman"/>
@@ -7942,7 +7935,7 @@
       <w:pPr>
         <w:pStyle w:val="Heading2"/>
       </w:pPr>
-      <w:bookmarkStart w:id="18" w:name="_Toc243341703"/>
+      <w:bookmarkStart w:id="18" w:name="_Toc243342774"/>
       <w:r>
         <w:rPr>
           <w:rFonts w:ascii="Times New Roman" w:hAnsi="Times New Roman"/>
@@ -7969,7 +7962,7 @@
       <w:pPr>
         <w:pStyle w:val="Heading2"/>
       </w:pPr>
-      <w:bookmarkStart w:id="19" w:name="_Toc243341704"/>
+      <w:bookmarkStart w:id="19" w:name="_Toc243342775"/>
       <w:r>
         <w:rPr>
           <w:rFonts w:ascii="Times New Roman" w:hAnsi="Times New Roman"/>
@@ -7997,7 +7990,7 @@
       <w:pPr>
         <w:pStyle w:val="Heading2"/>
       </w:pPr>
-      <w:bookmarkStart w:id="20" w:name="_Toc243341705"/>
+      <w:bookmarkStart w:id="20" w:name="_Toc243342776"/>
       <w:r>
         <w:rPr>
           <w:rFonts w:ascii="Times New Roman" w:hAnsi="Times New Roman"/>
@@ -8014,10 +8007,346 @@
         <w:jc w:val="both"/>
       </w:pPr>
       <w:r>
-        <w:t>The correlation attack may be stated precisely. Let there be N measured traces, the i-th trace being a vector of power samples. For a key hypothesis k and a known input x(i) for trace i, let v(i, k) denote the targeted intermediate value, for example v = S(x XOR k) for an exclusive-or target, and let the predicted leakage under the Hamming-weight model be h(i, k) = HW(v(i, k)), the number of one-bits in v. For each time sample j the attacker computes the Pearson correlation between the column of predictions</w:t>
-      </w:r>
-      <w:r>
-        <w:t xml:space="preserve"> h(., k) and the column of measurements t(., j):</w:t>
+        <w:t xml:space="preserve">The correlation attack may be stated precisely. Let there be </w:t>
+      </w:r>
+      <m:oMath>
+        <m:r>
+          <w:rPr>
+            <w:rFonts w:ascii="Cambria Math" w:hAnsi="Cambria Math"/>
+          </w:rPr>
+          <m:t>N</m:t>
+        </m:r>
+      </m:oMath>
+      <w:r>
+        <w:t xml:space="preserve"> measured traces, the </w:t>
+      </w:r>
+      <m:oMath>
+        <m:r>
+          <w:rPr>
+            <w:rFonts w:ascii="Cambria Math" w:hAnsi="Cambria Math"/>
+          </w:rPr>
+          <m:t>i</m:t>
+        </m:r>
+      </m:oMath>
+      <w:r>
+        <w:t xml:space="preserve">-th trace being a vector of power samples. For a key hypothesis </w:t>
+      </w:r>
+      <m:oMath>
+        <m:r>
+          <w:rPr>
+            <w:rFonts w:ascii="Cambria Math" w:hAnsi="Cambria Math"/>
+          </w:rPr>
+          <m:t>k</m:t>
+        </m:r>
+      </m:oMath>
+      <w:r>
+        <w:t xml:space="preserve"> and a known input </w:t>
+      </w:r>
+      <m:oMath>
+        <m:r>
+          <w:rPr>
+            <w:rFonts w:ascii="Cambria Math" w:hAnsi="Cambria Math"/>
+          </w:rPr>
+          <m:t>x</m:t>
+        </m:r>
+        <m:r>
+          <w:rPr>
+            <w:rFonts w:ascii="Cambria Math" w:hAnsi="Cambria Math"/>
+          </w:rPr>
+          <m:t>(</m:t>
+        </m:r>
+        <m:r>
+          <w:rPr>
+            <w:rFonts w:ascii="Cambria Math" w:hAnsi="Cambria Math"/>
+          </w:rPr>
+          <m:t>i</m:t>
+        </m:r>
+        <m:r>
+          <w:rPr>
+            <w:rFonts w:ascii="Cambria Math" w:hAnsi="Cambria Math"/>
+          </w:rPr>
+          <m:t>)</m:t>
+        </m:r>
+      </m:oMath>
+      <w:r>
+        <w:t xml:space="preserve"> for trace </w:t>
+      </w:r>
+      <m:oMath>
+        <m:r>
+          <w:rPr>
+            <w:rFonts w:ascii="Cambria Math" w:hAnsi="Cambria Math"/>
+          </w:rPr>
+          <m:t>i</m:t>
+        </m:r>
+      </m:oMath>
+      <w:r>
+        <w:t xml:space="preserve">, let </w:t>
+      </w:r>
+      <m:oMath>
+        <m:r>
+          <w:rPr>
+            <w:rFonts w:ascii="Cambria Math" w:hAnsi="Cambria Math"/>
+          </w:rPr>
+          <m:t>v</m:t>
+        </m:r>
+        <m:r>
+          <w:rPr>
+            <w:rFonts w:ascii="Cambria Math" w:hAnsi="Cambria Math"/>
+          </w:rPr>
+          <m:t>(</m:t>
+        </m:r>
+        <m:r>
+          <w:rPr>
+            <w:rFonts w:ascii="Cambria Math" w:hAnsi="Cambria Math"/>
+          </w:rPr>
+          <m:t>i</m:t>
+        </m:r>
+        <m:r>
+          <w:rPr>
+            <w:rFonts w:ascii="Cambria Math" w:hAnsi="Cambria Math"/>
+          </w:rPr>
+          <m:t>,</m:t>
+        </m:r>
+        <m:r>
+          <w:rPr>
+            <w:rFonts w:ascii="Cambria Math" w:hAnsi="Cambria Math"/>
+          </w:rPr>
+          <m:t>k</m:t>
+        </m:r>
+        <m:r>
+          <w:rPr>
+            <w:rFonts w:ascii="Cambria Math" w:hAnsi="Cambria Math"/>
+          </w:rPr>
+          <m:t>)</m:t>
+        </m:r>
+      </m:oMath>
+      <w:r>
+        <w:t xml:space="preserve"> denote the targeted intermediate value, for example </w:t>
+      </w:r>
+      <m:oMath>
+        <m:r>
+          <w:rPr>
+            <w:rFonts w:ascii="Cambria Math" w:hAnsi="Cambria Math"/>
+          </w:rPr>
+          <m:t>v</m:t>
+        </m:r>
+        <m:r>
+          <w:rPr>
+            <w:rFonts w:ascii="Cambria Math" w:hAnsi="Cambria Math"/>
+          </w:rPr>
+          <m:t>=</m:t>
+        </m:r>
+        <m:r>
+          <w:rPr>
+            <w:rFonts w:ascii="Cambria Math" w:hAnsi="Cambria Math"/>
+          </w:rPr>
+          <m:t>S</m:t>
+        </m:r>
+        <m:r>
+          <w:rPr>
+            <w:rFonts w:ascii="Cambria Math" w:hAnsi="Cambria Math"/>
+          </w:rPr>
+          <m:t>(</m:t>
+        </m:r>
+        <m:r>
+          <w:rPr>
+            <w:rFonts w:ascii="Cambria Math" w:hAnsi="Cambria Math"/>
+          </w:rPr>
+          <m:t>x</m:t>
+        </m:r>
+        <m:r>
+          <w:rPr>
+            <w:rFonts w:ascii="Cambria Math" w:hAnsi="Cambria Math"/>
+          </w:rPr>
+          <m:t>⊕</m:t>
+        </m:r>
+        <m:r>
+          <w:rPr>
+            <w:rFonts w:ascii="Cambria Math" w:hAnsi="Cambria Math"/>
+          </w:rPr>
+          <m:t>k</m:t>
+        </m:r>
+        <m:r>
+          <w:rPr>
+            <w:rFonts w:ascii="Cambria Math" w:hAnsi="Cambria Math"/>
+          </w:rPr>
+          <m:t>)</m:t>
+        </m:r>
+      </m:oMath>
+      <w:r>
+        <w:t xml:space="preserve"> for an exclusive-or target, and let the predicted leakage under the Hamming-weight model be </w:t>
+      </w:r>
+      <m:oMath>
+        <m:r>
+          <w:rPr>
+            <w:rFonts w:ascii="Cambria Math" w:hAnsi="Cambria Math"/>
+          </w:rPr>
+          <m:t>h</m:t>
+        </m:r>
+        <m:r>
+          <w:rPr>
+            <w:rFonts w:ascii="Cambria Math" w:hAnsi="Cambria Math"/>
+          </w:rPr>
+          <m:t>(</m:t>
+        </m:r>
+        <m:r>
+          <w:rPr>
+            <w:rFonts w:ascii="Cambria Math" w:hAnsi="Cambria Math"/>
+          </w:rPr>
+          <m:t>i</m:t>
+        </m:r>
+        <m:r>
+          <w:rPr>
+            <w:rFonts w:ascii="Cambria Math" w:hAnsi="Cambria Math"/>
+          </w:rPr>
+          <m:t>,</m:t>
+        </m:r>
+        <m:r>
+          <w:rPr>
+            <w:rFonts w:ascii="Cambria Math" w:hAnsi="Cambria Math"/>
+          </w:rPr>
+          <m:t>k</m:t>
+        </m:r>
+        <m:r>
+          <w:rPr>
+            <w:rFonts w:ascii="Cambria Math" w:hAnsi="Cambria Math"/>
+          </w:rPr>
+          <m:t>)=</m:t>
+        </m:r>
+        <m:r>
+          <m:rPr>
+            <m:sty m:val="p"/>
+          </m:rPr>
+          <w:rPr>
+            <w:rFonts w:ascii="Cambria Math" w:hAnsi="Cambria Math"/>
+          </w:rPr>
+          <m:t>HW</m:t>
+        </m:r>
+        <m:r>
+          <w:rPr>
+            <w:rFonts w:ascii="Cambria Math" w:hAnsi="Cambria Math"/>
+          </w:rPr>
+          <m:t>(</m:t>
+        </m:r>
+        <m:r>
+          <w:rPr>
+            <w:rFonts w:ascii="Cambria Math" w:hAnsi="Cambria Math"/>
+          </w:rPr>
+          <m:t>v</m:t>
+        </m:r>
+        <m:r>
+          <w:rPr>
+            <w:rFonts w:ascii="Cambria Math" w:hAnsi="Cambria Math"/>
+          </w:rPr>
+          <m:t>(</m:t>
+        </m:r>
+        <m:r>
+          <w:rPr>
+            <w:rFonts w:ascii="Cambria Math" w:hAnsi="Cambria Math"/>
+          </w:rPr>
+          <m:t>i</m:t>
+        </m:r>
+        <m:r>
+          <w:rPr>
+            <w:rFonts w:ascii="Cambria Math" w:hAnsi="Cambria Math"/>
+          </w:rPr>
+          <m:t>,</m:t>
+        </m:r>
+        <m:r>
+          <w:rPr>
+            <w:rFonts w:ascii="Cambria Math" w:hAnsi="Cambria Math"/>
+          </w:rPr>
+          <m:t>k</m:t>
+        </m:r>
+        <m:r>
+          <w:rPr>
+            <w:rFonts w:ascii="Cambria Math" w:hAnsi="Cambria Math"/>
+          </w:rPr>
+          <m:t>))</m:t>
+        </m:r>
+      </m:oMath>
+      <w:r>
+        <w:t xml:space="preserve">, the number of one-bits in </w:t>
+      </w:r>
+      <m:oMath>
+        <m:r>
+          <w:rPr>
+            <w:rFonts w:ascii="Cambria Math" w:hAnsi="Cambria Math"/>
+          </w:rPr>
+          <m:t>v</m:t>
+        </m:r>
+      </m:oMath>
+      <w:r>
+        <w:t xml:space="preserve">. For each time sample </w:t>
+      </w:r>
+      <m:oMath>
+        <m:r>
+          <w:rPr>
+            <w:rFonts w:ascii="Cambria Math" w:hAnsi="Cambria Math"/>
+          </w:rPr>
+          <m:t>j</m:t>
+        </m:r>
+      </m:oMath>
+      <w:r>
+        <w:t xml:space="preserve"> the attacker computes the Pearson correlation between the column of predictions </w:t>
+      </w:r>
+      <m:oMath>
+        <m:r>
+          <w:rPr>
+            <w:rFonts w:ascii="Cambria Math" w:hAnsi="Cambria Math"/>
+          </w:rPr>
+          <m:t>h</m:t>
+        </m:r>
+        <m:r>
+          <w:rPr>
+            <w:rFonts w:ascii="Cambria Math" w:hAnsi="Cambria Math"/>
+          </w:rPr>
+          <m:t>(·,</m:t>
+        </m:r>
+        <m:r>
+          <w:rPr>
+            <w:rFonts w:ascii="Cambria Math" w:hAnsi="Cambria Math"/>
+          </w:rPr>
+          <m:t>k</m:t>
+        </m:r>
+        <m:r>
+          <w:rPr>
+            <w:rFonts w:ascii="Cambria Math" w:hAnsi="Cambria Math"/>
+          </w:rPr>
+          <m:t>)</m:t>
+        </m:r>
+      </m:oMath>
+      <w:r>
+        <w:t xml:space="preserve"> and the column of measurements </w:t>
+      </w:r>
+      <m:oMath>
+        <m:r>
+          <w:rPr>
+            <w:rFonts w:ascii="Cambria Math" w:hAnsi="Cambria Math"/>
+          </w:rPr>
+          <m:t>t</m:t>
+        </m:r>
+        <m:r>
+          <w:rPr>
+            <w:rFonts w:ascii="Cambria Math" w:hAnsi="Cambria Math"/>
+          </w:rPr>
+          <m:t>(·,</m:t>
+        </m:r>
+        <m:r>
+          <w:rPr>
+            <w:rFonts w:ascii="Cambria Math" w:hAnsi="Cambria Math"/>
+          </w:rPr>
+          <m:t>j</m:t>
+        </m:r>
+        <m:r>
+          <w:rPr>
+            <w:rFonts w:ascii="Cambria Math" w:hAnsi="Cambria Math"/>
+          </w:rPr>
+          <m:t>)</m:t>
+        </m:r>
+      </m:oMath>
+      <w:r>
+        <w:t>:</w:t>
       </w:r>
     </w:p>
     <w:p>
@@ -8388,14 +8717,150 @@
         <w:jc w:val="both"/>
       </w:pPr>
       <w:r>
-        <w:t>for an addition target, while for an exclusive-or target the signed maximum k* = argmax_k max_j r(k, j) is used instead, so that the signed value breaks the complement symmetry. The expected magnitude of the correct correlation grows with the signal-to-noise ratio and falls as the inverse square root of N for the incorrect hypotheses, which is why the correct key separates from the field as traces accumulate and why the number of traces to disclosure is a meaningful measure.</w:t>
+        <w:t xml:space="preserve">for an addition target, while for an exclusive-or target the signed maximum </w:t>
+      </w:r>
+      <m:oMath>
+        <m:sSup>
+          <m:sSupPr>
+            <m:ctrlPr>
+              <w:rPr>
+                <w:rFonts w:ascii="Cambria Math" w:hAnsi="Cambria Math"/>
+              </w:rPr>
+            </m:ctrlPr>
+          </m:sSupPr>
+          <m:e>
+            <m:r>
+              <w:rPr>
+                <w:rFonts w:ascii="Cambria Math" w:hAnsi="Cambria Math"/>
+              </w:rPr>
+              <m:t>k</m:t>
+            </m:r>
+          </m:e>
+          <m:sup>
+            <m:r>
+              <w:rPr>
+                <w:rFonts w:ascii="Cambria Math" w:hAnsi="Cambria Math"/>
+              </w:rPr>
+              <m:t>*</m:t>
+            </m:r>
+          </m:sup>
+        </m:sSup>
+        <m:r>
+          <w:rPr>
+            <w:rFonts w:ascii="Cambria Math" w:hAnsi="Cambria Math"/>
+          </w:rPr>
+          <m:t>=</m:t>
+        </m:r>
+        <m:sSub>
+          <m:sSubPr>
+            <m:ctrlPr>
+              <w:rPr>
+                <w:rFonts w:ascii="Cambria Math" w:hAnsi="Cambria Math"/>
+              </w:rPr>
+            </m:ctrlPr>
+          </m:sSubPr>
+          <m:e>
+            <m:r>
+              <m:rPr>
+                <m:sty m:val="p"/>
+              </m:rPr>
+              <w:rPr>
+                <w:rFonts w:ascii="Cambria Math" w:hAnsi="Cambria Math"/>
+              </w:rPr>
+              <m:t>argmax</m:t>
+            </m:r>
+          </m:e>
+          <m:sub>
+            <m:r>
+              <w:rPr>
+                <w:rFonts w:ascii="Cambria Math" w:hAnsi="Cambria Math"/>
+              </w:rPr>
+              <m:t>k</m:t>
+            </m:r>
+          </m:sub>
+        </m:sSub>
+        <m:sSub>
+          <m:sSubPr>
+            <m:ctrlPr>
+              <w:rPr>
+                <w:rFonts w:ascii="Cambria Math" w:hAnsi="Cambria Math"/>
+              </w:rPr>
+            </m:ctrlPr>
+          </m:sSubPr>
+          <m:e>
+            <m:r>
+              <w:rPr>
+                <w:rFonts w:ascii="Cambria Math" w:hAnsi="Cambria Math"/>
+              </w:rPr>
+              <m:t>max</m:t>
+            </m:r>
+          </m:e>
+          <m:sub>
+            <m:r>
+              <w:rPr>
+                <w:rFonts w:ascii="Cambria Math" w:hAnsi="Cambria Math"/>
+              </w:rPr>
+              <m:t>j</m:t>
+            </m:r>
+          </m:sub>
+        </m:sSub>
+        <m:r>
+          <w:rPr>
+            <w:rFonts w:ascii="Cambria Math" w:hAnsi="Cambria Math"/>
+          </w:rPr>
+          <m:t>r</m:t>
+        </m:r>
+        <m:r>
+          <w:rPr>
+            <w:rFonts w:ascii="Cambria Math" w:hAnsi="Cambria Math"/>
+          </w:rPr>
+          <m:t>(</m:t>
+        </m:r>
+        <m:r>
+          <w:rPr>
+            <w:rFonts w:ascii="Cambria Math" w:hAnsi="Cambria Math"/>
+          </w:rPr>
+          <m:t>k</m:t>
+        </m:r>
+        <m:r>
+          <w:rPr>
+            <w:rFonts w:ascii="Cambria Math" w:hAnsi="Cambria Math"/>
+          </w:rPr>
+          <m:t>,</m:t>
+        </m:r>
+        <m:r>
+          <w:rPr>
+            <w:rFonts w:ascii="Cambria Math" w:hAnsi="Cambria Math"/>
+          </w:rPr>
+          <m:t>j</m:t>
+        </m:r>
+        <m:r>
+          <w:rPr>
+            <w:rFonts w:ascii="Cambria Math" w:hAnsi="Cambria Math"/>
+          </w:rPr>
+          <m:t>)</m:t>
+        </m:r>
+      </m:oMath>
+      <w:r>
+        <w:t xml:space="preserve"> is used instead, so that the signed value breaks the complement symmetry. The expected magnitude of the correct correlation grows with the signal-to-noise ratio and falls as the inverse square root of </w:t>
+      </w:r>
+      <m:oMath>
+        <m:r>
+          <w:rPr>
+            <w:rFonts w:ascii="Cambria Math" w:hAnsi="Cambria Math"/>
+          </w:rPr>
+          <m:t>N</m:t>
+        </m:r>
+      </m:oMath>
+      <w:r>
+        <w:t xml:space="preserve"> for the incorrect hypotheses, which is why the correct key separates from the field as traces accumulate and why the number of traces to disclosure is a meaningful measure.</w:t>
       </w:r>
     </w:p>
     <w:p>
       <w:pPr>
         <w:pStyle w:val="Heading2"/>
       </w:pPr>
-      <w:bookmarkStart w:id="21" w:name="_Toc243341706"/>
+      <w:bookmarkStart w:id="21" w:name="_Toc243342777"/>
       <w:r>
         <w:rPr>
           <w:rFonts w:ascii="Times New Roman" w:hAnsi="Times New Roman"/>
@@ -8702,7 +9167,7 @@
       <w:pPr>
         <w:pStyle w:val="Heading2"/>
       </w:pPr>
-      <w:bookmarkStart w:id="22" w:name="_Toc243341707"/>
+      <w:bookmarkStart w:id="22" w:name="_Toc243342778"/>
       <w:r>
         <w:rPr>
           <w:rFonts w:ascii="Times New Roman" w:hAnsi="Times New Roman"/>
@@ -9415,7 +9880,7 @@
       <w:pPr>
         <w:pStyle w:val="Heading2"/>
       </w:pPr>
-      <w:bookmarkStart w:id="23" w:name="_Toc243341708"/>
+      <w:bookmarkStart w:id="23" w:name="_Toc243342779"/>
       <w:r>
         <w:rPr>
           <w:rFonts w:ascii="Times New Roman" w:hAnsi="Times New Roman"/>
@@ -9440,16 +9905,12 @@
       </w:r>
     </w:p>
     <w:p>
-      <w:r>
-        <w:br w:type="page"/>
-      </w:r>
-    </w:p>
-    <w:p>
       <w:pPr>
         <w:pStyle w:val="Heading1"/>
+        <w:pageBreakBefore/>
         <w:jc w:val="center"/>
       </w:pPr>
-      <w:bookmarkStart w:id="24" w:name="_Toc243341709"/>
+      <w:bookmarkStart w:id="24" w:name="_Toc243342780"/>
       <w:r>
         <w:rPr>
           <w:rFonts w:ascii="Times New Roman" w:hAnsi="Times New Roman"/>
@@ -9478,7 +9939,7 @@
       <w:pPr>
         <w:pStyle w:val="Heading2"/>
       </w:pPr>
-      <w:bookmarkStart w:id="25" w:name="_Toc243341710"/>
+      <w:bookmarkStart w:id="25" w:name="_Toc243342781"/>
       <w:r>
         <w:rPr>
           <w:rFonts w:ascii="Times New Roman" w:hAnsi="Times New Roman"/>
@@ -9513,7 +9974,7 @@
           <w:noProof/>
         </w:rPr>
         <w:drawing>
-          <wp:inline distT="0" distB="0" distL="0" distR="0" wp14:anchorId="4448939A" wp14:editId="2F5342F4">
+          <wp:inline distT="0" distB="0" distL="0" distR="0" wp14:anchorId="60D35794" wp14:editId="26D3B4E4">
             <wp:extent cx="5303520" cy="1236383"/>
             <wp:effectExtent l="0" t="0" r="0" b="0"/>
             <wp:docPr id="2" name="Picture 2"/>
@@ -9566,7 +10027,7 @@
       <w:pPr>
         <w:pStyle w:val="Heading2"/>
       </w:pPr>
-      <w:bookmarkStart w:id="26" w:name="_Toc243341711"/>
+      <w:bookmarkStart w:id="26" w:name="_Toc243342782"/>
       <w:r>
         <w:rPr>
           <w:rFonts w:ascii="Times New Roman" w:hAnsi="Times New Roman"/>
@@ -9583,14 +10044,14 @@
         <w:jc w:val="both"/>
       </w:pPr>
       <w:r>
-        <w:t xml:space="preserve">The target is an Espressif ESP32-S3 microcontroller, a dual-core processor clocked at up to two hundred and forty megahertz with ample memory, chosen because it is powerful enough to run both ChaCha20 and the finite-field arithmetic of a post-quantum scheme and because it is representative of the processors found in contemporary cyber-physical equipment. The supply current of the target is measured across a ten-ohm shunt resistor </w:t>
+        <w:t xml:space="preserve">The target is an Espressif ESP32-S3 microcontroller, a dual-core processor clocked at up to two hundred and forty megahertz with ample memory, chosen because it is powerful enough to run both ChaCha20 and the finite-field arithmetic of a post-quantum scheme and because it is representative of the processors found in contemporary cyber-physical </w:t>
       </w:r>
       <w:r>
         <w:lastRenderedPageBreak/>
-        <w:t>placed in its supply line. The small voltage developed across the shunt is digitised by an ADS1115 sixteen-bit analog-to-digital converter, which communicates over the inter-integrated-circuit bus with a Raspberry Pi 5 single-board computer. The Raspberry Pi also drives the target over a serial link, sending inputs and receiving outputs, and hosts the attacker and defender software. A second ESP32-S3 serves as a configurable noise source for evaluating the hiding countermeasure. The target is powered throug</w:t>
-      </w:r>
-      <w:r>
-        <w:t>h the shunt during trace collection, with its programming interface disconnected, so that the whole of its supply current passes through the measurement path. The arrangement is shown in Figure 3.3.</w:t>
+        <w:t>equipment. The supply current of the target is measured across a ten-ohm shunt resistor placed in its supply line. The small voltage developed across the shunt is digitised by an ADS1115 sixteen-bit analog-to-digital converter, which communicates over the inter-integrated-circuit bus with a Raspberry Pi 5 single-board computer. The Raspberry Pi also drives the target over a serial link, sending inputs and receiving outputs, and hosts the attacker and defender software. A second ESP32-S3 serves as a configur</w:t>
+      </w:r>
+      <w:r>
+        <w:t>able noise source for evaluating the hiding countermeasure. The target is powered through the shunt during trace collection, with its programming interface disconnected, so that the whole of its supply current passes through the measurement path. The arrangement is shown in Figure 3.3.</w:t>
       </w:r>
     </w:p>
     <w:p>
@@ -9602,7 +10063,7 @@
           <w:noProof/>
         </w:rPr>
         <w:drawing>
-          <wp:inline distT="0" distB="0" distL="0" distR="0" wp14:anchorId="283C5379" wp14:editId="2D5B11B7">
+          <wp:inline distT="0" distB="0" distL="0" distR="0" wp14:anchorId="22CF466D" wp14:editId="04CD94E6">
             <wp:extent cx="5303520" cy="573443"/>
             <wp:effectExtent l="0" t="0" r="0" b="0"/>
             <wp:docPr id="3" name="Picture 3"/>
@@ -9689,7 +10150,7 @@
       <w:pPr>
         <w:pStyle w:val="Heading2"/>
       </w:pPr>
-      <w:bookmarkStart w:id="27" w:name="_Toc243341712"/>
+      <w:bookmarkStart w:id="27" w:name="_Toc243342783"/>
       <w:r>
         <w:rPr>
           <w:rFonts w:ascii="Times New Roman" w:hAnsi="Times New Roman"/>
@@ -9735,7 +10196,7 @@
       <w:pPr>
         <w:pStyle w:val="Heading2"/>
       </w:pPr>
-      <w:bookmarkStart w:id="28" w:name="_Toc243341713"/>
+      <w:bookmarkStart w:id="28" w:name="_Toc243342784"/>
       <w:r>
         <w:rPr>
           <w:rFonts w:ascii="Times New Roman" w:hAnsi="Times New Roman"/>
@@ -9786,7 +10247,7 @@
           <w:noProof/>
         </w:rPr>
         <w:drawing>
-          <wp:inline distT="0" distB="0" distL="0" distR="0" wp14:anchorId="19C35B45" wp14:editId="76912BF9">
+          <wp:inline distT="0" distB="0" distL="0" distR="0" wp14:anchorId="5DD5F21A" wp14:editId="73B5B246">
             <wp:extent cx="5303520" cy="1743532"/>
             <wp:effectExtent l="0" t="0" r="0" b="0"/>
             <wp:docPr id="4" name="Picture 4"/>
@@ -10191,7 +10652,7 @@
       <w:pPr>
         <w:pStyle w:val="Heading2"/>
       </w:pPr>
-      <w:bookmarkStart w:id="29" w:name="_Toc243341714"/>
+      <w:bookmarkStart w:id="29" w:name="_Toc243342785"/>
       <w:r>
         <w:rPr>
           <w:rFonts w:ascii="Times New Roman" w:hAnsi="Times New Roman"/>
@@ -10218,7 +10679,7 @@
       <w:pPr>
         <w:pStyle w:val="Heading2"/>
       </w:pPr>
-      <w:bookmarkStart w:id="30" w:name="_Toc243341715"/>
+      <w:bookmarkStart w:id="30" w:name="_Toc243342786"/>
       <w:r>
         <w:rPr>
           <w:rFonts w:ascii="Times New Roman" w:hAnsi="Times New Roman"/>
@@ -10261,7 +10722,7 @@
       <w:pPr>
         <w:pStyle w:val="Heading2"/>
       </w:pPr>
-      <w:bookmarkStart w:id="31" w:name="_Toc243341716"/>
+      <w:bookmarkStart w:id="31" w:name="_Toc243342787"/>
       <w:r>
         <w:rPr>
           <w:rFonts w:ascii="Times New Roman" w:hAnsi="Times New Roman"/>
@@ -10731,7 +11192,7 @@
       <w:pPr>
         <w:pStyle w:val="Heading2"/>
       </w:pPr>
-      <w:bookmarkStart w:id="32" w:name="_Toc243341717"/>
+      <w:bookmarkStart w:id="32" w:name="_Toc243342788"/>
       <w:r>
         <w:rPr>
           <w:rFonts w:ascii="Times New Roman" w:hAnsi="Times New Roman"/>
@@ -10761,7 +11222,7 @@
       <w:pPr>
         <w:pStyle w:val="Heading2"/>
       </w:pPr>
-      <w:bookmarkStart w:id="33" w:name="_Toc243341718"/>
+      <w:bookmarkStart w:id="33" w:name="_Toc243342789"/>
       <w:r>
         <w:rPr>
           <w:rFonts w:ascii="Times New Roman" w:hAnsi="Times New Roman"/>
@@ -10786,16 +11247,12 @@
       </w:r>
     </w:p>
     <w:p>
-      <w:r>
-        <w:br w:type="page"/>
-      </w:r>
-    </w:p>
-    <w:p>
       <w:pPr>
         <w:pStyle w:val="Heading1"/>
+        <w:pageBreakBefore/>
         <w:jc w:val="center"/>
       </w:pPr>
-      <w:bookmarkStart w:id="34" w:name="_Toc243341719"/>
+      <w:bookmarkStart w:id="34" w:name="_Toc243342790"/>
       <w:r>
         <w:rPr>
           <w:rFonts w:ascii="Times New Roman" w:hAnsi="Times New Roman"/>
@@ -10824,7 +11281,7 @@
       <w:pPr>
         <w:pStyle w:val="Heading2"/>
       </w:pPr>
-      <w:bookmarkStart w:id="35" w:name="_Toc243341720"/>
+      <w:bookmarkStart w:id="35" w:name="_Toc243342791"/>
       <w:r>
         <w:rPr>
           <w:rFonts w:ascii="Times New Roman" w:hAnsi="Times New Roman"/>
@@ -10851,7 +11308,7 @@
       <w:pPr>
         <w:pStyle w:val="Heading2"/>
       </w:pPr>
-      <w:bookmarkStart w:id="36" w:name="_Toc243341721"/>
+      <w:bookmarkStart w:id="36" w:name="_Toc243342792"/>
       <w:r>
         <w:rPr>
           <w:rFonts w:ascii="Times New Roman" w:hAnsi="Times New Roman"/>
@@ -10879,26 +11336,47 @@
     </w:p>
     <w:p>
       <w:pPr>
-        <w:spacing w:after="0" w:line="240" w:lineRule="auto"/>
-      </w:pPr>
-      <w:r>
-        <w:rPr>
-          <w:rFonts w:ascii="Consolas" w:hAnsi="Consolas"/>
-          <w:sz w:val="19"/>
-        </w:rPr>
-        <w:t>// constant-time:  for (i=0;i&lt;SECRET_LEN;i++) diff |= cand[i]^secret[i];</w:t>
-      </w:r>
-    </w:p>
-    <w:p>
-      <w:pPr>
-        <w:spacing w:after="0" w:line="240" w:lineRule="auto"/>
-      </w:pPr>
-      <w:r>
-        <w:rPr>
-          <w:rFonts w:ascii="Consolas" w:hAnsi="Consolas"/>
-          <w:sz w:val="19"/>
-        </w:rPr>
-        <w:t>// early-exit:     for (i=0;i&lt;len;i++) if (cand[i]!=secret[i]) break;</w:t>
+        <w:jc w:val="center"/>
+      </w:pPr>
+      <w:r>
+        <w:rPr>
+          <w:noProof/>
+        </w:rPr>
+        <w:drawing>
+          <wp:inline distT="0" distB="0" distL="0" distR="0" wp14:anchorId="1C8517AD" wp14:editId="38E9FF38">
+            <wp:extent cx="4985886" cy="346509"/>
+            <wp:effectExtent l="0" t="0" r="0" b="0"/>
+            <wp:docPr id="5" name="Picture 5"/>
+            <wp:cNvGraphicFramePr>
+              <a:graphicFrameLocks xmlns:a="http://schemas.openxmlformats.org/drawingml/2006/main" noChangeAspect="1"/>
+            </wp:cNvGraphicFramePr>
+            <a:graphic xmlns:a="http://schemas.openxmlformats.org/drawingml/2006/main">
+              <a:graphicData uri="http://schemas.openxmlformats.org/drawingml/2006/picture">
+                <pic:pic xmlns:pic="http://schemas.openxmlformats.org/drawingml/2006/picture">
+                  <pic:nvPicPr>
+                    <pic:cNvPr id="0" name="code_body_1.png"/>
+                    <pic:cNvPicPr/>
+                  </pic:nvPicPr>
+                  <pic:blipFill>
+                    <a:blip r:embed="rId13"/>
+                    <a:stretch>
+                      <a:fillRect/>
+                    </a:stretch>
+                  </pic:blipFill>
+                  <pic:spPr>
+                    <a:xfrm>
+                      <a:off x="0" y="0"/>
+                      <a:ext cx="4985886" cy="346509"/>
+                    </a:xfrm>
+                    <a:prstGeom prst="rect">
+                      <a:avLst/>
+                    </a:prstGeom>
+                  </pic:spPr>
+                </pic:pic>
+              </a:graphicData>
+            </a:graphic>
+          </wp:inline>
+        </w:drawing>
       </w:r>
     </w:p>
     <w:p>
@@ -10913,31 +11391,152 @@
       </w:pPr>
       <w:r>
         <w:lastRenderedPageBreak/>
-        <w:t>The full authentication routine is listed in Appendix 19. The amplified first-round routine computes the real intermediate d = counter XOR (const0 + key0), applies the random mask when masking is enabled, and then, within a trigger-delimited window, toggles the leak pins in proportion to the Hamming weight of each byte across four equal phases, as the following two lines capture:</w:t>
-      </w:r>
-    </w:p>
-    <w:p>
-      <w:pPr>
-        <w:spacing w:after="0" w:line="240" w:lineRule="auto"/>
-      </w:pPr>
-      <w:r>
-        <w:rPr>
-          <w:rFonts w:ascii="Consolas" w:hAnsi="Consolas"/>
-          <w:sz w:val="19"/>
-        </w:rPr>
-        <w:t>uint32_t v = (counter ^ (kConstants[0] + chacha_key[0])) ^ mask;  // masked target</w:t>
-      </w:r>
-    </w:p>
-    <w:p>
-      <w:pPr>
-        <w:spacing w:after="0" w:line="240" w:lineRule="auto"/>
-      </w:pPr>
-      <w:r>
-        <w:rPr>
-          <w:rFonts w:ascii="Consolas" w:hAnsi="Consolas"/>
-          <w:sz w:val="19"/>
-        </w:rPr>
-        <w:t>for (k=0;k&lt;8;k++) if (b&amp;(1&lt;&lt;k)) { pin_high(k); pin_low(k); }       // toggles ~ HW(b)</w:t>
+        <w:t xml:space="preserve">The full authentication routine is listed in Appendix 19. The amplified first-round routine computes the real intermediate </w:t>
+      </w:r>
+      <m:oMath>
+        <m:r>
+          <w:rPr>
+            <w:rFonts w:ascii="Cambria Math" w:hAnsi="Cambria Math"/>
+          </w:rPr>
+          <m:t>d</m:t>
+        </m:r>
+        <m:r>
+          <w:rPr>
+            <w:rFonts w:ascii="Cambria Math" w:hAnsi="Cambria Math"/>
+          </w:rPr>
+          <m:t>=</m:t>
+        </m:r>
+        <m:r>
+          <m:rPr>
+            <m:sty m:val="p"/>
+          </m:rPr>
+          <w:rPr>
+            <w:rFonts w:ascii="Cambria Math" w:hAnsi="Cambria Math"/>
+          </w:rPr>
+          <m:t>counter</m:t>
+        </m:r>
+        <m:r>
+          <w:rPr>
+            <w:rFonts w:ascii="Cambria Math" w:hAnsi="Cambria Math"/>
+          </w:rPr>
+          <m:t>⊕(</m:t>
+        </m:r>
+        <m:sSub>
+          <m:sSubPr>
+            <m:ctrlPr>
+              <w:rPr>
+                <w:rFonts w:ascii="Cambria Math" w:hAnsi="Cambria Math"/>
+              </w:rPr>
+            </m:ctrlPr>
+          </m:sSubPr>
+          <m:e>
+            <m:r>
+              <m:rPr>
+                <m:sty m:val="p"/>
+              </m:rPr>
+              <w:rPr>
+                <w:rFonts w:ascii="Cambria Math" w:hAnsi="Cambria Math"/>
+              </w:rPr>
+              <m:t>const</m:t>
+            </m:r>
+          </m:e>
+          <m:sub>
+            <m:r>
+              <w:rPr>
+                <w:rFonts w:ascii="Cambria Math" w:hAnsi="Cambria Math"/>
+              </w:rPr>
+              <m:t>0</m:t>
+            </m:r>
+          </m:sub>
+        </m:sSub>
+        <m:r>
+          <w:rPr>
+            <w:rFonts w:ascii="Cambria Math" w:hAnsi="Cambria Math"/>
+          </w:rPr>
+          <m:t>+</m:t>
+        </m:r>
+        <m:sSub>
+          <m:sSubPr>
+            <m:ctrlPr>
+              <w:rPr>
+                <w:rFonts w:ascii="Cambria Math" w:hAnsi="Cambria Math"/>
+              </w:rPr>
+            </m:ctrlPr>
+          </m:sSubPr>
+          <m:e>
+            <m:r>
+              <m:rPr>
+                <m:sty m:val="p"/>
+              </m:rPr>
+              <w:rPr>
+                <w:rFonts w:ascii="Cambria Math" w:hAnsi="Cambria Math"/>
+              </w:rPr>
+              <m:t>key</m:t>
+            </m:r>
+          </m:e>
+          <m:sub>
+            <m:r>
+              <w:rPr>
+                <w:rFonts w:ascii="Cambria Math" w:hAnsi="Cambria Math"/>
+              </w:rPr>
+              <m:t>0</m:t>
+            </m:r>
+          </m:sub>
+        </m:sSub>
+        <m:r>
+          <w:rPr>
+            <w:rFonts w:ascii="Cambria Math" w:hAnsi="Cambria Math"/>
+          </w:rPr>
+          <m:t>)</m:t>
+        </m:r>
+      </m:oMath>
+      <w:r>
+        <w:t>, applies the random mask when masking is enabled, and then, within a trigger-delimited window, toggles the leak pins in proportion to the Hamming weight of each byte across four equal phases, as the following two lines capture:</w:t>
+      </w:r>
+    </w:p>
+    <w:p>
+      <w:pPr>
+        <w:jc w:val="center"/>
+      </w:pPr>
+      <w:r>
+        <w:rPr>
+          <w:noProof/>
+        </w:rPr>
+        <w:drawing>
+          <wp:inline distT="0" distB="0" distL="0" distR="0" wp14:anchorId="03F0EA1A" wp14:editId="4C51AA5B">
+            <wp:extent cx="5120640" cy="302450"/>
+            <wp:effectExtent l="0" t="0" r="0" b="0"/>
+            <wp:docPr id="6" name="Picture 6"/>
+            <wp:cNvGraphicFramePr>
+              <a:graphicFrameLocks xmlns:a="http://schemas.openxmlformats.org/drawingml/2006/main" noChangeAspect="1"/>
+            </wp:cNvGraphicFramePr>
+            <a:graphic xmlns:a="http://schemas.openxmlformats.org/drawingml/2006/main">
+              <a:graphicData uri="http://schemas.openxmlformats.org/drawingml/2006/picture">
+                <pic:pic xmlns:pic="http://schemas.openxmlformats.org/drawingml/2006/picture">
+                  <pic:nvPicPr>
+                    <pic:cNvPr id="0" name="code_body_2.png"/>
+                    <pic:cNvPicPr/>
+                  </pic:nvPicPr>
+                  <pic:blipFill>
+                    <a:blip r:embed="rId14"/>
+                    <a:stretch>
+                      <a:fillRect/>
+                    </a:stretch>
+                  </pic:blipFill>
+                  <pic:spPr>
+                    <a:xfrm>
+                      <a:off x="0" y="0"/>
+                      <a:ext cx="5120640" cy="302450"/>
+                    </a:xfrm>
+                    <a:prstGeom prst="rect">
+                      <a:avLst/>
+                    </a:prstGeom>
+                  </pic:spPr>
+                </pic:pic>
+              </a:graphicData>
+            </a:graphic>
+          </wp:inline>
+        </w:drawing>
       </w:r>
     </w:p>
     <w:p>
@@ -10951,31 +11550,110 @@
         <w:jc w:val="both"/>
       </w:pPr>
       <w:r>
-        <w:t>The complete routine, including the four-phase loop and the constant-time dummy path, is listed in Appendix 20. The Kyber routine is analogous: it computes the real pointwise product t = s_hat * u mod q of the secret coefficient with the attacker-supplied value and amplifies the Hamming weight of that twelve-bit product in the same manner, as shown below; the full routine is in Appendix 21.</w:t>
-      </w:r>
-    </w:p>
-    <w:p>
-      <w:pPr>
-        <w:spacing w:after="0" w:line="240" w:lineRule="auto"/>
-      </w:pPr>
-      <w:r>
-        <w:rPr>
-          <w:rFonts w:ascii="Consolas" w:hAnsi="Consolas"/>
-          <w:sz w:val="19"/>
-        </w:rPr>
-        <w:t>uint16_t t = (kyber_s_hat * u) % KYBER_Q;     // secret-dependent product</w:t>
-      </w:r>
-    </w:p>
-    <w:p>
-      <w:pPr>
-        <w:spacing w:after="0" w:line="240" w:lineRule="auto"/>
-      </w:pPr>
-      <w:r>
-        <w:rPr>
-          <w:rFonts w:ascii="Consolas" w:hAnsi="Consolas"/>
-          <w:sz w:val="19"/>
-        </w:rPr>
-        <w:t>for (bit=0;bit&lt;12;bit++) if (t&amp;(1&lt;&lt;bit)) { pin_high(bit&amp;7); pin_low(bit&amp;7); }</w:t>
+        <w:t xml:space="preserve">The complete routine, including the four-phase loop and the constant-time dummy path, is listed in Appendix 20. The Kyber routine is analogous: it computes the real pointwise product </w:t>
+      </w:r>
+      <m:oMath>
+        <m:r>
+          <w:rPr>
+            <w:rFonts w:ascii="Cambria Math" w:hAnsi="Cambria Math"/>
+          </w:rPr>
+          <m:t>t</m:t>
+        </m:r>
+        <m:r>
+          <w:rPr>
+            <w:rFonts w:ascii="Cambria Math" w:hAnsi="Cambria Math"/>
+          </w:rPr>
+          <m:t>=</m:t>
+        </m:r>
+        <m:acc>
+          <m:accPr>
+            <m:ctrlPr>
+              <w:rPr>
+                <w:rFonts w:ascii="Cambria Math" w:hAnsi="Cambria Math"/>
+              </w:rPr>
+            </m:ctrlPr>
+          </m:accPr>
+          <m:e>
+            <m:r>
+              <w:rPr>
+                <w:rFonts w:ascii="Cambria Math" w:hAnsi="Cambria Math"/>
+              </w:rPr>
+              <m:t>s</m:t>
+            </m:r>
+          </m:e>
+        </m:acc>
+        <m:r>
+          <w:rPr>
+            <w:rFonts w:ascii="Cambria Math" w:hAnsi="Cambria Math"/>
+          </w:rPr>
+          <m:t>·</m:t>
+        </m:r>
+        <m:r>
+          <w:rPr>
+            <w:rFonts w:ascii="Cambria Math" w:hAnsi="Cambria Math"/>
+          </w:rPr>
+          <m:t>u</m:t>
+        </m:r>
+        <m:r>
+          <m:rPr>
+            <m:nor/>
+          </m:rPr>
+          <m:t> mod </m:t>
+        </m:r>
+        <m:r>
+          <w:rPr>
+            <w:rFonts w:ascii="Cambria Math" w:hAnsi="Cambria Math"/>
+          </w:rPr>
+          <m:t>q</m:t>
+        </m:r>
+      </m:oMath>
+      <w:r>
+        <w:t xml:space="preserve"> of the secret coefficient with the attacker-supplied value and amplifies the Hamming weight of that twelve-bit product in the same manner, as shown below; the full routine is in Appendix 21.</w:t>
+      </w:r>
+    </w:p>
+    <w:p>
+      <w:pPr>
+        <w:jc w:val="center"/>
+      </w:pPr>
+      <w:r>
+        <w:rPr>
+          <w:noProof/>
+        </w:rPr>
+        <w:drawing>
+          <wp:inline distT="0" distB="0" distL="0" distR="0" wp14:anchorId="740146C3" wp14:editId="7004A1A5">
+            <wp:extent cx="5120640" cy="332449"/>
+            <wp:effectExtent l="0" t="0" r="0" b="0"/>
+            <wp:docPr id="7" name="Picture 7"/>
+            <wp:cNvGraphicFramePr>
+              <a:graphicFrameLocks xmlns:a="http://schemas.openxmlformats.org/drawingml/2006/main" noChangeAspect="1"/>
+            </wp:cNvGraphicFramePr>
+            <a:graphic xmlns:a="http://schemas.openxmlformats.org/drawingml/2006/main">
+              <a:graphicData uri="http://schemas.openxmlformats.org/drawingml/2006/picture">
+                <pic:pic xmlns:pic="http://schemas.openxmlformats.org/drawingml/2006/picture">
+                  <pic:nvPicPr>
+                    <pic:cNvPr id="0" name="code_body_3.png"/>
+                    <pic:cNvPicPr/>
+                  </pic:nvPicPr>
+                  <pic:blipFill>
+                    <a:blip r:embed="rId15"/>
+                    <a:stretch>
+                      <a:fillRect/>
+                    </a:stretch>
+                  </pic:blipFill>
+                  <pic:spPr>
+                    <a:xfrm>
+                      <a:off x="0" y="0"/>
+                      <a:ext cx="5120640" cy="332449"/>
+                    </a:xfrm>
+                    <a:prstGeom prst="rect">
+                      <a:avLst/>
+                    </a:prstGeom>
+                  </pic:spPr>
+                </pic:pic>
+              </a:graphicData>
+            </a:graphic>
+          </wp:inline>
+        </w:drawing>
       </w:r>
     </w:p>
     <w:p>
@@ -10987,7 +11665,7 @@
       <w:pPr>
         <w:pStyle w:val="Heading2"/>
       </w:pPr>
-      <w:bookmarkStart w:id="37" w:name="_Toc243341722"/>
+      <w:bookmarkStart w:id="37" w:name="_Toc243342793"/>
       <w:r>
         <w:rPr>
           <w:rFonts w:ascii="Times New Roman" w:hAnsi="Times New Roman"/>
@@ -11012,26 +11690,47 @@
     </w:p>
     <w:p>
       <w:pPr>
-        <w:spacing w:after="0" w:line="240" w:lineRule="auto"/>
-      </w:pPr>
-      <w:r>
-        <w:rPr>
-          <w:rFonts w:ascii="Consolas" w:hAnsi="Consolas"/>
-          <w:sz w:val="19"/>
-        </w:rPr>
-        <w:t>corr = correlation_matrix(hamming_weight_vec(known ^ guesses), traces)</w:t>
-      </w:r>
-    </w:p>
-    <w:p>
-      <w:pPr>
-        <w:spacing w:after="0" w:line="240" w:lineRule="auto"/>
-      </w:pPr>
-      <w:r>
-        <w:rPr>
-          <w:rFonts w:ascii="Consolas" w:hAnsi="Consolas"/>
-          <w:sz w:val="19"/>
-        </w:rPr>
-        <w:t>best = int(np.argmax(corr.max(axis=1)))   # signed peak resolves the complement</w:t>
+        <w:jc w:val="center"/>
+      </w:pPr>
+      <w:r>
+        <w:rPr>
+          <w:noProof/>
+        </w:rPr>
+        <w:drawing>
+          <wp:inline distT="0" distB="0" distL="0" distR="0" wp14:anchorId="7CBA2C0D" wp14:editId="0D38EB55">
+            <wp:extent cx="5120640" cy="325120"/>
+            <wp:effectExtent l="0" t="0" r="0" b="0"/>
+            <wp:docPr id="8" name="Picture 8"/>
+            <wp:cNvGraphicFramePr>
+              <a:graphicFrameLocks xmlns:a="http://schemas.openxmlformats.org/drawingml/2006/main" noChangeAspect="1"/>
+            </wp:cNvGraphicFramePr>
+            <a:graphic xmlns:a="http://schemas.openxmlformats.org/drawingml/2006/main">
+              <a:graphicData uri="http://schemas.openxmlformats.org/drawingml/2006/picture">
+                <pic:pic xmlns:pic="http://schemas.openxmlformats.org/drawingml/2006/picture">
+                  <pic:nvPicPr>
+                    <pic:cNvPr id="0" name="code_body_4.png"/>
+                    <pic:cNvPicPr/>
+                  </pic:nvPicPr>
+                  <pic:blipFill>
+                    <a:blip r:embed="rId16"/>
+                    <a:stretch>
+                      <a:fillRect/>
+                    </a:stretch>
+                  </pic:blipFill>
+                  <pic:spPr>
+                    <a:xfrm>
+                      <a:off x="0" y="0"/>
+                      <a:ext cx="5120640" cy="325120"/>
+                    </a:xfrm>
+                    <a:prstGeom prst="rect">
+                      <a:avLst/>
+                    </a:prstGeom>
+                  </pic:spPr>
+                </pic:pic>
+              </a:graphicData>
+            </a:graphic>
+          </wp:inline>
+        </w:drawing>
       </w:r>
     </w:p>
     <w:p>
@@ -11043,13 +11742,14 @@
       <w:pPr>
         <w:pStyle w:val="Heading2"/>
       </w:pPr>
-      <w:bookmarkStart w:id="38" w:name="_Toc243341723"/>
+      <w:bookmarkStart w:id="38" w:name="_Toc243342794"/>
       <w:r>
         <w:rPr>
           <w:rFonts w:ascii="Times New Roman" w:hAnsi="Times New Roman"/>
           <w:color w:val="000000"/>
           <w:sz w:val="28"/>
         </w:rPr>
+        <w:lastRenderedPageBreak/>
         <w:t>4.4  THE ATTACKER PROGRAM</w:t>
       </w:r>
       <w:bookmarkEnd w:id="38"/>
@@ -11060,21 +11760,20 @@
         <w:jc w:val="both"/>
       </w:pPr>
       <w:r>
-        <w:t xml:space="preserve">The attacker program is a self-contained command-line tool that can only observe the device. A transport layer abstracts the connection so that the identical attack code runs against the simulator or the physical device. For correlation power analysis the program </w:t>
-      </w:r>
-      <w:r>
-        <w:lastRenderedPageBreak/>
-        <w:t>collects traces, computes the per-byte correlation for every key hypothesis, and reports not merely the recovered key but a complete body of evidence: for each key byte, the correlation peak and the margin by which the winning candidate exceeds the runner-up, the time sample at which the byte leaks, and a ranking of the strongest candidates; and across the whole key, the convergence of the attack as traces accumulate. The same tool recovers Kyber secret coefficients and performs the timing and replay attack</w:t>
-      </w:r>
-      <w:r>
-        <w:t>s. The decision to report confidence and convergence, rather than only the recovered value, reflects the project's emphasis on quantitative evidence: a recovered key accompanied by its margin to the runner-up and its number of traces to disclosure is a far stronger result than a bare value.</w:t>
+        <w:t>The attacker program is a self-contained command-line tool that can only observe the device. A transport layer abstracts the connection so that the identical attack code runs against the simulator or the physical device. For correlation power analysis the program collects traces, computes the per-byte correlation for every key hypothesis, and reports not merely the recovered key but a complete body of evidence: for each key byte, the correlation peak and the margin by which the winning candidate exceeds the</w:t>
+      </w:r>
+      <w:r>
+        <w:t xml:space="preserve"> runner-up, the time sample at which the byte leaks, and a ranking of the strongest candidates; and across the whole key, the convergence of the attack as traces accumulate. The same tool recovers Kyber secret coefficients and performs the timing and replay attacks. The decision to report confidence and convergence, rather than only the recovered value, reflects the project's emphasis on quantitative evidence: a recovered key accompanied by its margin to the runner-up and its number of traces to disclosure </w:t>
+      </w:r>
+      <w:r>
+        <w:t>is a far stronger result than a bare value.</w:t>
       </w:r>
     </w:p>
     <w:p>
       <w:pPr>
         <w:pStyle w:val="Heading2"/>
       </w:pPr>
-      <w:bookmarkStart w:id="39" w:name="_Toc243341724"/>
+      <w:bookmarkStart w:id="39" w:name="_Toc243342795"/>
       <w:r>
         <w:rPr>
           <w:rFonts w:ascii="Times New Roman" w:hAnsi="Times New Roman"/>
@@ -11101,7 +11800,7 @@
       <w:pPr>
         <w:pStyle w:val="Heading2"/>
       </w:pPr>
-      <w:bookmarkStart w:id="40" w:name="_Toc243341725"/>
+      <w:bookmarkStart w:id="40" w:name="_Toc243342796"/>
       <w:r>
         <w:rPr>
           <w:rFonts w:ascii="Times New Roman" w:hAnsi="Times New Roman"/>
@@ -11118,24 +11817,24 @@
         <w:jc w:val="both"/>
       </w:pPr>
       <w:r>
-        <w:t>The machine-learning monitor extracts the nine features described in the previous chapter from a sliding window and scores them with an isolation forest. The model is trained only on features drawn from simulated normal traffic, so that no labelled attack data is required, and the training windows are deliberately drawn from a range of sizes. This last point was found to be essential: a model trained on windows of a single size scored windows of other sizes as out-of-distribution and behaved erratically, wh</w:t>
-      </w:r>
-      <w:r>
-        <w:t>ereas training across a range of sizes produced a monitor that generalised, achieving no false positives on normal traffic while still detecting both an aggressive and a throttled attacker.</w:t>
+        <w:t xml:space="preserve">The machine-learning monitor extracts the nine features described in the previous chapter from a sliding window and scores them with an isolation forest. The model is trained only on features drawn from simulated normal traffic, so that no labelled attack data is required, and the training windows are deliberately drawn from a range of sizes. This last point was found to be essential: a model trained on windows of a single size scored </w:t>
+      </w:r>
+      <w:r>
+        <w:lastRenderedPageBreak/>
+        <w:t>windows of other sizes as out-of-distribution and behaved erratically, whereas training across a range of sizes produced a monitor that generalised, achieving no false positives on normal traffic while still detecting both an aggressive and a throttled attacker.</w:t>
       </w:r>
     </w:p>
     <w:p>
       <w:pPr>
         <w:pStyle w:val="Heading2"/>
       </w:pPr>
-      <w:bookmarkStart w:id="41" w:name="_Toc243341726"/>
+      <w:bookmarkStart w:id="41" w:name="_Toc243342797"/>
       <w:r>
         <w:rPr>
           <w:rFonts w:ascii="Times New Roman" w:hAnsi="Times New Roman"/>
           <w:color w:val="000000"/>
           <w:sz w:val="28"/>
         </w:rPr>
-        <w:lastRenderedPageBreak/>
         <w:t>4.7  SOFTWARE ENGINEERING AND TOOLS</w:t>
       </w:r>
       <w:bookmarkEnd w:id="41"/>
@@ -11156,7 +11855,7 @@
       <w:pPr>
         <w:pStyle w:val="Heading2"/>
       </w:pPr>
-      <w:bookmarkStart w:id="42" w:name="_Toc243341727"/>
+      <w:bookmarkStart w:id="42" w:name="_Toc243342798"/>
       <w:r>
         <w:rPr>
           <w:rFonts w:ascii="Times New Roman" w:hAnsi="Times New Roman"/>
@@ -11183,16 +11882,12 @@
       </w:r>
     </w:p>
     <w:p>
-      <w:r>
-        <w:br w:type="page"/>
-      </w:r>
-    </w:p>
-    <w:p>
       <w:pPr>
         <w:pStyle w:val="Heading1"/>
+        <w:pageBreakBefore/>
         <w:jc w:val="center"/>
       </w:pPr>
-      <w:bookmarkStart w:id="43" w:name="_Toc243341728"/>
+      <w:bookmarkStart w:id="43" w:name="_Toc243342799"/>
       <w:r>
         <w:rPr>
           <w:rFonts w:ascii="Times New Roman" w:hAnsi="Times New Roman"/>
@@ -11221,7 +11916,7 @@
       <w:pPr>
         <w:pStyle w:val="Heading2"/>
       </w:pPr>
-      <w:bookmarkStart w:id="44" w:name="_Toc243341729"/>
+      <w:bookmarkStart w:id="44" w:name="_Toc243342800"/>
       <w:r>
         <w:rPr>
           <w:rFonts w:ascii="Times New Roman" w:hAnsi="Times New Roman"/>
@@ -11253,10 +11948,10 @@
           <w:noProof/>
         </w:rPr>
         <w:drawing>
-          <wp:inline distT="0" distB="0" distL="0" distR="0" wp14:anchorId="3A50DB5B" wp14:editId="4AFBFB1D">
+          <wp:inline distT="0" distB="0" distL="0" distR="0" wp14:anchorId="5BA8D20D" wp14:editId="768F2312">
             <wp:extent cx="5303520" cy="3374967"/>
             <wp:effectExtent l="0" t="0" r="0" b="0"/>
-            <wp:docPr id="5" name="Picture 5"/>
+            <wp:docPr id="9" name="Picture 9"/>
             <wp:cNvGraphicFramePr>
               <a:graphicFrameLocks xmlns:a="http://schemas.openxmlformats.org/drawingml/2006/main" noChangeAspect="1"/>
             </wp:cNvGraphicFramePr>
@@ -11268,7 +11963,7 @@
                     <pic:cNvPicPr/>
                   </pic:nvPicPr>
                   <pic:blipFill>
-                    <a:blip r:embed="rId13"/>
+                    <a:blip r:embed="rId17"/>
                     <a:stretch>
                       <a:fillRect/>
                     </a:stretch>
@@ -11551,10 +12246,10 @@
           <w:noProof/>
         </w:rPr>
         <w:drawing>
-          <wp:inline distT="0" distB="0" distL="0" distR="0" wp14:anchorId="3FDD6532" wp14:editId="2B800AF4">
+          <wp:inline distT="0" distB="0" distL="0" distR="0" wp14:anchorId="6C416E62" wp14:editId="2534A7C1">
             <wp:extent cx="5303520" cy="2272937"/>
             <wp:effectExtent l="0" t="0" r="0" b="0"/>
-            <wp:docPr id="6" name="Picture 6"/>
+            <wp:docPr id="10" name="Picture 10"/>
             <wp:cNvGraphicFramePr>
               <a:graphicFrameLocks xmlns:a="http://schemas.openxmlformats.org/drawingml/2006/main" noChangeAspect="1"/>
             </wp:cNvGraphicFramePr>
@@ -11566,7 +12261,7 @@
                     <pic:cNvPicPr/>
                   </pic:nvPicPr>
                   <pic:blipFill>
-                    <a:blip r:embed="rId14"/>
+                    <a:blip r:embed="rId18"/>
                     <a:stretch>
                       <a:fillRect/>
                     </a:stretch>
@@ -11994,7 +12689,7 @@
       <w:pPr>
         <w:pStyle w:val="Heading2"/>
       </w:pPr>
-      <w:bookmarkStart w:id="45" w:name="_Toc243341730"/>
+      <w:bookmarkStart w:id="45" w:name="_Toc243342801"/>
       <w:r>
         <w:rPr>
           <w:rFonts w:ascii="Times New Roman" w:hAnsi="Times New Roman"/>
@@ -12030,10 +12725,10 @@
           <w:noProof/>
         </w:rPr>
         <w:drawing>
-          <wp:inline distT="0" distB="0" distL="0" distR="0" wp14:anchorId="6A30F9AC" wp14:editId="73E71CD0">
+          <wp:inline distT="0" distB="0" distL="0" distR="0" wp14:anchorId="70145E38" wp14:editId="586F72A5">
             <wp:extent cx="5303520" cy="2121408"/>
             <wp:effectExtent l="0" t="0" r="0" b="0"/>
-            <wp:docPr id="7" name="Picture 7"/>
+            <wp:docPr id="11" name="Picture 11"/>
             <wp:cNvGraphicFramePr>
               <a:graphicFrameLocks xmlns:a="http://schemas.openxmlformats.org/drawingml/2006/main" noChangeAspect="1"/>
             </wp:cNvGraphicFramePr>
@@ -12045,7 +12740,7 @@
                     <pic:cNvPicPr/>
                   </pic:nvPicPr>
                   <pic:blipFill>
-                    <a:blip r:embed="rId15"/>
+                    <a:blip r:embed="rId19"/>
                     <a:stretch>
                       <a:fillRect/>
                     </a:stretch>
@@ -12393,10 +13088,10 @@
           <w:noProof/>
         </w:rPr>
         <w:drawing>
-          <wp:inline distT="0" distB="0" distL="0" distR="0" wp14:anchorId="044955E5" wp14:editId="0C70EF43">
+          <wp:inline distT="0" distB="0" distL="0" distR="0" wp14:anchorId="468DF7C9" wp14:editId="4F67BDAC">
             <wp:extent cx="5303520" cy="2571404"/>
             <wp:effectExtent l="0" t="0" r="0" b="0"/>
-            <wp:docPr id="8" name="Picture 8"/>
+            <wp:docPr id="12" name="Picture 12"/>
             <wp:cNvGraphicFramePr>
               <a:graphicFrameLocks xmlns:a="http://schemas.openxmlformats.org/drawingml/2006/main" noChangeAspect="1"/>
             </wp:cNvGraphicFramePr>
@@ -12408,7 +13103,7 @@
                     <pic:cNvPicPr/>
                   </pic:nvPicPr>
                   <pic:blipFill>
-                    <a:blip r:embed="rId16"/>
+                    <a:blip r:embed="rId20"/>
                     <a:stretch>
                       <a:fillRect/>
                     </a:stretch>
@@ -12446,7 +13141,7 @@
       <w:pPr>
         <w:pStyle w:val="Heading2"/>
       </w:pPr>
-      <w:bookmarkStart w:id="46" w:name="_Toc243341731"/>
+      <w:bookmarkStart w:id="46" w:name="_Toc243342802"/>
       <w:r>
         <w:rPr>
           <w:rFonts w:ascii="Times New Roman" w:hAnsi="Times New Roman"/>
@@ -12733,7 +13428,7 @@
       <w:pPr>
         <w:pStyle w:val="Heading2"/>
       </w:pPr>
-      <w:bookmarkStart w:id="47" w:name="_Toc243341732"/>
+      <w:bookmarkStart w:id="47" w:name="_Toc243342803"/>
       <w:r>
         <w:rPr>
           <w:rFonts w:ascii="Times New Roman" w:hAnsi="Times New Roman"/>
@@ -12800,10 +13495,10 @@
           <w:noProof/>
         </w:rPr>
         <w:drawing>
-          <wp:inline distT="0" distB="0" distL="0" distR="0" wp14:anchorId="6397923D" wp14:editId="48D21124">
+          <wp:inline distT="0" distB="0" distL="0" distR="0" wp14:anchorId="59E45FA7" wp14:editId="29366049">
             <wp:extent cx="5303520" cy="2121408"/>
             <wp:effectExtent l="0" t="0" r="0" b="0"/>
-            <wp:docPr id="9" name="Picture 9"/>
+            <wp:docPr id="13" name="Picture 13"/>
             <wp:cNvGraphicFramePr>
               <a:graphicFrameLocks xmlns:a="http://schemas.openxmlformats.org/drawingml/2006/main" noChangeAspect="1"/>
             </wp:cNvGraphicFramePr>
@@ -12815,7 +13510,7 @@
                     <pic:cNvPicPr/>
                   </pic:nvPicPr>
                   <pic:blipFill>
-                    <a:blip r:embed="rId17"/>
+                    <a:blip r:embed="rId21"/>
                     <a:stretch>
                       <a:fillRect/>
                     </a:stretch>
@@ -13201,7 +13896,7 @@
       <w:pPr>
         <w:pStyle w:val="Heading2"/>
       </w:pPr>
-      <w:bookmarkStart w:id="48" w:name="_Toc243341733"/>
+      <w:bookmarkStart w:id="48" w:name="_Toc243342804"/>
       <w:r>
         <w:rPr>
           <w:rFonts w:ascii="Times New Roman" w:hAnsi="Times New Roman"/>
@@ -13234,10 +13929,10 @@
           <w:noProof/>
         </w:rPr>
         <w:drawing>
-          <wp:inline distT="0" distB="0" distL="0" distR="0" wp14:anchorId="3DE869E5" wp14:editId="18334B8A">
+          <wp:inline distT="0" distB="0" distL="0" distR="0" wp14:anchorId="2618A976" wp14:editId="1B29DEA6">
             <wp:extent cx="5303520" cy="2424466"/>
             <wp:effectExtent l="0" t="0" r="0" b="0"/>
-            <wp:docPr id="10" name="Picture 10"/>
+            <wp:docPr id="14" name="Picture 14"/>
             <wp:cNvGraphicFramePr>
               <a:graphicFrameLocks xmlns:a="http://schemas.openxmlformats.org/drawingml/2006/main" noChangeAspect="1"/>
             </wp:cNvGraphicFramePr>
@@ -13249,7 +13944,7 @@
                     <pic:cNvPicPr/>
                   </pic:nvPicPr>
                   <pic:blipFill>
-                    <a:blip r:embed="rId18"/>
+                    <a:blip r:embed="rId22"/>
                     <a:stretch>
                       <a:fillRect/>
                     </a:stretch>
@@ -13514,7 +14209,7 @@
       <w:pPr>
         <w:pStyle w:val="Heading2"/>
       </w:pPr>
-      <w:bookmarkStart w:id="49" w:name="_Toc243341734"/>
+      <w:bookmarkStart w:id="49" w:name="_Toc243342805"/>
       <w:r>
         <w:rPr>
           <w:rFonts w:ascii="Times New Roman" w:hAnsi="Times New Roman"/>
@@ -13559,10 +14254,10 @@
           <w:noProof/>
         </w:rPr>
         <w:drawing>
-          <wp:inline distT="0" distB="0" distL="0" distR="0" wp14:anchorId="02E59C57" wp14:editId="3DAB79B7">
+          <wp:inline distT="0" distB="0" distL="0" distR="0" wp14:anchorId="304F446C" wp14:editId="6C00ACF6">
             <wp:extent cx="5303520" cy="1988820"/>
             <wp:effectExtent l="0" t="0" r="0" b="0"/>
-            <wp:docPr id="11" name="Picture 11"/>
+            <wp:docPr id="15" name="Picture 15"/>
             <wp:cNvGraphicFramePr>
               <a:graphicFrameLocks xmlns:a="http://schemas.openxmlformats.org/drawingml/2006/main" noChangeAspect="1"/>
             </wp:cNvGraphicFramePr>
@@ -13574,7 +14269,7 @@
                     <pic:cNvPicPr/>
                   </pic:nvPicPr>
                   <pic:blipFill>
-                    <a:blip r:embed="rId19"/>
+                    <a:blip r:embed="rId23"/>
                     <a:stretch>
                       <a:fillRect/>
                     </a:stretch>
@@ -13633,10 +14328,10 @@
           <w:noProof/>
         </w:rPr>
         <w:drawing>
-          <wp:inline distT="0" distB="0" distL="0" distR="0" wp14:anchorId="76693F97" wp14:editId="3EB97A18">
+          <wp:inline distT="0" distB="0" distL="0" distR="0" wp14:anchorId="70F84F60" wp14:editId="010A1961">
             <wp:extent cx="5303520" cy="2495774"/>
             <wp:effectExtent l="0" t="0" r="0" b="0"/>
-            <wp:docPr id="12" name="Picture 12"/>
+            <wp:docPr id="16" name="Picture 16"/>
             <wp:cNvGraphicFramePr>
               <a:graphicFrameLocks xmlns:a="http://schemas.openxmlformats.org/drawingml/2006/main" noChangeAspect="1"/>
             </wp:cNvGraphicFramePr>
@@ -13648,7 +14343,7 @@
                     <pic:cNvPicPr/>
                   </pic:nvPicPr>
                   <pic:blipFill>
-                    <a:blip r:embed="rId20"/>
+                    <a:blip r:embed="rId24"/>
                     <a:stretch>
                       <a:fillRect/>
                     </a:stretch>
@@ -14151,10 +14846,10 @@
           <w:noProof/>
         </w:rPr>
         <w:drawing>
-          <wp:inline distT="0" distB="0" distL="0" distR="0" wp14:anchorId="6C8DB678" wp14:editId="139E0BF0">
+          <wp:inline distT="0" distB="0" distL="0" distR="0" wp14:anchorId="7B7C4952" wp14:editId="6A15B9A3">
             <wp:extent cx="5303520" cy="2272937"/>
             <wp:effectExtent l="0" t="0" r="0" b="0"/>
-            <wp:docPr id="13" name="Picture 13"/>
+            <wp:docPr id="17" name="Picture 17"/>
             <wp:cNvGraphicFramePr>
               <a:graphicFrameLocks xmlns:a="http://schemas.openxmlformats.org/drawingml/2006/main" noChangeAspect="1"/>
             </wp:cNvGraphicFramePr>
@@ -14166,7 +14861,7 @@
                     <pic:cNvPicPr/>
                   </pic:nvPicPr>
                   <pic:blipFill>
-                    <a:blip r:embed="rId21"/>
+                    <a:blip r:embed="rId25"/>
                     <a:stretch>
                       <a:fillRect/>
                     </a:stretch>
@@ -14609,10 +15304,10 @@
           <w:noProof/>
         </w:rPr>
         <w:drawing>
-          <wp:inline distT="0" distB="0" distL="0" distR="0" wp14:anchorId="313CB0DC" wp14:editId="0059A405">
+          <wp:inline distT="0" distB="0" distL="0" distR="0" wp14:anchorId="5E7F8857" wp14:editId="5D9E618C">
             <wp:extent cx="5303520" cy="2339788"/>
             <wp:effectExtent l="0" t="0" r="0" b="0"/>
-            <wp:docPr id="14" name="Picture 14"/>
+            <wp:docPr id="18" name="Picture 18"/>
             <wp:cNvGraphicFramePr>
               <a:graphicFrameLocks xmlns:a="http://schemas.openxmlformats.org/drawingml/2006/main" noChangeAspect="1"/>
             </wp:cNvGraphicFramePr>
@@ -14624,7 +15319,7 @@
                     <pic:cNvPicPr/>
                   </pic:nvPicPr>
                   <pic:blipFill>
-                    <a:blip r:embed="rId22"/>
+                    <a:blip r:embed="rId26"/>
                     <a:stretch>
                       <a:fillRect/>
                     </a:stretch>
@@ -14680,10 +15375,10 @@
         </w:rPr>
         <w:lastRenderedPageBreak/>
         <w:drawing>
-          <wp:inline distT="0" distB="0" distL="0" distR="0" wp14:anchorId="09F5FADC" wp14:editId="3CA56F63">
+          <wp:inline distT="0" distB="0" distL="0" distR="0" wp14:anchorId="20111FF0" wp14:editId="4C02F920">
             <wp:extent cx="5303520" cy="1988820"/>
             <wp:effectExtent l="0" t="0" r="0" b="0"/>
-            <wp:docPr id="15" name="Picture 15"/>
+            <wp:docPr id="19" name="Picture 19"/>
             <wp:cNvGraphicFramePr>
               <a:graphicFrameLocks xmlns:a="http://schemas.openxmlformats.org/drawingml/2006/main" noChangeAspect="1"/>
             </wp:cNvGraphicFramePr>
@@ -14695,7 +15390,7 @@
                     <pic:cNvPicPr/>
                   </pic:nvPicPr>
                   <pic:blipFill>
-                    <a:blip r:embed="rId23"/>
+                    <a:blip r:embed="rId27"/>
                     <a:stretch>
                       <a:fillRect/>
                     </a:stretch>
@@ -15231,7 +15926,7 @@
       <w:pPr>
         <w:pStyle w:val="Heading2"/>
       </w:pPr>
-      <w:bookmarkStart w:id="50" w:name="_Toc243341735"/>
+      <w:bookmarkStart w:id="50" w:name="_Toc243342806"/>
       <w:r>
         <w:rPr>
           <w:rFonts w:ascii="Times New Roman" w:hAnsi="Times New Roman"/>
@@ -15311,7 +16006,7 @@
       <w:pPr>
         <w:pStyle w:val="Heading2"/>
       </w:pPr>
-      <w:bookmarkStart w:id="51" w:name="_Toc243341736"/>
+      <w:bookmarkStart w:id="51" w:name="_Toc243342807"/>
       <w:r>
         <w:rPr>
           <w:rFonts w:ascii="Times New Roman" w:hAnsi="Times New Roman"/>
@@ -15905,16 +16600,12 @@
     </w:tbl>
     <w:p/>
     <w:p>
-      <w:r>
-        <w:br w:type="page"/>
-      </w:r>
-    </w:p>
-    <w:p>
       <w:pPr>
         <w:pStyle w:val="Heading1"/>
+        <w:pageBreakBefore/>
         <w:jc w:val="center"/>
       </w:pPr>
-      <w:bookmarkStart w:id="52" w:name="_Toc243341737"/>
+      <w:bookmarkStart w:id="52" w:name="_Toc243342808"/>
       <w:r>
         <w:rPr>
           <w:rFonts w:ascii="Times New Roman" w:hAnsi="Times New Roman"/>
@@ -15943,7 +16634,7 @@
       <w:pPr>
         <w:pStyle w:val="Heading2"/>
       </w:pPr>
-      <w:bookmarkStart w:id="53" w:name="_Toc243341738"/>
+      <w:bookmarkStart w:id="53" w:name="_Toc243342809"/>
       <w:r>
         <w:rPr>
           <w:rFonts w:ascii="Times New Roman" w:hAnsi="Times New Roman"/>
@@ -16007,7 +16698,7 @@
       <w:pPr>
         <w:pStyle w:val="Heading2"/>
       </w:pPr>
-      <w:bookmarkStart w:id="54" w:name="_Toc243341739"/>
+      <w:bookmarkStart w:id="54" w:name="_Toc243342810"/>
       <w:r>
         <w:rPr>
           <w:rFonts w:ascii="Times New Roman" w:hAnsi="Times New Roman"/>
@@ -16059,7 +16750,7 @@
         <w:pStyle w:val="Heading1"/>
         <w:jc w:val="center"/>
       </w:pPr>
-      <w:bookmarkStart w:id="55" w:name="_Toc243341740"/>
+      <w:bookmarkStart w:id="55" w:name="_Toc243342811"/>
       <w:r>
         <w:rPr>
           <w:rFonts w:ascii="Times New Roman" w:hAnsi="Times New Roman"/>
@@ -16287,7 +16978,7 @@
         <w:pStyle w:val="Heading1"/>
         <w:jc w:val="center"/>
       </w:pPr>
-      <w:bookmarkStart w:id="56" w:name="_Toc243341741"/>
+      <w:bookmarkStart w:id="56" w:name="_Toc243342812"/>
       <w:r>
         <w:rPr>
           <w:rFonts w:ascii="Times New Roman" w:hAnsi="Times New Roman"/>
@@ -16303,7 +16994,7 @@
       <w:pPr>
         <w:pStyle w:val="Heading2"/>
       </w:pPr>
-      <w:bookmarkStart w:id="57" w:name="_Toc243341742"/>
+      <w:bookmarkStart w:id="57" w:name="_Toc243342813"/>
       <w:r>
         <w:rPr>
           <w:rFonts w:ascii="Times New Roman" w:hAnsi="Times New Roman"/>
@@ -16333,7 +17024,7 @@
       <w:pPr>
         <w:pStyle w:val="Heading2"/>
       </w:pPr>
-      <w:bookmarkStart w:id="58" w:name="_Toc243341743"/>
+      <w:bookmarkStart w:id="58" w:name="_Toc243342814"/>
       <w:r>
         <w:rPr>
           <w:rFonts w:ascii="Times New Roman" w:hAnsi="Times New Roman"/>
@@ -16437,7 +17128,7 @@
       <w:pPr>
         <w:pStyle w:val="Heading2"/>
       </w:pPr>
-      <w:bookmarkStart w:id="59" w:name="_Toc243341744"/>
+      <w:bookmarkStart w:id="59" w:name="_Toc243342815"/>
       <w:r>
         <w:rPr>
           <w:rFonts w:ascii="Times New Roman" w:hAnsi="Times New Roman"/>
@@ -16541,7 +17232,7 @@
       <w:pPr>
         <w:pStyle w:val="Heading2"/>
       </w:pPr>
-      <w:bookmarkStart w:id="60" w:name="_Toc243341745"/>
+      <w:bookmarkStart w:id="60" w:name="_Toc243342816"/>
       <w:r>
         <w:rPr>
           <w:rFonts w:ascii="Times New Roman" w:hAnsi="Times New Roman"/>
@@ -16699,7 +17390,7 @@
       <w:pPr>
         <w:pStyle w:val="Heading2"/>
       </w:pPr>
-      <w:bookmarkStart w:id="61" w:name="_Toc243341746"/>
+      <w:bookmarkStart w:id="61" w:name="_Toc243342817"/>
       <w:r>
         <w:rPr>
           <w:rFonts w:ascii="Times New Roman" w:hAnsi="Times New Roman"/>
@@ -16947,7 +17638,7 @@
       <w:pPr>
         <w:pStyle w:val="Heading2"/>
       </w:pPr>
-      <w:bookmarkStart w:id="62" w:name="_Toc243341747"/>
+      <w:bookmarkStart w:id="62" w:name="_Toc243342818"/>
       <w:r>
         <w:rPr>
           <w:rFonts w:ascii="Times New Roman" w:hAnsi="Times New Roman"/>
@@ -17099,7 +17790,7 @@
       <w:pPr>
         <w:pStyle w:val="Heading2"/>
       </w:pPr>
-      <w:bookmarkStart w:id="63" w:name="_Toc243341748"/>
+      <w:bookmarkStart w:id="63" w:name="_Toc243342819"/>
       <w:r>
         <w:rPr>
           <w:rFonts w:ascii="Times New Roman" w:hAnsi="Times New Roman"/>
@@ -17264,7 +17955,7 @@
       <w:pPr>
         <w:pStyle w:val="Heading2"/>
       </w:pPr>
-      <w:bookmarkStart w:id="64" w:name="_Toc243341749"/>
+      <w:bookmarkStart w:id="64" w:name="_Toc243342820"/>
       <w:r>
         <w:rPr>
           <w:rFonts w:ascii="Times New Roman" w:hAnsi="Times New Roman"/>
@@ -17445,7 +18136,7 @@
       <w:pPr>
         <w:pStyle w:val="Heading2"/>
       </w:pPr>
-      <w:bookmarkStart w:id="65" w:name="_Toc243341750"/>
+      <w:bookmarkStart w:id="65" w:name="_Toc243342821"/>
       <w:r>
         <w:rPr>
           <w:rFonts w:ascii="Times New Roman" w:hAnsi="Times New Roman"/>
@@ -17585,7 +18276,7 @@
       <w:pPr>
         <w:pStyle w:val="Heading2"/>
       </w:pPr>
-      <w:bookmarkStart w:id="66" w:name="_Toc243341751"/>
+      <w:bookmarkStart w:id="66" w:name="_Toc243342822"/>
       <w:r>
         <w:rPr>
           <w:rFonts w:ascii="Times New Roman" w:hAnsi="Times New Roman"/>
@@ -17774,7 +18465,7 @@
       <w:pPr>
         <w:pStyle w:val="Heading2"/>
       </w:pPr>
-      <w:bookmarkStart w:id="67" w:name="_Toc243341752"/>
+      <w:bookmarkStart w:id="67" w:name="_Toc243342823"/>
       <w:r>
         <w:rPr>
           <w:rFonts w:ascii="Times New Roman" w:hAnsi="Times New Roman"/>
@@ -17926,7 +18617,7 @@
       <w:pPr>
         <w:pStyle w:val="Heading2"/>
       </w:pPr>
-      <w:bookmarkStart w:id="68" w:name="_Toc243341753"/>
+      <w:bookmarkStart w:id="68" w:name="_Toc243342824"/>
       <w:r>
         <w:rPr>
           <w:rFonts w:ascii="Times New Roman" w:hAnsi="Times New Roman"/>
@@ -18090,7 +18781,7 @@
       <w:pPr>
         <w:pStyle w:val="Heading2"/>
       </w:pPr>
-      <w:bookmarkStart w:id="69" w:name="_Toc243341754"/>
+      <w:bookmarkStart w:id="69" w:name="_Toc243342825"/>
       <w:r>
         <w:rPr>
           <w:rFonts w:ascii="Times New Roman" w:hAnsi="Times New Roman"/>
@@ -18284,7 +18975,7 @@
       <w:pPr>
         <w:pStyle w:val="Heading2"/>
       </w:pPr>
-      <w:bookmarkStart w:id="70" w:name="_Toc243341755"/>
+      <w:bookmarkStart w:id="70" w:name="_Toc243342826"/>
       <w:r>
         <w:rPr>
           <w:rFonts w:ascii="Times New Roman" w:hAnsi="Times New Roman"/>
@@ -18424,7 +19115,7 @@
       <w:pPr>
         <w:pStyle w:val="Heading2"/>
       </w:pPr>
-      <w:bookmarkStart w:id="71" w:name="_Toc243341756"/>
+      <w:bookmarkStart w:id="71" w:name="_Toc243342827"/>
       <w:r>
         <w:rPr>
           <w:rFonts w:ascii="Times New Roman" w:hAnsi="Times New Roman"/>
@@ -18624,7 +19315,7 @@
       <w:pPr>
         <w:pStyle w:val="Heading2"/>
       </w:pPr>
-      <w:bookmarkStart w:id="72" w:name="_Toc243341757"/>
+      <w:bookmarkStart w:id="72" w:name="_Toc243342828"/>
       <w:r>
         <w:rPr>
           <w:rFonts w:ascii="Times New Roman" w:hAnsi="Times New Roman"/>
@@ -18703,7 +19394,7 @@
       <w:pPr>
         <w:pStyle w:val="Heading2"/>
       </w:pPr>
-      <w:bookmarkStart w:id="73" w:name="_Toc243341758"/>
+      <w:bookmarkStart w:id="73" w:name="_Toc243342829"/>
       <w:r>
         <w:rPr>
           <w:rFonts w:ascii="Times New Roman" w:hAnsi="Times New Roman"/>
@@ -18767,7 +19458,7 @@
       <w:pPr>
         <w:pStyle w:val="Heading2"/>
       </w:pPr>
-      <w:bookmarkStart w:id="74" w:name="_Toc243341759"/>
+      <w:bookmarkStart w:id="74" w:name="_Toc243342830"/>
       <w:r>
         <w:rPr>
           <w:rFonts w:ascii="Times New Roman" w:hAnsi="Times New Roman"/>
@@ -18837,7 +19528,7 @@
       <w:pPr>
         <w:pStyle w:val="Heading2"/>
       </w:pPr>
-      <w:bookmarkStart w:id="75" w:name="_Toc243341760"/>
+      <w:bookmarkStart w:id="75" w:name="_Toc243342831"/>
       <w:r>
         <w:rPr>
           <w:rFonts w:ascii="Times New Roman" w:hAnsi="Times New Roman"/>
@@ -19038,7 +19729,7 @@
       <w:pPr>
         <w:pStyle w:val="Heading2"/>
       </w:pPr>
-      <w:bookmarkStart w:id="76" w:name="_Toc243341761"/>
+      <w:bookmarkStart w:id="76" w:name="_Toc243342832"/>
       <w:r>
         <w:rPr>
           <w:rFonts w:ascii="Times New Roman" w:hAnsi="Times New Roman"/>
@@ -19262,7 +19953,7 @@
       <w:pPr>
         <w:pStyle w:val="Heading2"/>
       </w:pPr>
-      <w:bookmarkStart w:id="77" w:name="_Toc243341762"/>
+      <w:bookmarkStart w:id="77" w:name="_Toc243342833"/>
       <w:r>
         <w:rPr>
           <w:rFonts w:ascii="Times New Roman" w:hAnsi="Times New Roman"/>
@@ -19411,7 +20102,7 @@
       </w:pPr>
     </w:p>
     <w:sectPr>
-      <w:footerReference w:type="default" r:id="rId24"/>
+      <w:footerReference w:type="default" r:id="rId28"/>
       <w:pgSz w:w="12240" w:h="15840"/>
       <w:pgMar w:top="1440" w:right="1440" w:bottom="1440" w:left="2160" w:header="720" w:footer="720" w:gutter="0"/>
       <w:pgNumType w:start="1"/>
@@ -19697,31 +20388,31 @@
       </w:rPr>
     </w:lvl>
   </w:abstractNum>
-  <w:num w:numId="1" w16cid:durableId="1071781073">
+  <w:num w:numId="1" w16cid:durableId="2033913383">
     <w:abstractNumId w:val="8"/>
   </w:num>
-  <w:num w:numId="2" w16cid:durableId="2022245517">
+  <w:num w:numId="2" w16cid:durableId="1577084748">
     <w:abstractNumId w:val="6"/>
   </w:num>
-  <w:num w:numId="3" w16cid:durableId="684482906">
+  <w:num w:numId="3" w16cid:durableId="1145898456">
     <w:abstractNumId w:val="5"/>
   </w:num>
-  <w:num w:numId="4" w16cid:durableId="868445715">
+  <w:num w:numId="4" w16cid:durableId="1059935965">
     <w:abstractNumId w:val="4"/>
   </w:num>
-  <w:num w:numId="5" w16cid:durableId="1366365717">
+  <w:num w:numId="5" w16cid:durableId="241910485">
     <w:abstractNumId w:val="7"/>
   </w:num>
-  <w:num w:numId="6" w16cid:durableId="1638487096">
+  <w:num w:numId="6" w16cid:durableId="1692367002">
     <w:abstractNumId w:val="3"/>
   </w:num>
-  <w:num w:numId="7" w16cid:durableId="695470156">
+  <w:num w:numId="7" w16cid:durableId="1755853561">
     <w:abstractNumId w:val="2"/>
   </w:num>
-  <w:num w:numId="8" w16cid:durableId="971833848">
+  <w:num w:numId="8" w16cid:durableId="939340608">
     <w:abstractNumId w:val="1"/>
   </w:num>
-  <w:num w:numId="9" w16cid:durableId="416095261">
+  <w:num w:numId="9" w16cid:durableId="1887644975">
     <w:abstractNumId w:val="0"/>
   </w:num>
 </w:numbering>
@@ -31121,7 +31812,7 @@
     <w:autoRedefine/>
     <w:uiPriority w:val="39"/>
     <w:unhideWhenUsed/>
-    <w:rsid w:val="00B24E13"/>
+    <w:rsid w:val="00012CE8"/>
     <w:pPr>
       <w:spacing w:after="100"/>
     </w:pPr>
@@ -31133,7 +31824,7 @@
     <w:autoRedefine/>
     <w:uiPriority w:val="39"/>
     <w:unhideWhenUsed/>
-    <w:rsid w:val="00B24E13"/>
+    <w:rsid w:val="00012CE8"/>
     <w:pPr>
       <w:spacing w:after="100"/>
       <w:ind w:left="240"/>

</xml_diff>

<commit_message>
Add reproducible ML detector evaluation and results table
Evaluate the Isolation Forest probing detector over 200 seeded windows per
traffic class instead of a single demo run, and record the stable figures:
ROC-AUC 1.000 (aggressive) and 0.982 (throttled), 0.5% false-positive rate,
and 100% streaming detection at a median of ten requests for both attackers.
Add Table 5.11 and the accompanying analysis to the results chapter, making
the single-window vs streaming distinction explicit and honest.
</commit_message>
<xml_diff>
--- a/report/CyberTrace_Project_Report_Lakshay.docx
+++ b/report/CyberTrace_Project_Report_Lakshay.docx
@@ -11,7 +11,7 @@
           <w:noProof/>
         </w:rPr>
         <w:drawing>
-          <wp:inline distT="0" distB="0" distL="0" distR="0" wp14:anchorId="1ABD3A5D" wp14:editId="6874B868">
+          <wp:inline distT="0" distB="0" distL="0" distR="0" wp14:anchorId="29F6CF58" wp14:editId="7C7D2E32">
             <wp:extent cx="2560320" cy="816494"/>
             <wp:effectExtent l="0" t="0" r="0" b="0"/>
             <wp:docPr id="1" name="Picture 1"/>
@@ -646,7 +646,7 @@
           <w:noProof/>
           <w:webHidden/>
         </w:rPr>
-        <w:instrText xml:space="preserve"> PAGEREF _Toc243342756 \h </w:instrText>
+        <w:instrText xml:space="preserve"> PAGEREF _Toc243469982 \h </w:instrText>
       </w:r>
       <w:r>
         <w:rPr>
@@ -717,7 +717,7 @@
           <w:noProof/>
           <w:webHidden/>
         </w:rPr>
-        <w:instrText xml:space="preserve"> PAGEREF _Toc243342757 \h </w:instrText>
+        <w:instrText xml:space="preserve"> PAGEREF _Toc243469983 \h </w:instrText>
       </w:r>
       <w:r>
         <w:rPr>
@@ -788,7 +788,7 @@
           <w:noProof/>
           <w:webHidden/>
         </w:rPr>
-        <w:instrText xml:space="preserve"> PAGEREF _Toc243342758 \h </w:instrText>
+        <w:instrText xml:space="preserve"> PAGEREF _Toc243469984 \h </w:instrText>
       </w:r>
       <w:r>
         <w:rPr>
@@ -859,7 +859,7 @@
           <w:noProof/>
           <w:webHidden/>
         </w:rPr>
-        <w:instrText xml:space="preserve"> PAGEREF _Toc243342759 \h </w:instrText>
+        <w:instrText xml:space="preserve"> PAGEREF _Toc243469985 \h </w:instrText>
       </w:r>
       <w:r>
         <w:rPr>
@@ -930,7 +930,7 @@
           <w:noProof/>
           <w:webHidden/>
         </w:rPr>
-        <w:instrText xml:space="preserve"> PAGEREF _Toc243342760 \h </w:instrText>
+        <w:instrText xml:space="preserve"> PAGEREF _Toc243469986 \h </w:instrText>
       </w:r>
       <w:r>
         <w:rPr>
@@ -1001,7 +1001,7 @@
           <w:noProof/>
           <w:webHidden/>
         </w:rPr>
-        <w:instrText xml:space="preserve"> PAGEREF _Toc243342761 \h </w:instrText>
+        <w:instrText xml:space="preserve"> PAGEREF _Toc243469987 \h </w:instrText>
       </w:r>
       <w:r>
         <w:rPr>
@@ -1072,7 +1072,7 @@
           <w:noProof/>
           <w:webHidden/>
         </w:rPr>
-        <w:instrText xml:space="preserve"> PAGEREF _Toc243342762 \h </w:instrText>
+        <w:instrText xml:space="preserve"> PAGEREF _Toc243469988 \h </w:instrText>
       </w:r>
       <w:r>
         <w:rPr>
@@ -1143,7 +1143,7 @@
           <w:noProof/>
           <w:webHidden/>
         </w:rPr>
-        <w:instrText xml:space="preserve"> PAGEREF _Toc243342763 \h </w:instrText>
+        <w:instrText xml:space="preserve"> PAGEREF _Toc243469989 \h </w:instrText>
       </w:r>
       <w:r>
         <w:rPr>
@@ -1214,7 +1214,7 @@
           <w:noProof/>
           <w:webHidden/>
         </w:rPr>
-        <w:instrText xml:space="preserve"> PAGEREF _Toc243342764 \h </w:instrText>
+        <w:instrText xml:space="preserve"> PAGEREF _Toc243469990 \h </w:instrText>
       </w:r>
       <w:r>
         <w:rPr>
@@ -1285,7 +1285,7 @@
           <w:noProof/>
           <w:webHidden/>
         </w:rPr>
-        <w:instrText xml:space="preserve"> PAGEREF _Toc243342765 \h </w:instrText>
+        <w:instrText xml:space="preserve"> PAGEREF _Toc243469991 \h </w:instrText>
       </w:r>
       <w:r>
         <w:rPr>
@@ -1356,7 +1356,7 @@
           <w:noProof/>
           <w:webHidden/>
         </w:rPr>
-        <w:instrText xml:space="preserve"> PAGEREF _Toc243342766 \h </w:instrText>
+        <w:instrText xml:space="preserve"> PAGEREF _Toc243469992 \h </w:instrText>
       </w:r>
       <w:r>
         <w:rPr>
@@ -1427,7 +1427,7 @@
           <w:noProof/>
           <w:webHidden/>
         </w:rPr>
-        <w:instrText xml:space="preserve"> PAGEREF _Toc243342767 \h </w:instrText>
+        <w:instrText xml:space="preserve"> PAGEREF _Toc243469993 \h </w:instrText>
       </w:r>
       <w:r>
         <w:rPr>
@@ -1498,7 +1498,7 @@
           <w:noProof/>
           <w:webHidden/>
         </w:rPr>
-        <w:instrText xml:space="preserve"> PAGEREF _Toc243342768 \h </w:instrText>
+        <w:instrText xml:space="preserve"> PAGEREF _Toc243469994 \h </w:instrText>
       </w:r>
       <w:r>
         <w:rPr>
@@ -1569,7 +1569,7 @@
           <w:noProof/>
           <w:webHidden/>
         </w:rPr>
-        <w:instrText xml:space="preserve"> PAGEREF _Toc243342769 \h </w:instrText>
+        <w:instrText xml:space="preserve"> PAGEREF _Toc243469995 \h </w:instrText>
       </w:r>
       <w:r>
         <w:rPr>
@@ -1640,7 +1640,7 @@
           <w:noProof/>
           <w:webHidden/>
         </w:rPr>
-        <w:instrText xml:space="preserve"> PAGEREF _Toc243342770 \h </w:instrText>
+        <w:instrText xml:space="preserve"> PAGEREF _Toc243469996 \h </w:instrText>
       </w:r>
       <w:r>
         <w:rPr>
@@ -1711,7 +1711,7 @@
           <w:noProof/>
           <w:webHidden/>
         </w:rPr>
-        <w:instrText xml:space="preserve"> PAGEREF _Toc243342771 \h </w:instrText>
+        <w:instrText xml:space="preserve"> PAGEREF _Toc243469997 \h </w:instrText>
       </w:r>
       <w:r>
         <w:rPr>
@@ -1782,7 +1782,7 @@
           <w:noProof/>
           <w:webHidden/>
         </w:rPr>
-        <w:instrText xml:space="preserve"> PAGEREF _Toc243342772 \h </w:instrText>
+        <w:instrText xml:space="preserve"> PAGEREF _Toc243469998 \h </w:instrText>
       </w:r>
       <w:r>
         <w:rPr>
@@ -1853,7 +1853,7 @@
           <w:noProof/>
           <w:webHidden/>
         </w:rPr>
-        <w:instrText xml:space="preserve"> PAGEREF _Toc243342773 \h </w:instrText>
+        <w:instrText xml:space="preserve"> PAGEREF _Toc243469999 \h </w:instrText>
       </w:r>
       <w:r>
         <w:rPr>
@@ -1924,7 +1924,7 @@
           <w:noProof/>
           <w:webHidden/>
         </w:rPr>
-        <w:instrText xml:space="preserve"> PAGEREF _Toc243342774 \h </w:instrText>
+        <w:instrText xml:space="preserve"> PAGEREF _Toc243470000 \h </w:instrText>
       </w:r>
       <w:r>
         <w:rPr>
@@ -1995,7 +1995,7 @@
           <w:noProof/>
           <w:webHidden/>
         </w:rPr>
-        <w:instrText xml:space="preserve"> PAGEREF _Toc243342775 \h </w:instrText>
+        <w:instrText xml:space="preserve"> PAGEREF _Toc243470001 \h </w:instrText>
       </w:r>
       <w:r>
         <w:rPr>
@@ -2066,7 +2066,7 @@
           <w:noProof/>
           <w:webHidden/>
         </w:rPr>
-        <w:instrText xml:space="preserve"> PAGEREF _Toc243342776 \h </w:instrText>
+        <w:instrText xml:space="preserve"> PAGEREF _Toc243470002 \h </w:instrText>
       </w:r>
       <w:r>
         <w:rPr>
@@ -2137,7 +2137,7 @@
           <w:noProof/>
           <w:webHidden/>
         </w:rPr>
-        <w:instrText xml:space="preserve"> PAGEREF _Toc243342777 \h </w:instrText>
+        <w:instrText xml:space="preserve"> PAGEREF _Toc243470003 \h </w:instrText>
       </w:r>
       <w:r>
         <w:rPr>
@@ -2208,7 +2208,7 @@
           <w:noProof/>
           <w:webHidden/>
         </w:rPr>
-        <w:instrText xml:space="preserve"> PAGEREF _Toc243342778 \h </w:instrText>
+        <w:instrText xml:space="preserve"> PAGEREF _Toc243470004 \h </w:instrText>
       </w:r>
       <w:r>
         <w:rPr>
@@ -2280,7 +2280,7 @@
           <w:noProof/>
           <w:webHidden/>
         </w:rPr>
-        <w:instrText xml:space="preserve"> PAGEREF _Toc243342779 \h </w:instrText>
+        <w:instrText xml:space="preserve"> PAGEREF _Toc243470005 \h </w:instrText>
       </w:r>
       <w:r>
         <w:rPr>
@@ -2351,7 +2351,7 @@
           <w:noProof/>
           <w:webHidden/>
         </w:rPr>
-        <w:instrText xml:space="preserve"> PAGEREF _Toc243342780 \h </w:instrText>
+        <w:instrText xml:space="preserve"> PAGEREF _Toc243470006 \h </w:instrText>
       </w:r>
       <w:r>
         <w:rPr>
@@ -2422,7 +2422,7 @@
           <w:noProof/>
           <w:webHidden/>
         </w:rPr>
-        <w:instrText xml:space="preserve"> PAGEREF _Toc243342781 \h </w:instrText>
+        <w:instrText xml:space="preserve"> PAGEREF _Toc243470007 \h </w:instrText>
       </w:r>
       <w:r>
         <w:rPr>
@@ -2493,7 +2493,7 @@
           <w:noProof/>
           <w:webHidden/>
         </w:rPr>
-        <w:instrText xml:space="preserve"> PAGEREF _Toc243342782 \h </w:instrText>
+        <w:instrText xml:space="preserve"> PAGEREF _Toc243470008 \h </w:instrText>
       </w:r>
       <w:r>
         <w:rPr>
@@ -2564,7 +2564,7 @@
           <w:noProof/>
           <w:webHidden/>
         </w:rPr>
-        <w:instrText xml:space="preserve"> PAGEREF _Toc243342783 \h </w:instrText>
+        <w:instrText xml:space="preserve"> PAGEREF _Toc243470009 \h </w:instrText>
       </w:r>
       <w:r>
         <w:rPr>
@@ -2635,7 +2635,7 @@
           <w:noProof/>
           <w:webHidden/>
         </w:rPr>
-        <w:instrText xml:space="preserve"> PAGEREF _Toc243342784 \h </w:instrText>
+        <w:instrText xml:space="preserve"> PAGEREF _Toc243470010 \h </w:instrText>
       </w:r>
       <w:r>
         <w:rPr>
@@ -2706,7 +2706,7 @@
           <w:noProof/>
           <w:webHidden/>
         </w:rPr>
-        <w:instrText xml:space="preserve"> PAGEREF _Toc243342785 \h </w:instrText>
+        <w:instrText xml:space="preserve"> PAGEREF _Toc243470011 \h </w:instrText>
       </w:r>
       <w:r>
         <w:rPr>
@@ -2777,7 +2777,7 @@
           <w:noProof/>
           <w:webHidden/>
         </w:rPr>
-        <w:instrText xml:space="preserve"> PAGEREF _Toc243342786 \h </w:instrText>
+        <w:instrText xml:space="preserve"> PAGEREF _Toc243470012 \h </w:instrText>
       </w:r>
       <w:r>
         <w:rPr>
@@ -2848,7 +2848,7 @@
           <w:noProof/>
           <w:webHidden/>
         </w:rPr>
-        <w:instrText xml:space="preserve"> PAGEREF _Toc243342787 \h </w:instrText>
+        <w:instrText xml:space="preserve"> PAGEREF _Toc243470013 \h </w:instrText>
       </w:r>
       <w:r>
         <w:rPr>
@@ -2919,7 +2919,7 @@
           <w:noProof/>
           <w:webHidden/>
         </w:rPr>
-        <w:instrText xml:space="preserve"> PAGEREF _Toc243342788 \h </w:instrText>
+        <w:instrText xml:space="preserve"> PAGEREF _Toc243470014 \h </w:instrText>
       </w:r>
       <w:r>
         <w:rPr>
@@ -2990,7 +2990,7 @@
           <w:noProof/>
           <w:webHidden/>
         </w:rPr>
-        <w:instrText xml:space="preserve"> PAGEREF _Toc243342789 \h </w:instrText>
+        <w:instrText xml:space="preserve"> PAGEREF _Toc243470015 \h </w:instrText>
       </w:r>
       <w:r>
         <w:rPr>
@@ -3061,7 +3061,7 @@
           <w:noProof/>
           <w:webHidden/>
         </w:rPr>
-        <w:instrText xml:space="preserve"> PAGEREF _Toc243342790 \h </w:instrText>
+        <w:instrText xml:space="preserve"> PAGEREF _Toc243470016 \h </w:instrText>
       </w:r>
       <w:r>
         <w:rPr>
@@ -3132,7 +3132,7 @@
           <w:noProof/>
           <w:webHidden/>
         </w:rPr>
-        <w:instrText xml:space="preserve"> PAGEREF _Toc243342791 \h </w:instrText>
+        <w:instrText xml:space="preserve"> PAGEREF _Toc243470017 \h </w:instrText>
       </w:r>
       <w:r>
         <w:rPr>
@@ -3203,7 +3203,7 @@
           <w:noProof/>
           <w:webHidden/>
         </w:rPr>
-        <w:instrText xml:space="preserve"> PAGEREF _Toc243342792 \h </w:instrText>
+        <w:instrText xml:space="preserve"> PAGEREF _Toc243470018 \h </w:instrText>
       </w:r>
       <w:r>
         <w:rPr>
@@ -3274,7 +3274,7 @@
           <w:noProof/>
           <w:webHidden/>
         </w:rPr>
-        <w:instrText xml:space="preserve"> PAGEREF _Toc243342793 \h </w:instrText>
+        <w:instrText xml:space="preserve"> PAGEREF _Toc243470019 \h </w:instrText>
       </w:r>
       <w:r>
         <w:rPr>
@@ -3345,7 +3345,7 @@
           <w:noProof/>
           <w:webHidden/>
         </w:rPr>
-        <w:instrText xml:space="preserve"> PAGEREF _Toc243342794 \h </w:instrText>
+        <w:instrText xml:space="preserve"> PAGEREF _Toc243470020 \h </w:instrText>
       </w:r>
       <w:r>
         <w:rPr>
@@ -3416,7 +3416,7 @@
           <w:noProof/>
           <w:webHidden/>
         </w:rPr>
-        <w:instrText xml:space="preserve"> PAGEREF _Toc243342795 \h </w:instrText>
+        <w:instrText xml:space="preserve"> PAGEREF _Toc243470021 \h </w:instrText>
       </w:r>
       <w:r>
         <w:rPr>
@@ -3487,7 +3487,7 @@
           <w:noProof/>
           <w:webHidden/>
         </w:rPr>
-        <w:instrText xml:space="preserve"> PAGEREF _Toc243342796 \h </w:instrText>
+        <w:instrText xml:space="preserve"> PAGEREF _Toc243470022 \h </w:instrText>
       </w:r>
       <w:r>
         <w:rPr>
@@ -3558,7 +3558,7 @@
           <w:noProof/>
           <w:webHidden/>
         </w:rPr>
-        <w:instrText xml:space="preserve"> PAGEREF _Toc243342797 \h </w:instrText>
+        <w:instrText xml:space="preserve"> PAGEREF _Toc243470023 \h </w:instrText>
       </w:r>
       <w:r>
         <w:rPr>
@@ -3629,7 +3629,7 @@
           <w:noProof/>
           <w:webHidden/>
         </w:rPr>
-        <w:instrText xml:space="preserve"> PAGEREF _Toc243342798 \h </w:instrText>
+        <w:instrText xml:space="preserve"> PAGEREF _Toc243470024 \h </w:instrText>
       </w:r>
       <w:r>
         <w:rPr>
@@ -3700,7 +3700,7 @@
           <w:noProof/>
           <w:webHidden/>
         </w:rPr>
-        <w:instrText xml:space="preserve"> PAGEREF _Toc243342799 \h </w:instrText>
+        <w:instrText xml:space="preserve"> PAGEREF _Toc243470025 \h </w:instrText>
       </w:r>
       <w:r>
         <w:rPr>
@@ -3771,7 +3771,7 @@
           <w:noProof/>
           <w:webHidden/>
         </w:rPr>
-        <w:instrText xml:space="preserve"> PAGEREF _Toc243342800 \h </w:instrText>
+        <w:instrText xml:space="preserve"> PAGEREF _Toc243470026 \h </w:instrText>
       </w:r>
       <w:r>
         <w:rPr>
@@ -3842,7 +3842,7 @@
           <w:noProof/>
           <w:webHidden/>
         </w:rPr>
-        <w:instrText xml:space="preserve"> PAGEREF _Toc243342801 \h </w:instrText>
+        <w:instrText xml:space="preserve"> PAGEREF _Toc243470027 \h </w:instrText>
       </w:r>
       <w:r>
         <w:rPr>
@@ -3913,7 +3913,7 @@
           <w:noProof/>
           <w:webHidden/>
         </w:rPr>
-        <w:instrText xml:space="preserve"> PAGEREF _Toc243342802 \h </w:instrText>
+        <w:instrText xml:space="preserve"> PAGEREF _Toc243470028 \h </w:instrText>
       </w:r>
       <w:r>
         <w:rPr>
@@ -3984,7 +3984,7 @@
           <w:noProof/>
           <w:webHidden/>
         </w:rPr>
-        <w:instrText xml:space="preserve"> PAGEREF _Toc243342803 \h </w:instrText>
+        <w:instrText xml:space="preserve"> PAGEREF _Toc243470029 \h </w:instrText>
       </w:r>
       <w:r>
         <w:rPr>
@@ -4056,7 +4056,7 @@
           <w:noProof/>
           <w:webHidden/>
         </w:rPr>
-        <w:instrText xml:space="preserve"> PAGEREF _Toc243342804 \h </w:instrText>
+        <w:instrText xml:space="preserve"> PAGEREF _Toc243470030 \h </w:instrText>
       </w:r>
       <w:r>
         <w:rPr>
@@ -4127,7 +4127,7 @@
           <w:noProof/>
           <w:webHidden/>
         </w:rPr>
-        <w:instrText xml:space="preserve"> PAGEREF _Toc243342805 \h </w:instrText>
+        <w:instrText xml:space="preserve"> PAGEREF _Toc243470031 \h </w:instrText>
       </w:r>
       <w:r>
         <w:rPr>
@@ -4147,7 +4147,7 @@
           <w:noProof/>
           <w:webHidden/>
         </w:rPr>
-        <w:t>37</w:t>
+        <w:t>38</w:t>
       </w:r>
       <w:r>
         <w:rPr>
@@ -4198,7 +4198,7 @@
           <w:noProof/>
           <w:webHidden/>
         </w:rPr>
-        <w:instrText xml:space="preserve"> PAGEREF _Toc243342806 \h </w:instrText>
+        <w:instrText xml:space="preserve"> PAGEREF _Toc243470032 \h </w:instrText>
       </w:r>
       <w:r>
         <w:rPr>
@@ -4218,7 +4218,7 @@
           <w:noProof/>
           <w:webHidden/>
         </w:rPr>
-        <w:t>42</w:t>
+        <w:t>43</w:t>
       </w:r>
       <w:r>
         <w:rPr>
@@ -4269,7 +4269,7 @@
           <w:noProof/>
           <w:webHidden/>
         </w:rPr>
-        <w:instrText xml:space="preserve"> PAGEREF _Toc243342807 \h </w:instrText>
+        <w:instrText xml:space="preserve"> PAGEREF _Toc243470033 \h </w:instrText>
       </w:r>
       <w:r>
         <w:rPr>
@@ -4289,7 +4289,7 @@
           <w:noProof/>
           <w:webHidden/>
         </w:rPr>
-        <w:t>44</w:t>
+        <w:t>45</w:t>
       </w:r>
       <w:r>
         <w:rPr>
@@ -4340,7 +4340,7 @@
           <w:noProof/>
           <w:webHidden/>
         </w:rPr>
-        <w:instrText xml:space="preserve"> PAGEREF _Toc243342808 \h </w:instrText>
+        <w:instrText xml:space="preserve"> PAGEREF _Toc243470034 \h </w:instrText>
       </w:r>
       <w:r>
         <w:rPr>
@@ -4360,7 +4360,7 @@
           <w:noProof/>
           <w:webHidden/>
         </w:rPr>
-        <w:t>46</w:t>
+        <w:t>47</w:t>
       </w:r>
       <w:r>
         <w:rPr>
@@ -4411,7 +4411,7 @@
           <w:noProof/>
           <w:webHidden/>
         </w:rPr>
-        <w:instrText xml:space="preserve"> PAGEREF _Toc243342809 \h </w:instrText>
+        <w:instrText xml:space="preserve"> PAGEREF _Toc243470035 \h </w:instrText>
       </w:r>
       <w:r>
         <w:rPr>
@@ -4431,7 +4431,7 @@
           <w:noProof/>
           <w:webHidden/>
         </w:rPr>
-        <w:t>46</w:t>
+        <w:t>47</w:t>
       </w:r>
       <w:r>
         <w:rPr>
@@ -4482,7 +4482,7 @@
           <w:noProof/>
           <w:webHidden/>
         </w:rPr>
-        <w:instrText xml:space="preserve"> PAGEREF _Toc243342810 \h </w:instrText>
+        <w:instrText xml:space="preserve"> PAGEREF _Toc243470036 \h </w:instrText>
       </w:r>
       <w:r>
         <w:rPr>
@@ -4502,7 +4502,7 @@
           <w:noProof/>
           <w:webHidden/>
         </w:rPr>
-        <w:t>47</w:t>
+        <w:t>48</w:t>
       </w:r>
       <w:r>
         <w:rPr>
@@ -4553,7 +4553,7 @@
           <w:noProof/>
           <w:webHidden/>
         </w:rPr>
-        <w:instrText xml:space="preserve"> PAGEREF _Toc243342811 \h </w:instrText>
+        <w:instrText xml:space="preserve"> PAGEREF _Toc243470037 \h </w:instrText>
       </w:r>
       <w:r>
         <w:rPr>
@@ -4573,7 +4573,7 @@
           <w:noProof/>
           <w:webHidden/>
         </w:rPr>
-        <w:t>49</w:t>
+        <w:t>50</w:t>
       </w:r>
       <w:r>
         <w:rPr>
@@ -4624,7 +4624,7 @@
           <w:noProof/>
           <w:webHidden/>
         </w:rPr>
-        <w:instrText xml:space="preserve"> PAGEREF _Toc243342812 \h </w:instrText>
+        <w:instrText xml:space="preserve"> PAGEREF _Toc243470038 \h </w:instrText>
       </w:r>
       <w:r>
         <w:rPr>
@@ -4644,7 +4644,7 @@
           <w:noProof/>
           <w:webHidden/>
         </w:rPr>
-        <w:t>51</w:t>
+        <w:t>52</w:t>
       </w:r>
       <w:r>
         <w:rPr>
@@ -4695,7 +4695,7 @@
           <w:noProof/>
           <w:webHidden/>
         </w:rPr>
-        <w:instrText xml:space="preserve"> PAGEREF _Toc243342813 \h </w:instrText>
+        <w:instrText xml:space="preserve"> PAGEREF _Toc243470039 \h </w:instrText>
       </w:r>
       <w:r>
         <w:rPr>
@@ -4715,7 +4715,7 @@
           <w:noProof/>
           <w:webHidden/>
         </w:rPr>
-        <w:t>51</w:t>
+        <w:t>52</w:t>
       </w:r>
       <w:r>
         <w:rPr>
@@ -4766,7 +4766,7 @@
           <w:noProof/>
           <w:webHidden/>
         </w:rPr>
-        <w:instrText xml:space="preserve"> PAGEREF _Toc243342814 \h </w:instrText>
+        <w:instrText xml:space="preserve"> PAGEREF _Toc243470040 \h </w:instrText>
       </w:r>
       <w:r>
         <w:rPr>
@@ -4786,7 +4786,7 @@
           <w:noProof/>
           <w:webHidden/>
         </w:rPr>
-        <w:t>51</w:t>
+        <w:t>52</w:t>
       </w:r>
       <w:r>
         <w:rPr>
@@ -4837,7 +4837,7 @@
           <w:noProof/>
           <w:webHidden/>
         </w:rPr>
-        <w:instrText xml:space="preserve"> PAGEREF _Toc243342815 \h </w:instrText>
+        <w:instrText xml:space="preserve"> PAGEREF _Toc243470041 \h </w:instrText>
       </w:r>
       <w:r>
         <w:rPr>
@@ -4857,7 +4857,7 @@
           <w:noProof/>
           <w:webHidden/>
         </w:rPr>
-        <w:t>51</w:t>
+        <w:t>52</w:t>
       </w:r>
       <w:r>
         <w:rPr>
@@ -4908,7 +4908,7 @@
           <w:noProof/>
           <w:webHidden/>
         </w:rPr>
-        <w:instrText xml:space="preserve"> PAGEREF _Toc243342816 \h </w:instrText>
+        <w:instrText xml:space="preserve"> PAGEREF _Toc243470042 \h </w:instrText>
       </w:r>
       <w:r>
         <w:rPr>
@@ -4928,7 +4928,7 @@
           <w:noProof/>
           <w:webHidden/>
         </w:rPr>
-        <w:t>52</w:t>
+        <w:t>53</w:t>
       </w:r>
       <w:r>
         <w:rPr>
@@ -4979,7 +4979,7 @@
           <w:noProof/>
           <w:webHidden/>
         </w:rPr>
-        <w:instrText xml:space="preserve"> PAGEREF _Toc243342817 \h </w:instrText>
+        <w:instrText xml:space="preserve"> PAGEREF _Toc243470043 \h </w:instrText>
       </w:r>
       <w:r>
         <w:rPr>
@@ -4999,7 +4999,7 @@
           <w:noProof/>
           <w:webHidden/>
         </w:rPr>
-        <w:t>52</w:t>
+        <w:t>53</w:t>
       </w:r>
       <w:r>
         <w:rPr>
@@ -5050,7 +5050,7 @@
           <w:noProof/>
           <w:webHidden/>
         </w:rPr>
-        <w:instrText xml:space="preserve"> PAGEREF _Toc243342818 \h </w:instrText>
+        <w:instrText xml:space="preserve"> PAGEREF _Toc243470044 \h </w:instrText>
       </w:r>
       <w:r>
         <w:rPr>
@@ -5070,7 +5070,7 @@
           <w:noProof/>
           <w:webHidden/>
         </w:rPr>
-        <w:t>52</w:t>
+        <w:t>53</w:t>
       </w:r>
       <w:r>
         <w:rPr>
@@ -5121,7 +5121,7 @@
           <w:noProof/>
           <w:webHidden/>
         </w:rPr>
-        <w:instrText xml:space="preserve"> PAGEREF _Toc243342819 \h </w:instrText>
+        <w:instrText xml:space="preserve"> PAGEREF _Toc243470045 \h </w:instrText>
       </w:r>
       <w:r>
         <w:rPr>
@@ -5141,7 +5141,7 @@
           <w:noProof/>
           <w:webHidden/>
         </w:rPr>
-        <w:t>53</w:t>
+        <w:t>54</w:t>
       </w:r>
       <w:r>
         <w:rPr>
@@ -5192,7 +5192,7 @@
           <w:noProof/>
           <w:webHidden/>
         </w:rPr>
-        <w:instrText xml:space="preserve"> PAGEREF _Toc243342820 \h </w:instrText>
+        <w:instrText xml:space="preserve"> PAGEREF _Toc243470046 \h </w:instrText>
       </w:r>
       <w:r>
         <w:rPr>
@@ -5212,7 +5212,7 @@
           <w:noProof/>
           <w:webHidden/>
         </w:rPr>
-        <w:t>53</w:t>
+        <w:t>54</w:t>
       </w:r>
       <w:r>
         <w:rPr>
@@ -5263,7 +5263,7 @@
           <w:noProof/>
           <w:webHidden/>
         </w:rPr>
-        <w:instrText xml:space="preserve"> PAGEREF _Toc243342821 \h </w:instrText>
+        <w:instrText xml:space="preserve"> PAGEREF _Toc243470047 \h </w:instrText>
       </w:r>
       <w:r>
         <w:rPr>
@@ -5283,7 +5283,7 @@
           <w:noProof/>
           <w:webHidden/>
         </w:rPr>
-        <w:t>53</w:t>
+        <w:t>54</w:t>
       </w:r>
       <w:r>
         <w:rPr>
@@ -5334,7 +5334,7 @@
           <w:noProof/>
           <w:webHidden/>
         </w:rPr>
-        <w:instrText xml:space="preserve"> PAGEREF _Toc243342822 \h </w:instrText>
+        <w:instrText xml:space="preserve"> PAGEREF _Toc243470048 \h </w:instrText>
       </w:r>
       <w:r>
         <w:rPr>
@@ -5354,7 +5354,7 @@
           <w:noProof/>
           <w:webHidden/>
         </w:rPr>
-        <w:t>53</w:t>
+        <w:t>54</w:t>
       </w:r>
       <w:r>
         <w:rPr>
@@ -5405,7 +5405,7 @@
           <w:noProof/>
           <w:webHidden/>
         </w:rPr>
-        <w:instrText xml:space="preserve"> PAGEREF _Toc243342823 \h </w:instrText>
+        <w:instrText xml:space="preserve"> PAGEREF _Toc243470049 \h </w:instrText>
       </w:r>
       <w:r>
         <w:rPr>
@@ -5425,7 +5425,7 @@
           <w:noProof/>
           <w:webHidden/>
         </w:rPr>
-        <w:t>54</w:t>
+        <w:t>55</w:t>
       </w:r>
       <w:r>
         <w:rPr>
@@ -5476,7 +5476,7 @@
           <w:noProof/>
           <w:webHidden/>
         </w:rPr>
-        <w:instrText xml:space="preserve"> PAGEREF _Toc243342824 \h </w:instrText>
+        <w:instrText xml:space="preserve"> PAGEREF _Toc243470050 \h </w:instrText>
       </w:r>
       <w:r>
         <w:rPr>
@@ -5496,7 +5496,7 @@
           <w:noProof/>
           <w:webHidden/>
         </w:rPr>
-        <w:t>54</w:t>
+        <w:t>55</w:t>
       </w:r>
       <w:r>
         <w:rPr>
@@ -5547,7 +5547,7 @@
           <w:noProof/>
           <w:webHidden/>
         </w:rPr>
-        <w:instrText xml:space="preserve"> PAGEREF _Toc243342825 \h </w:instrText>
+        <w:instrText xml:space="preserve"> PAGEREF _Toc243470051 \h </w:instrText>
       </w:r>
       <w:r>
         <w:rPr>
@@ -5567,7 +5567,7 @@
           <w:noProof/>
           <w:webHidden/>
         </w:rPr>
-        <w:t>54</w:t>
+        <w:t>55</w:t>
       </w:r>
       <w:r>
         <w:rPr>
@@ -5618,7 +5618,7 @@
           <w:noProof/>
           <w:webHidden/>
         </w:rPr>
-        <w:instrText xml:space="preserve"> PAGEREF _Toc243342826 \h </w:instrText>
+        <w:instrText xml:space="preserve"> PAGEREF _Toc243470052 \h </w:instrText>
       </w:r>
       <w:r>
         <w:rPr>
@@ -5638,7 +5638,7 @@
           <w:noProof/>
           <w:webHidden/>
         </w:rPr>
-        <w:t>55</w:t>
+        <w:t>56</w:t>
       </w:r>
       <w:r>
         <w:rPr>
@@ -5689,7 +5689,7 @@
           <w:noProof/>
           <w:webHidden/>
         </w:rPr>
-        <w:instrText xml:space="preserve"> PAGEREF _Toc243342827 \h </w:instrText>
+        <w:instrText xml:space="preserve"> PAGEREF _Toc243470053 \h </w:instrText>
       </w:r>
       <w:r>
         <w:rPr>
@@ -5709,7 +5709,7 @@
           <w:noProof/>
           <w:webHidden/>
         </w:rPr>
-        <w:t>55</w:t>
+        <w:t>56</w:t>
       </w:r>
       <w:r>
         <w:rPr>
@@ -5760,7 +5760,7 @@
           <w:noProof/>
           <w:webHidden/>
         </w:rPr>
-        <w:instrText xml:space="preserve"> PAGEREF _Toc243342828 \h </w:instrText>
+        <w:instrText xml:space="preserve"> PAGEREF _Toc243470054 \h </w:instrText>
       </w:r>
       <w:r>
         <w:rPr>
@@ -5780,7 +5780,7 @@
           <w:noProof/>
           <w:webHidden/>
         </w:rPr>
-        <w:t>55</w:t>
+        <w:t>56</w:t>
       </w:r>
       <w:r>
         <w:rPr>
@@ -5832,7 +5832,7 @@
           <w:noProof/>
           <w:webHidden/>
         </w:rPr>
-        <w:instrText xml:space="preserve"> PAGEREF _Toc243342829 \h </w:instrText>
+        <w:instrText xml:space="preserve"> PAGEREF _Toc243470055 \h </w:instrText>
       </w:r>
       <w:r>
         <w:rPr>
@@ -5852,7 +5852,7 @@
           <w:noProof/>
           <w:webHidden/>
         </w:rPr>
-        <w:t>56</w:t>
+        <w:t>57</w:t>
       </w:r>
       <w:r>
         <w:rPr>
@@ -5903,7 +5903,7 @@
           <w:noProof/>
           <w:webHidden/>
         </w:rPr>
-        <w:instrText xml:space="preserve"> PAGEREF _Toc243342830 \h </w:instrText>
+        <w:instrText xml:space="preserve"> PAGEREF _Toc243470056 \h </w:instrText>
       </w:r>
       <w:r>
         <w:rPr>
@@ -5923,7 +5923,7 @@
           <w:noProof/>
           <w:webHidden/>
         </w:rPr>
-        <w:t>57</w:t>
+        <w:t>58</w:t>
       </w:r>
       <w:r>
         <w:rPr>
@@ -5974,7 +5974,7 @@
           <w:noProof/>
           <w:webHidden/>
         </w:rPr>
-        <w:instrText xml:space="preserve"> PAGEREF _Toc243342831 \h </w:instrText>
+        <w:instrText xml:space="preserve"> PAGEREF _Toc243470057 \h </w:instrText>
       </w:r>
       <w:r>
         <w:rPr>
@@ -5994,7 +5994,7 @@
           <w:noProof/>
           <w:webHidden/>
         </w:rPr>
-        <w:t>58</w:t>
+        <w:t>59</w:t>
       </w:r>
       <w:r>
         <w:rPr>
@@ -6045,7 +6045,7 @@
           <w:noProof/>
           <w:webHidden/>
         </w:rPr>
-        <w:instrText xml:space="preserve"> PAGEREF _Toc243342832 \h </w:instrText>
+        <w:instrText xml:space="preserve"> PAGEREF _Toc243470058 \h </w:instrText>
       </w:r>
       <w:r>
         <w:rPr>
@@ -6065,7 +6065,7 @@
           <w:noProof/>
           <w:webHidden/>
         </w:rPr>
-        <w:t>59</w:t>
+        <w:t>60</w:t>
       </w:r>
       <w:r>
         <w:rPr>
@@ -6116,7 +6116,7 @@
           <w:noProof/>
           <w:webHidden/>
         </w:rPr>
-        <w:instrText xml:space="preserve"> PAGEREF _Toc243342833 \h </w:instrText>
+        <w:instrText xml:space="preserve"> PAGEREF _Toc243470059 \h </w:instrText>
       </w:r>
       <w:r>
         <w:rPr>
@@ -6136,7 +6136,7 @@
           <w:noProof/>
           <w:webHidden/>
         </w:rPr>
-        <w:t>59</w:t>
+        <w:t>60</w:t>
       </w:r>
       <w:r>
         <w:rPr>
@@ -6405,6 +6405,14 @@
       </w:pPr>
       <w:r>
         <w:t>Table 5.10  Hardware CPA convergence with trace count</w:t>
+      </w:r>
+    </w:p>
+    <w:p>
+      <w:pPr>
+        <w:spacing w:after="120" w:line="240" w:lineRule="auto"/>
+      </w:pPr>
+      <w:r>
+        <w:t>Table 5.11  Isolation-Forest detector evaluation (200 seeds per class)</w:t>
       </w:r>
     </w:p>
     <w:p>
@@ -7266,7 +7274,7 @@
         <w:pStyle w:val="Heading1"/>
         <w:jc w:val="center"/>
       </w:pPr>
-      <w:bookmarkStart w:id="0" w:name="_Toc243342756"/>
+      <w:bookmarkStart w:id="0" w:name="_Toc243469982"/>
       <w:r>
         <w:rPr>
           <w:rFonts w:ascii="Times New Roman" w:hAnsi="Times New Roman"/>
@@ -7295,7 +7303,7 @@
       <w:pPr>
         <w:pStyle w:val="Heading2"/>
       </w:pPr>
-      <w:bookmarkStart w:id="1" w:name="_Toc243342757"/>
+      <w:bookmarkStart w:id="1" w:name="_Toc243469983"/>
       <w:r>
         <w:rPr>
           <w:rFonts w:ascii="Times New Roman" w:hAnsi="Times New Roman"/>
@@ -7347,7 +7355,7 @@
       <w:pPr>
         <w:pStyle w:val="Heading2"/>
       </w:pPr>
-      <w:bookmarkStart w:id="2" w:name="_Toc243342758"/>
+      <w:bookmarkStart w:id="2" w:name="_Toc243469984"/>
       <w:r>
         <w:rPr>
           <w:rFonts w:ascii="Times New Roman" w:hAnsi="Times New Roman"/>
@@ -7383,7 +7391,7 @@
       <w:pPr>
         <w:pStyle w:val="Heading2"/>
       </w:pPr>
-      <w:bookmarkStart w:id="3" w:name="_Toc243342759"/>
+      <w:bookmarkStart w:id="3" w:name="_Toc243469985"/>
       <w:r>
         <w:rPr>
           <w:rFonts w:ascii="Times New Roman" w:hAnsi="Times New Roman"/>
@@ -7423,7 +7431,7 @@
       <w:pPr>
         <w:pStyle w:val="Heading2"/>
       </w:pPr>
-      <w:bookmarkStart w:id="4" w:name="_Toc243342760"/>
+      <w:bookmarkStart w:id="4" w:name="_Toc243469986"/>
       <w:r>
         <w:rPr>
           <w:rFonts w:ascii="Times New Roman" w:hAnsi="Times New Roman"/>
@@ -7447,7 +7455,7 @@
       <w:pPr>
         <w:pStyle w:val="Heading2"/>
       </w:pPr>
-      <w:bookmarkStart w:id="5" w:name="_Toc243342761"/>
+      <w:bookmarkStart w:id="5" w:name="_Toc243469987"/>
       <w:r>
         <w:rPr>
           <w:rFonts w:ascii="Times New Roman" w:hAnsi="Times New Roman"/>
@@ -7517,7 +7525,7 @@
       <w:pPr>
         <w:pStyle w:val="Heading2"/>
       </w:pPr>
-      <w:bookmarkStart w:id="6" w:name="_Toc243342762"/>
+      <w:bookmarkStart w:id="6" w:name="_Toc243469988"/>
       <w:r>
         <w:rPr>
           <w:rFonts w:ascii="Times New Roman" w:hAnsi="Times New Roman"/>
@@ -7544,7 +7552,7 @@
       <w:pPr>
         <w:pStyle w:val="Heading2"/>
       </w:pPr>
-      <w:bookmarkStart w:id="7" w:name="_Toc243342763"/>
+      <w:bookmarkStart w:id="7" w:name="_Toc243469989"/>
       <w:r>
         <w:rPr>
           <w:rFonts w:ascii="Times New Roman" w:hAnsi="Times New Roman"/>
@@ -7571,7 +7579,7 @@
       <w:pPr>
         <w:pStyle w:val="Heading2"/>
       </w:pPr>
-      <w:bookmarkStart w:id="8" w:name="_Toc243342764"/>
+      <w:bookmarkStart w:id="8" w:name="_Toc243469990"/>
       <w:r>
         <w:rPr>
           <w:rFonts w:ascii="Times New Roman" w:hAnsi="Times New Roman"/>
@@ -7604,7 +7612,7 @@
         <w:pageBreakBefore/>
         <w:jc w:val="center"/>
       </w:pPr>
-      <w:bookmarkStart w:id="9" w:name="_Toc243342765"/>
+      <w:bookmarkStart w:id="9" w:name="_Toc243469991"/>
       <w:r>
         <w:rPr>
           <w:rFonts w:ascii="Times New Roman" w:hAnsi="Times New Roman"/>
@@ -7633,7 +7641,7 @@
       <w:pPr>
         <w:pStyle w:val="Heading2"/>
       </w:pPr>
-      <w:bookmarkStart w:id="10" w:name="_Toc243342766"/>
+      <w:bookmarkStart w:id="10" w:name="_Toc243469992"/>
       <w:r>
         <w:rPr>
           <w:rFonts w:ascii="Times New Roman" w:hAnsi="Times New Roman"/>
@@ -7657,7 +7665,7 @@
       <w:pPr>
         <w:pStyle w:val="Heading2"/>
       </w:pPr>
-      <w:bookmarkStart w:id="11" w:name="_Toc243342767"/>
+      <w:bookmarkStart w:id="11" w:name="_Toc243469993"/>
       <w:r>
         <w:rPr>
           <w:rFonts w:ascii="Times New Roman" w:hAnsi="Times New Roman"/>
@@ -7700,7 +7708,7 @@
       <w:pPr>
         <w:pStyle w:val="Heading2"/>
       </w:pPr>
-      <w:bookmarkStart w:id="12" w:name="_Toc243342768"/>
+      <w:bookmarkStart w:id="12" w:name="_Toc243469994"/>
       <w:r>
         <w:rPr>
           <w:rFonts w:ascii="Times New Roman" w:hAnsi="Times New Roman"/>
@@ -7739,7 +7747,7 @@
       <w:pPr>
         <w:pStyle w:val="Heading2"/>
       </w:pPr>
-      <w:bookmarkStart w:id="13" w:name="_Toc243342769"/>
+      <w:bookmarkStart w:id="13" w:name="_Toc243469995"/>
       <w:r>
         <w:rPr>
           <w:rFonts w:ascii="Times New Roman" w:hAnsi="Times New Roman"/>
@@ -7782,7 +7790,7 @@
       <w:pPr>
         <w:pStyle w:val="Heading2"/>
       </w:pPr>
-      <w:bookmarkStart w:id="14" w:name="_Toc243342770"/>
+      <w:bookmarkStart w:id="14" w:name="_Toc243469996"/>
       <w:r>
         <w:rPr>
           <w:rFonts w:ascii="Times New Roman" w:hAnsi="Times New Roman"/>
@@ -7813,7 +7821,7 @@
       <w:pPr>
         <w:pStyle w:val="Heading2"/>
       </w:pPr>
-      <w:bookmarkStart w:id="15" w:name="_Toc243342771"/>
+      <w:bookmarkStart w:id="15" w:name="_Toc243469997"/>
       <w:r>
         <w:rPr>
           <w:rFonts w:ascii="Times New Roman" w:hAnsi="Times New Roman"/>
@@ -7843,7 +7851,7 @@
       <w:pPr>
         <w:pStyle w:val="Heading2"/>
       </w:pPr>
-      <w:bookmarkStart w:id="16" w:name="_Toc243342772"/>
+      <w:bookmarkStart w:id="16" w:name="_Toc243469998"/>
       <w:r>
         <w:rPr>
           <w:rFonts w:ascii="Times New Roman" w:hAnsi="Times New Roman"/>
@@ -7880,7 +7888,7 @@
       <w:pPr>
         <w:pStyle w:val="Heading2"/>
       </w:pPr>
-      <w:bookmarkStart w:id="17" w:name="_Toc243342773"/>
+      <w:bookmarkStart w:id="17" w:name="_Toc243469999"/>
       <w:r>
         <w:rPr>
           <w:rFonts w:ascii="Times New Roman" w:hAnsi="Times New Roman"/>
@@ -7935,7 +7943,7 @@
       <w:pPr>
         <w:pStyle w:val="Heading2"/>
       </w:pPr>
-      <w:bookmarkStart w:id="18" w:name="_Toc243342774"/>
+      <w:bookmarkStart w:id="18" w:name="_Toc243470000"/>
       <w:r>
         <w:rPr>
           <w:rFonts w:ascii="Times New Roman" w:hAnsi="Times New Roman"/>
@@ -7962,7 +7970,7 @@
       <w:pPr>
         <w:pStyle w:val="Heading2"/>
       </w:pPr>
-      <w:bookmarkStart w:id="19" w:name="_Toc243342775"/>
+      <w:bookmarkStart w:id="19" w:name="_Toc243470001"/>
       <w:r>
         <w:rPr>
           <w:rFonts w:ascii="Times New Roman" w:hAnsi="Times New Roman"/>
@@ -7990,7 +7998,7 @@
       <w:pPr>
         <w:pStyle w:val="Heading2"/>
       </w:pPr>
-      <w:bookmarkStart w:id="20" w:name="_Toc243342776"/>
+      <w:bookmarkStart w:id="20" w:name="_Toc243470002"/>
       <w:r>
         <w:rPr>
           <w:rFonts w:ascii="Times New Roman" w:hAnsi="Times New Roman"/>
@@ -8860,7 +8868,7 @@
       <w:pPr>
         <w:pStyle w:val="Heading2"/>
       </w:pPr>
-      <w:bookmarkStart w:id="21" w:name="_Toc243342777"/>
+      <w:bookmarkStart w:id="21" w:name="_Toc243470003"/>
       <w:r>
         <w:rPr>
           <w:rFonts w:ascii="Times New Roman" w:hAnsi="Times New Roman"/>
@@ -9167,7 +9175,7 @@
       <w:pPr>
         <w:pStyle w:val="Heading2"/>
       </w:pPr>
-      <w:bookmarkStart w:id="22" w:name="_Toc243342778"/>
+      <w:bookmarkStart w:id="22" w:name="_Toc243470004"/>
       <w:r>
         <w:rPr>
           <w:rFonts w:ascii="Times New Roman" w:hAnsi="Times New Roman"/>
@@ -9880,7 +9888,7 @@
       <w:pPr>
         <w:pStyle w:val="Heading2"/>
       </w:pPr>
-      <w:bookmarkStart w:id="23" w:name="_Toc243342779"/>
+      <w:bookmarkStart w:id="23" w:name="_Toc243470005"/>
       <w:r>
         <w:rPr>
           <w:rFonts w:ascii="Times New Roman" w:hAnsi="Times New Roman"/>
@@ -9910,7 +9918,7 @@
         <w:pageBreakBefore/>
         <w:jc w:val="center"/>
       </w:pPr>
-      <w:bookmarkStart w:id="24" w:name="_Toc243342780"/>
+      <w:bookmarkStart w:id="24" w:name="_Toc243470006"/>
       <w:r>
         <w:rPr>
           <w:rFonts w:ascii="Times New Roman" w:hAnsi="Times New Roman"/>
@@ -9939,7 +9947,7 @@
       <w:pPr>
         <w:pStyle w:val="Heading2"/>
       </w:pPr>
-      <w:bookmarkStart w:id="25" w:name="_Toc243342781"/>
+      <w:bookmarkStart w:id="25" w:name="_Toc243470007"/>
       <w:r>
         <w:rPr>
           <w:rFonts w:ascii="Times New Roman" w:hAnsi="Times New Roman"/>
@@ -9974,7 +9982,7 @@
           <w:noProof/>
         </w:rPr>
         <w:drawing>
-          <wp:inline distT="0" distB="0" distL="0" distR="0" wp14:anchorId="60D35794" wp14:editId="26D3B4E4">
+          <wp:inline distT="0" distB="0" distL="0" distR="0" wp14:anchorId="69621C16" wp14:editId="73DC75CB">
             <wp:extent cx="5303520" cy="1236383"/>
             <wp:effectExtent l="0" t="0" r="0" b="0"/>
             <wp:docPr id="2" name="Picture 2"/>
@@ -10027,7 +10035,7 @@
       <w:pPr>
         <w:pStyle w:val="Heading2"/>
       </w:pPr>
-      <w:bookmarkStart w:id="26" w:name="_Toc243342782"/>
+      <w:bookmarkStart w:id="26" w:name="_Toc243470008"/>
       <w:r>
         <w:rPr>
           <w:rFonts w:ascii="Times New Roman" w:hAnsi="Times New Roman"/>
@@ -10063,7 +10071,7 @@
           <w:noProof/>
         </w:rPr>
         <w:drawing>
-          <wp:inline distT="0" distB="0" distL="0" distR="0" wp14:anchorId="22CF466D" wp14:editId="04CD94E6">
+          <wp:inline distT="0" distB="0" distL="0" distR="0" wp14:anchorId="6B9FEBF9" wp14:editId="712C99C7">
             <wp:extent cx="5303520" cy="573443"/>
             <wp:effectExtent l="0" t="0" r="0" b="0"/>
             <wp:docPr id="3" name="Picture 3"/>
@@ -10150,7 +10158,7 @@
       <w:pPr>
         <w:pStyle w:val="Heading2"/>
       </w:pPr>
-      <w:bookmarkStart w:id="27" w:name="_Toc243342783"/>
+      <w:bookmarkStart w:id="27" w:name="_Toc243470009"/>
       <w:r>
         <w:rPr>
           <w:rFonts w:ascii="Times New Roman" w:hAnsi="Times New Roman"/>
@@ -10196,7 +10204,7 @@
       <w:pPr>
         <w:pStyle w:val="Heading2"/>
       </w:pPr>
-      <w:bookmarkStart w:id="28" w:name="_Toc243342784"/>
+      <w:bookmarkStart w:id="28" w:name="_Toc243470010"/>
       <w:r>
         <w:rPr>
           <w:rFonts w:ascii="Times New Roman" w:hAnsi="Times New Roman"/>
@@ -10247,7 +10255,7 @@
           <w:noProof/>
         </w:rPr>
         <w:drawing>
-          <wp:inline distT="0" distB="0" distL="0" distR="0" wp14:anchorId="5DD5F21A" wp14:editId="73B5B246">
+          <wp:inline distT="0" distB="0" distL="0" distR="0" wp14:anchorId="57145DE7" wp14:editId="43635570">
             <wp:extent cx="5303520" cy="1743532"/>
             <wp:effectExtent l="0" t="0" r="0" b="0"/>
             <wp:docPr id="4" name="Picture 4"/>
@@ -10652,7 +10660,7 @@
       <w:pPr>
         <w:pStyle w:val="Heading2"/>
       </w:pPr>
-      <w:bookmarkStart w:id="29" w:name="_Toc243342785"/>
+      <w:bookmarkStart w:id="29" w:name="_Toc243470011"/>
       <w:r>
         <w:rPr>
           <w:rFonts w:ascii="Times New Roman" w:hAnsi="Times New Roman"/>
@@ -10679,7 +10687,7 @@
       <w:pPr>
         <w:pStyle w:val="Heading2"/>
       </w:pPr>
-      <w:bookmarkStart w:id="30" w:name="_Toc243342786"/>
+      <w:bookmarkStart w:id="30" w:name="_Toc243470012"/>
       <w:r>
         <w:rPr>
           <w:rFonts w:ascii="Times New Roman" w:hAnsi="Times New Roman"/>
@@ -10722,7 +10730,7 @@
       <w:pPr>
         <w:pStyle w:val="Heading2"/>
       </w:pPr>
-      <w:bookmarkStart w:id="31" w:name="_Toc243342787"/>
+      <w:bookmarkStart w:id="31" w:name="_Toc243470013"/>
       <w:r>
         <w:rPr>
           <w:rFonts w:ascii="Times New Roman" w:hAnsi="Times New Roman"/>
@@ -11192,7 +11200,7 @@
       <w:pPr>
         <w:pStyle w:val="Heading2"/>
       </w:pPr>
-      <w:bookmarkStart w:id="32" w:name="_Toc243342788"/>
+      <w:bookmarkStart w:id="32" w:name="_Toc243470014"/>
       <w:r>
         <w:rPr>
           <w:rFonts w:ascii="Times New Roman" w:hAnsi="Times New Roman"/>
@@ -11222,7 +11230,7 @@
       <w:pPr>
         <w:pStyle w:val="Heading2"/>
       </w:pPr>
-      <w:bookmarkStart w:id="33" w:name="_Toc243342789"/>
+      <w:bookmarkStart w:id="33" w:name="_Toc243470015"/>
       <w:r>
         <w:rPr>
           <w:rFonts w:ascii="Times New Roman" w:hAnsi="Times New Roman"/>
@@ -11252,7 +11260,7 @@
         <w:pageBreakBefore/>
         <w:jc w:val="center"/>
       </w:pPr>
-      <w:bookmarkStart w:id="34" w:name="_Toc243342790"/>
+      <w:bookmarkStart w:id="34" w:name="_Toc243470016"/>
       <w:r>
         <w:rPr>
           <w:rFonts w:ascii="Times New Roman" w:hAnsi="Times New Roman"/>
@@ -11281,7 +11289,7 @@
       <w:pPr>
         <w:pStyle w:val="Heading2"/>
       </w:pPr>
-      <w:bookmarkStart w:id="35" w:name="_Toc243342791"/>
+      <w:bookmarkStart w:id="35" w:name="_Toc243470017"/>
       <w:r>
         <w:rPr>
           <w:rFonts w:ascii="Times New Roman" w:hAnsi="Times New Roman"/>
@@ -11308,7 +11316,7 @@
       <w:pPr>
         <w:pStyle w:val="Heading2"/>
       </w:pPr>
-      <w:bookmarkStart w:id="36" w:name="_Toc243342792"/>
+      <w:bookmarkStart w:id="36" w:name="_Toc243470018"/>
       <w:r>
         <w:rPr>
           <w:rFonts w:ascii="Times New Roman" w:hAnsi="Times New Roman"/>
@@ -11343,7 +11351,7 @@
           <w:noProof/>
         </w:rPr>
         <w:drawing>
-          <wp:inline distT="0" distB="0" distL="0" distR="0" wp14:anchorId="1C8517AD" wp14:editId="38E9FF38">
+          <wp:inline distT="0" distB="0" distL="0" distR="0" wp14:anchorId="54D18074" wp14:editId="0439C905">
             <wp:extent cx="4985886" cy="346509"/>
             <wp:effectExtent l="0" t="0" r="0" b="0"/>
             <wp:docPr id="5" name="Picture 5"/>
@@ -11503,7 +11511,7 @@
           <w:noProof/>
         </w:rPr>
         <w:drawing>
-          <wp:inline distT="0" distB="0" distL="0" distR="0" wp14:anchorId="03F0EA1A" wp14:editId="4C51AA5B">
+          <wp:inline distT="0" distB="0" distL="0" distR="0" wp14:anchorId="37E1875B" wp14:editId="62126CEC">
             <wp:extent cx="5120640" cy="302450"/>
             <wp:effectExtent l="0" t="0" r="0" b="0"/>
             <wp:docPr id="6" name="Picture 6"/>
@@ -11620,7 +11628,7 @@
           <w:noProof/>
         </w:rPr>
         <w:drawing>
-          <wp:inline distT="0" distB="0" distL="0" distR="0" wp14:anchorId="740146C3" wp14:editId="7004A1A5">
+          <wp:inline distT="0" distB="0" distL="0" distR="0" wp14:anchorId="77E982C8" wp14:editId="544B25D2">
             <wp:extent cx="5120640" cy="332449"/>
             <wp:effectExtent l="0" t="0" r="0" b="0"/>
             <wp:docPr id="7" name="Picture 7"/>
@@ -11665,7 +11673,7 @@
       <w:pPr>
         <w:pStyle w:val="Heading2"/>
       </w:pPr>
-      <w:bookmarkStart w:id="37" w:name="_Toc243342793"/>
+      <w:bookmarkStart w:id="37" w:name="_Toc243470019"/>
       <w:r>
         <w:rPr>
           <w:rFonts w:ascii="Times New Roman" w:hAnsi="Times New Roman"/>
@@ -11697,7 +11705,7 @@
           <w:noProof/>
         </w:rPr>
         <w:drawing>
-          <wp:inline distT="0" distB="0" distL="0" distR="0" wp14:anchorId="7CBA2C0D" wp14:editId="0D38EB55">
+          <wp:inline distT="0" distB="0" distL="0" distR="0" wp14:anchorId="61F6CA2B" wp14:editId="53B6CE81">
             <wp:extent cx="5120640" cy="325120"/>
             <wp:effectExtent l="0" t="0" r="0" b="0"/>
             <wp:docPr id="8" name="Picture 8"/>
@@ -11742,7 +11750,7 @@
       <w:pPr>
         <w:pStyle w:val="Heading2"/>
       </w:pPr>
-      <w:bookmarkStart w:id="38" w:name="_Toc243342794"/>
+      <w:bookmarkStart w:id="38" w:name="_Toc243470020"/>
       <w:r>
         <w:rPr>
           <w:rFonts w:ascii="Times New Roman" w:hAnsi="Times New Roman"/>
@@ -11773,7 +11781,7 @@
       <w:pPr>
         <w:pStyle w:val="Heading2"/>
       </w:pPr>
-      <w:bookmarkStart w:id="39" w:name="_Toc243342795"/>
+      <w:bookmarkStart w:id="39" w:name="_Toc243470021"/>
       <w:r>
         <w:rPr>
           <w:rFonts w:ascii="Times New Roman" w:hAnsi="Times New Roman"/>
@@ -11800,7 +11808,7 @@
       <w:pPr>
         <w:pStyle w:val="Heading2"/>
       </w:pPr>
-      <w:bookmarkStart w:id="40" w:name="_Toc243342796"/>
+      <w:bookmarkStart w:id="40" w:name="_Toc243470022"/>
       <w:r>
         <w:rPr>
           <w:rFonts w:ascii="Times New Roman" w:hAnsi="Times New Roman"/>
@@ -11828,7 +11836,7 @@
       <w:pPr>
         <w:pStyle w:val="Heading2"/>
       </w:pPr>
-      <w:bookmarkStart w:id="41" w:name="_Toc243342797"/>
+      <w:bookmarkStart w:id="41" w:name="_Toc243470023"/>
       <w:r>
         <w:rPr>
           <w:rFonts w:ascii="Times New Roman" w:hAnsi="Times New Roman"/>
@@ -11855,7 +11863,7 @@
       <w:pPr>
         <w:pStyle w:val="Heading2"/>
       </w:pPr>
-      <w:bookmarkStart w:id="42" w:name="_Toc243342798"/>
+      <w:bookmarkStart w:id="42" w:name="_Toc243470024"/>
       <w:r>
         <w:rPr>
           <w:rFonts w:ascii="Times New Roman" w:hAnsi="Times New Roman"/>
@@ -11887,7 +11895,7 @@
         <w:pageBreakBefore/>
         <w:jc w:val="center"/>
       </w:pPr>
-      <w:bookmarkStart w:id="43" w:name="_Toc243342799"/>
+      <w:bookmarkStart w:id="43" w:name="_Toc243470025"/>
       <w:r>
         <w:rPr>
           <w:rFonts w:ascii="Times New Roman" w:hAnsi="Times New Roman"/>
@@ -11916,7 +11924,7 @@
       <w:pPr>
         <w:pStyle w:val="Heading2"/>
       </w:pPr>
-      <w:bookmarkStart w:id="44" w:name="_Toc243342800"/>
+      <w:bookmarkStart w:id="44" w:name="_Toc243470026"/>
       <w:r>
         <w:rPr>
           <w:rFonts w:ascii="Times New Roman" w:hAnsi="Times New Roman"/>
@@ -11948,7 +11956,7 @@
           <w:noProof/>
         </w:rPr>
         <w:drawing>
-          <wp:inline distT="0" distB="0" distL="0" distR="0" wp14:anchorId="5BA8D20D" wp14:editId="768F2312">
+          <wp:inline distT="0" distB="0" distL="0" distR="0" wp14:anchorId="271D0082" wp14:editId="1EA9464F">
             <wp:extent cx="5303520" cy="3374967"/>
             <wp:effectExtent l="0" t="0" r="0" b="0"/>
             <wp:docPr id="9" name="Picture 9"/>
@@ -12246,7 +12254,7 @@
           <w:noProof/>
         </w:rPr>
         <w:drawing>
-          <wp:inline distT="0" distB="0" distL="0" distR="0" wp14:anchorId="6C416E62" wp14:editId="2534A7C1">
+          <wp:inline distT="0" distB="0" distL="0" distR="0" wp14:anchorId="5EFAF853" wp14:editId="5D1567C2">
             <wp:extent cx="5303520" cy="2272937"/>
             <wp:effectExtent l="0" t="0" r="0" b="0"/>
             <wp:docPr id="10" name="Picture 10"/>
@@ -12689,7 +12697,7 @@
       <w:pPr>
         <w:pStyle w:val="Heading2"/>
       </w:pPr>
-      <w:bookmarkStart w:id="45" w:name="_Toc243342801"/>
+      <w:bookmarkStart w:id="45" w:name="_Toc243470027"/>
       <w:r>
         <w:rPr>
           <w:rFonts w:ascii="Times New Roman" w:hAnsi="Times New Roman"/>
@@ -12725,7 +12733,7 @@
           <w:noProof/>
         </w:rPr>
         <w:drawing>
-          <wp:inline distT="0" distB="0" distL="0" distR="0" wp14:anchorId="70145E38" wp14:editId="586F72A5">
+          <wp:inline distT="0" distB="0" distL="0" distR="0" wp14:anchorId="193A74FD" wp14:editId="72A6DCE2">
             <wp:extent cx="5303520" cy="2121408"/>
             <wp:effectExtent l="0" t="0" r="0" b="0"/>
             <wp:docPr id="11" name="Picture 11"/>
@@ -13088,7 +13096,7 @@
           <w:noProof/>
         </w:rPr>
         <w:drawing>
-          <wp:inline distT="0" distB="0" distL="0" distR="0" wp14:anchorId="468DF7C9" wp14:editId="4F67BDAC">
+          <wp:inline distT="0" distB="0" distL="0" distR="0" wp14:anchorId="0674B52E" wp14:editId="4657488D">
             <wp:extent cx="5303520" cy="2571404"/>
             <wp:effectExtent l="0" t="0" r="0" b="0"/>
             <wp:docPr id="12" name="Picture 12"/>
@@ -13141,7 +13149,7 @@
       <w:pPr>
         <w:pStyle w:val="Heading2"/>
       </w:pPr>
-      <w:bookmarkStart w:id="46" w:name="_Toc243342802"/>
+      <w:bookmarkStart w:id="46" w:name="_Toc243470028"/>
       <w:r>
         <w:rPr>
           <w:rFonts w:ascii="Times New Roman" w:hAnsi="Times New Roman"/>
@@ -13428,7 +13436,7 @@
       <w:pPr>
         <w:pStyle w:val="Heading2"/>
       </w:pPr>
-      <w:bookmarkStart w:id="47" w:name="_Toc243342803"/>
+      <w:bookmarkStart w:id="47" w:name="_Toc243470029"/>
       <w:r>
         <w:rPr>
           <w:rFonts w:ascii="Times New Roman" w:hAnsi="Times New Roman"/>
@@ -13495,7 +13503,7 @@
           <w:noProof/>
         </w:rPr>
         <w:drawing>
-          <wp:inline distT="0" distB="0" distL="0" distR="0" wp14:anchorId="59E45FA7" wp14:editId="29366049">
+          <wp:inline distT="0" distB="0" distL="0" distR="0" wp14:anchorId="1D8734D2" wp14:editId="67022FD5">
             <wp:extent cx="5303520" cy="2121408"/>
             <wp:effectExtent l="0" t="0" r="0" b="0"/>
             <wp:docPr id="13" name="Picture 13"/>
@@ -13896,7 +13904,7 @@
       <w:pPr>
         <w:pStyle w:val="Heading2"/>
       </w:pPr>
-      <w:bookmarkStart w:id="48" w:name="_Toc243342804"/>
+      <w:bookmarkStart w:id="48" w:name="_Toc243470030"/>
       <w:r>
         <w:rPr>
           <w:rFonts w:ascii="Times New Roman" w:hAnsi="Times New Roman"/>
@@ -13929,7 +13937,7 @@
           <w:noProof/>
         </w:rPr>
         <w:drawing>
-          <wp:inline distT="0" distB="0" distL="0" distR="0" wp14:anchorId="2618A976" wp14:editId="1B29DEA6">
+          <wp:inline distT="0" distB="0" distL="0" distR="0" wp14:anchorId="59F1EC86" wp14:editId="310BAAF8">
             <wp:extent cx="5303520" cy="2424466"/>
             <wp:effectExtent l="0" t="0" r="0" b="0"/>
             <wp:docPr id="14" name="Picture 14"/>
@@ -14207,9 +14215,413 @@
     <w:p/>
     <w:p>
       <w:pPr>
+        <w:spacing w:after="160"/>
+        <w:jc w:val="both"/>
+      </w:pPr>
+      <w:r>
+        <w:t xml:space="preserve">To put the machine-learning monitor on a quantitative footing, its Isolation Forest was evaluated over two hundred independently seeded windows per traffic class, with the decision threshold fixed at the calibrated one-per-cent false-positive operating point learned from normal traffic alone. Table 5.11 reports the outcome. The separation </w:t>
+      </w:r>
+      <w:r>
+        <w:lastRenderedPageBreak/>
+        <w:t xml:space="preserve">between normal and attacking traffic is almost perfect in the ranking sense: the area under the receiver-operating-characteristic curve is 1.000 for the aggressive attacker and 0.982 for the throttled one. The single remaining subtlety is the throttled attacker observed through one short window, where the detection rate is low: by construction such an attacker issues only a handful of high-entropy requests at a near-human rate, so a single isolated snapshot of its traffic is genuinely close to normal. This </w:t>
+      </w:r>
+      <w:r>
+        <w:t xml:space="preserve">is not a weakness of the model but a property of the threat — and it disappears the moment the detector operates as it does in deployment. Checking the window after every request, the streaming monitor catches the throttled attacker in every one of the seeded trials at a median of ten requests, because an attacker cannot sustain a rate several times the human baseline without the growing window moving decisively into the anomalous region. Aggregating the anomaly score over three consecutive windows reaches </w:t>
+      </w:r>
+      <w:r>
+        <w:t>the same hundred-per-cent detection at a one-per-cent false-positive rate. The defence therefore holds against the throttled attacker not through any single lucky snapshot but because evasion cannot be maintained over time.</w:t>
+      </w:r>
+    </w:p>
+    <w:p>
+      <w:pPr>
+        <w:keepNext/>
+        <w:spacing w:after="80"/>
+        <w:jc w:val="center"/>
+      </w:pPr>
+      <w:r>
+        <w:rPr>
+          <w:i/>
+          <w:sz w:val="22"/>
+        </w:rPr>
+        <w:t>Table 5.11  Isolation-Forest detector evaluation (200 seeds per class)</w:t>
+      </w:r>
+    </w:p>
+    <w:tbl>
+      <w:tblPr>
+        <w:tblStyle w:val="TableGrid"/>
+        <w:tblW w:w="0" w:type="auto"/>
+        <w:tblLook w:val="04A0" w:firstRow="1" w:lastRow="0" w:firstColumn="1" w:lastColumn="0" w:noHBand="0" w:noVBand="1"/>
+      </w:tblPr>
+      <w:tblGrid>
+        <w:gridCol w:w="2880"/>
+        <w:gridCol w:w="2880"/>
+        <w:gridCol w:w="2880"/>
+      </w:tblGrid>
+      <w:tr>
+        <w:trPr>
+          <w:cantSplit/>
+        </w:trPr>
+        <w:tc>
+          <w:tcPr>
+            <w:tcW w:w="2880" w:type="dxa"/>
+          </w:tcPr>
+          <w:p>
+            <w:pPr>
+              <w:keepNext/>
+            </w:pPr>
+            <w:r>
+              <w:rPr>
+                <w:b/>
+                <w:sz w:val="22"/>
+              </w:rPr>
+              <w:t>Metric</w:t>
+            </w:r>
+          </w:p>
+        </w:tc>
+        <w:tc>
+          <w:tcPr>
+            <w:tcW w:w="2880" w:type="dxa"/>
+          </w:tcPr>
+          <w:p>
+            <w:pPr>
+              <w:keepNext/>
+            </w:pPr>
+            <w:r>
+              <w:rPr>
+                <w:b/>
+                <w:sz w:val="22"/>
+              </w:rPr>
+              <w:t>Aggressive attacker</w:t>
+            </w:r>
+          </w:p>
+        </w:tc>
+        <w:tc>
+          <w:tcPr>
+            <w:tcW w:w="2880" w:type="dxa"/>
+          </w:tcPr>
+          <w:p>
+            <w:pPr>
+              <w:keepNext/>
+            </w:pPr>
+            <w:r>
+              <w:rPr>
+                <w:b/>
+                <w:sz w:val="22"/>
+              </w:rPr>
+              <w:t>Throttled attacker</w:t>
+            </w:r>
+          </w:p>
+        </w:tc>
+      </w:tr>
+      <w:tr>
+        <w:trPr>
+          <w:cantSplit/>
+        </w:trPr>
+        <w:tc>
+          <w:tcPr>
+            <w:tcW w:w="2880" w:type="dxa"/>
+          </w:tcPr>
+          <w:p>
+            <w:pPr>
+              <w:keepNext/>
+            </w:pPr>
+            <w:r>
+              <w:rPr>
+                <w:sz w:val="22"/>
+              </w:rPr>
+              <w:t>Single-window ROC-AUC</w:t>
+            </w:r>
+          </w:p>
+        </w:tc>
+        <w:tc>
+          <w:tcPr>
+            <w:tcW w:w="2880" w:type="dxa"/>
+          </w:tcPr>
+          <w:p>
+            <w:pPr>
+              <w:keepNext/>
+            </w:pPr>
+            <w:r>
+              <w:rPr>
+                <w:sz w:val="22"/>
+              </w:rPr>
+              <w:t>1.000</w:t>
+            </w:r>
+          </w:p>
+        </w:tc>
+        <w:tc>
+          <w:tcPr>
+            <w:tcW w:w="2880" w:type="dxa"/>
+          </w:tcPr>
+          <w:p>
+            <w:pPr>
+              <w:keepNext/>
+            </w:pPr>
+            <w:r>
+              <w:rPr>
+                <w:sz w:val="22"/>
+              </w:rPr>
+              <w:t>0.982</w:t>
+            </w:r>
+          </w:p>
+        </w:tc>
+      </w:tr>
+      <w:tr>
+        <w:trPr>
+          <w:cantSplit/>
+        </w:trPr>
+        <w:tc>
+          <w:tcPr>
+            <w:tcW w:w="2880" w:type="dxa"/>
+          </w:tcPr>
+          <w:p>
+            <w:pPr>
+              <w:keepNext/>
+            </w:pPr>
+            <w:r>
+              <w:rPr>
+                <w:sz w:val="22"/>
+              </w:rPr>
+              <w:t>Single-window detection rate</w:t>
+            </w:r>
+          </w:p>
+        </w:tc>
+        <w:tc>
+          <w:tcPr>
+            <w:tcW w:w="2880" w:type="dxa"/>
+          </w:tcPr>
+          <w:p>
+            <w:pPr>
+              <w:keepNext/>
+            </w:pPr>
+            <w:r>
+              <w:rPr>
+                <w:sz w:val="22"/>
+              </w:rPr>
+              <w:t>100%</w:t>
+            </w:r>
+          </w:p>
+        </w:tc>
+        <w:tc>
+          <w:tcPr>
+            <w:tcW w:w="2880" w:type="dxa"/>
+          </w:tcPr>
+          <w:p>
+            <w:pPr>
+              <w:keepNext/>
+            </w:pPr>
+            <w:r>
+              <w:rPr>
+                <w:sz w:val="22"/>
+              </w:rPr>
+              <w:t>2.5%</w:t>
+            </w:r>
+          </w:p>
+        </w:tc>
+      </w:tr>
+      <w:tr>
+        <w:trPr>
+          <w:cantSplit/>
+        </w:trPr>
+        <w:tc>
+          <w:tcPr>
+            <w:tcW w:w="2880" w:type="dxa"/>
+          </w:tcPr>
+          <w:p>
+            <w:pPr>
+              <w:keepNext/>
+            </w:pPr>
+            <w:r>
+              <w:rPr>
+                <w:sz w:val="22"/>
+              </w:rPr>
+              <w:t>Streaming detection rate</w:t>
+            </w:r>
+          </w:p>
+        </w:tc>
+        <w:tc>
+          <w:tcPr>
+            <w:tcW w:w="2880" w:type="dxa"/>
+          </w:tcPr>
+          <w:p>
+            <w:pPr>
+              <w:keepNext/>
+            </w:pPr>
+            <w:r>
+              <w:rPr>
+                <w:sz w:val="22"/>
+              </w:rPr>
+              <w:t>100%</w:t>
+            </w:r>
+          </w:p>
+        </w:tc>
+        <w:tc>
+          <w:tcPr>
+            <w:tcW w:w="2880" w:type="dxa"/>
+          </w:tcPr>
+          <w:p>
+            <w:pPr>
+              <w:keepNext/>
+            </w:pPr>
+            <w:r>
+              <w:rPr>
+                <w:sz w:val="22"/>
+              </w:rPr>
+              <w:t>100%</w:t>
+            </w:r>
+          </w:p>
+        </w:tc>
+      </w:tr>
+      <w:tr>
+        <w:trPr>
+          <w:cantSplit/>
+        </w:trPr>
+        <w:tc>
+          <w:tcPr>
+            <w:tcW w:w="2880" w:type="dxa"/>
+          </w:tcPr>
+          <w:p>
+            <w:pPr>
+              <w:keepNext/>
+            </w:pPr>
+            <w:r>
+              <w:rPr>
+                <w:sz w:val="22"/>
+              </w:rPr>
+              <w:t>Median requests to detection</w:t>
+            </w:r>
+          </w:p>
+        </w:tc>
+        <w:tc>
+          <w:tcPr>
+            <w:tcW w:w="2880" w:type="dxa"/>
+          </w:tcPr>
+          <w:p>
+            <w:pPr>
+              <w:keepNext/>
+            </w:pPr>
+            <w:r>
+              <w:rPr>
+                <w:sz w:val="22"/>
+              </w:rPr>
+              <w:t>10</w:t>
+            </w:r>
+          </w:p>
+        </w:tc>
+        <w:tc>
+          <w:tcPr>
+            <w:tcW w:w="2880" w:type="dxa"/>
+          </w:tcPr>
+          <w:p>
+            <w:pPr>
+              <w:keepNext/>
+            </w:pPr>
+            <w:r>
+              <w:rPr>
+                <w:sz w:val="22"/>
+              </w:rPr>
+              <w:t>10</w:t>
+            </w:r>
+          </w:p>
+        </w:tc>
+      </w:tr>
+      <w:tr>
+        <w:trPr>
+          <w:cantSplit/>
+        </w:trPr>
+        <w:tc>
+          <w:tcPr>
+            <w:tcW w:w="2880" w:type="dxa"/>
+          </w:tcPr>
+          <w:p>
+            <w:pPr>
+              <w:keepNext/>
+            </w:pPr>
+            <w:r>
+              <w:rPr>
+                <w:sz w:val="22"/>
+              </w:rPr>
+              <w:t>Three-window aggregate detection</w:t>
+            </w:r>
+          </w:p>
+        </w:tc>
+        <w:tc>
+          <w:tcPr>
+            <w:tcW w:w="2880" w:type="dxa"/>
+          </w:tcPr>
+          <w:p>
+            <w:pPr>
+              <w:keepNext/>
+            </w:pPr>
+            <w:r>
+              <w:rPr>
+                <w:sz w:val="22"/>
+              </w:rPr>
+              <w:t>—</w:t>
+            </w:r>
+          </w:p>
+        </w:tc>
+        <w:tc>
+          <w:tcPr>
+            <w:tcW w:w="2880" w:type="dxa"/>
+          </w:tcPr>
+          <w:p>
+            <w:pPr>
+              <w:keepNext/>
+            </w:pPr>
+            <w:r>
+              <w:rPr>
+                <w:sz w:val="22"/>
+              </w:rPr>
+              <w:t>100%</w:t>
+            </w:r>
+          </w:p>
+        </w:tc>
+      </w:tr>
+      <w:tr>
+        <w:trPr>
+          <w:cantSplit/>
+        </w:trPr>
+        <w:tc>
+          <w:tcPr>
+            <w:tcW w:w="2880" w:type="dxa"/>
+          </w:tcPr>
+          <w:p>
+            <w:r>
+              <w:rPr>
+                <w:sz w:val="22"/>
+              </w:rPr>
+              <w:t>False-positive rate (normal traffic)</w:t>
+            </w:r>
+          </w:p>
+        </w:tc>
+        <w:tc>
+          <w:tcPr>
+            <w:tcW w:w="2880" w:type="dxa"/>
+          </w:tcPr>
+          <w:p>
+            <w:r>
+              <w:rPr>
+                <w:sz w:val="22"/>
+              </w:rPr>
+              <w:t>0.5% single / 1.0% aggregate</w:t>
+            </w:r>
+          </w:p>
+        </w:tc>
+        <w:tc>
+          <w:tcPr>
+            <w:tcW w:w="2880" w:type="dxa"/>
+          </w:tcPr>
+          <w:p/>
+        </w:tc>
+      </w:tr>
+    </w:tbl>
+    <w:p/>
+    <w:p>
+      <w:pPr>
         <w:pStyle w:val="Heading2"/>
       </w:pPr>
-      <w:bookmarkStart w:id="49" w:name="_Toc243342805"/>
+      <w:bookmarkStart w:id="49" w:name="_Toc243470031"/>
       <w:r>
         <w:rPr>
           <w:rFonts w:ascii="Times New Roman" w:hAnsi="Times New Roman"/>
@@ -14226,11 +14638,7 @@
         <w:jc w:val="both"/>
       </w:pPr>
       <w:r>
-        <w:t xml:space="preserve">This section examines the hardware measurements in more depth, drawing on the raw traces and the per-byte statistics recorded during the campaign. Its purpose is to show not </w:t>
-      </w:r>
-      <w:r>
-        <w:lastRenderedPageBreak/>
-        <w:t>only that the attacks succeed or fail, but why, in terms that can be read directly from the signals the device produced.</w:t>
+        <w:t>This section examines the hardware measurements in more depth, drawing on the raw traces and the per-byte statistics recorded during the campaign. Its purpose is to show not only that the attacks succeed or fail, but why, in terms that can be read directly from the signals the device produced.</w:t>
       </w:r>
     </w:p>
     <w:p>
@@ -14239,6 +14647,7 @@
         <w:jc w:val="both"/>
       </w:pPr>
       <w:r>
+        <w:lastRenderedPageBreak/>
         <w:t>Figure 5.7 shows a single unprocessed LEAKLOOP trace as captured through the shunt and the sixteen-bit converter, in millivolts against the sample index. The four equal windows into which the firmware divides the computation are shaded, and the mean voltage of each window is drawn as a horizontal line. The four means are visibly different, and their ordering follows the Hamming weight of the corresponding key-dependent byte: the window whose intermediate byte has the larger Hamming weight draws more current</w:t>
       </w:r>
       <w:r>
@@ -14254,7 +14663,7 @@
           <w:noProof/>
         </w:rPr>
         <w:drawing>
-          <wp:inline distT="0" distB="0" distL="0" distR="0" wp14:anchorId="304F446C" wp14:editId="6C00ACF6">
+          <wp:inline distT="0" distB="0" distL="0" distR="0" wp14:anchorId="27AAC137" wp14:editId="5CC31BA4">
             <wp:extent cx="5303520" cy="1988820"/>
             <wp:effectExtent l="0" t="0" r="0" b="0"/>
             <wp:docPr id="15" name="Picture 15"/>
@@ -14312,23 +14721,20 @@
         <w:t>Figure 5.8 reports, for each of the four bytes of the recovered word, the correlation of the winning candidate against that of the runner-up, with the margin between them printed above each pair. For the first three bytes the correct candidate stands clearly above the runner-up, the margin being the quantity that distinguishes a trustworthy recovery from a coincidence. The fourth byte is instructive: its margin is essentially zero, the correct value and its nearest rival being indistinguishable at this trac</w:t>
       </w:r>
       <w:r>
-        <w:t xml:space="preserve">e count. The word is still recovered correctly because the addition that relates the leaked intermediate to the key couples the </w:t>
-      </w:r>
-      <w:r>
+        <w:t>e count. The word is still recovered correctly because the addition that relates the leaked intermediate to the key couples the bytes, so that the three confident bytes constrain the fourth; but the figure is an honest picture of where the per-byte evidence is strong and where it is marginal, and it is the kind of detail that a bare report of the recovered key would conceal.</w:t>
+      </w:r>
+    </w:p>
+    <w:p>
+      <w:pPr>
+        <w:jc w:val="center"/>
+      </w:pPr>
+      <w:r>
+        <w:rPr>
+          <w:noProof/>
+        </w:rPr>
         <w:lastRenderedPageBreak/>
-        <w:t>bytes, so that the three confident bytes constrain the fourth; but the figure is an honest picture of where the per-byte evidence is strong and where it is marginal, and it is the kind of detail that a bare report of the recovered key would conceal.</w:t>
-      </w:r>
-    </w:p>
-    <w:p>
-      <w:pPr>
-        <w:jc w:val="center"/>
-      </w:pPr>
-      <w:r>
-        <w:rPr>
-          <w:noProof/>
-        </w:rPr>
         <w:drawing>
-          <wp:inline distT="0" distB="0" distL="0" distR="0" wp14:anchorId="70F84F60" wp14:editId="010A1961">
+          <wp:inline distT="0" distB="0" distL="0" distR="0" wp14:anchorId="4408596A" wp14:editId="0F5B147F">
             <wp:extent cx="5303520" cy="2495774"/>
             <wp:effectExtent l="0" t="0" r="0" b="0"/>
             <wp:docPr id="16" name="Picture 16"/>
@@ -14830,23 +15236,20 @@
         <w:t>Figure 5.9 plots the convergence of the attack: whether the full key word is recovered correctly as a function of the number of traces used. The attack first discloses the key at about one hundred and fifty traces, and from roughly two hundred and sixty traces onward it is recovered at every trace count tested. The single point between these two, at which the recovery briefly fails again, is characteristic of a correlation that is near its detection boundary: with few traces the estimate is noisy and can cr</w:t>
       </w:r>
       <w:r>
-        <w:t xml:space="preserve">oss back and forth over the decision threshold before it settles. The number of traces to disclosure is therefore best read not as the first lucky success but as the count beyond which success is </w:t>
-      </w:r>
-      <w:r>
+        <w:t>oss back and forth over the decision threshold before it settles. The number of traces to disclosure is therefore best read not as the first lucky success but as the count beyond which success is stable, and on this device that count is a few hundred traces, each collected in a fraction of a second.</w:t>
+      </w:r>
+    </w:p>
+    <w:p>
+      <w:pPr>
+        <w:jc w:val="center"/>
+      </w:pPr>
+      <w:r>
+        <w:rPr>
+          <w:noProof/>
+        </w:rPr>
         <w:lastRenderedPageBreak/>
-        <w:t>stable, and on this device that count is a few hundred traces, each collected in a fraction of a second.</w:t>
-      </w:r>
-    </w:p>
-    <w:p>
-      <w:pPr>
-        <w:jc w:val="center"/>
-      </w:pPr>
-      <w:r>
-        <w:rPr>
-          <w:noProof/>
-        </w:rPr>
         <w:drawing>
-          <wp:inline distT="0" distB="0" distL="0" distR="0" wp14:anchorId="7B7C4952" wp14:editId="6A15B9A3">
+          <wp:inline distT="0" distB="0" distL="0" distR="0" wp14:anchorId="342E0F93" wp14:editId="66184029">
             <wp:extent cx="5303520" cy="2272937"/>
             <wp:effectExtent l="0" t="0" r="0" b="0"/>
             <wp:docPr id="17" name="Picture 17"/>
@@ -15288,11 +15691,14 @@
         <w:jc w:val="both"/>
       </w:pPr>
       <w:r>
-        <w:t xml:space="preserve">Figure 5.10 explains the failure of the timing attack on hardware in a single picture. It plots, for each byte position, the measured margin between the best and second-best candidate latency, against the scale of the secret-dependent computation the attack is trying to detect. Every margin is a fraction of a microsecond - two of them effectively zero, the third a spurious outlier - whereas the computation the attack depends on is some </w:t>
+        <w:t>Figure 5.10 explains the failure of the timing attack on hardware in a single picture. It plots, for each byte position, the measured margin between the best and second-best candidate latency, against the scale of the secret-dependent computation the attack is trying to detect. Every margin is a fraction of a microsecond - two of them effectively zero, the third a spurious outlier - whereas the computation the attack depends on is some two hundred microseconds and the serial round-trip that carries the meas</w:t>
+      </w:r>
+      <w:r>
+        <w:t xml:space="preserve">urement is some eight thousand microseconds. The signal is three to four orders of magnitude below the </w:t>
       </w:r>
       <w:r>
         <w:lastRenderedPageBreak/>
-        <w:t>two hundred microseconds and the serial round-trip that carries the measurement is some eight thousand microseconds. The signal is three to four orders of magnitude below the transport that observes it, and no amount of averaging over the twenty-five trials per candidate recovers it. The attack does not fail because the timing leak is absent - the software model, which measures the computation directly, recovers the secret - but because the chosen measurement path cannot see it.</w:t>
+        <w:t>transport that observes it, and no amount of averaging over the twenty-five trials per candidate recovers it. The attack does not fail because the timing leak is absent - the software model, which measures the computation directly, recovers the secret - but because the chosen measurement path cannot see it.</w:t>
       </w:r>
     </w:p>
     <w:p>
@@ -15304,7 +15710,7 @@
           <w:noProof/>
         </w:rPr>
         <w:drawing>
-          <wp:inline distT="0" distB="0" distL="0" distR="0" wp14:anchorId="5E7F8857" wp14:editId="5D9E618C">
+          <wp:inline distT="0" distB="0" distL="0" distR="0" wp14:anchorId="4B6242DB" wp14:editId="13AB9CDC">
             <wp:extent cx="5303520" cy="2339788"/>
             <wp:effectExtent l="0" t="0" r="0" b="0"/>
             <wp:docPr id="18" name="Picture 18"/>
@@ -15375,7 +15781,7 @@
         </w:rPr>
         <w:lastRenderedPageBreak/>
         <w:drawing>
-          <wp:inline distT="0" distB="0" distL="0" distR="0" wp14:anchorId="20111FF0" wp14:editId="4C02F920">
+          <wp:inline distT="0" distB="0" distL="0" distR="0" wp14:anchorId="39AD5A78" wp14:editId="4A74906D">
             <wp:extent cx="5303520" cy="1988820"/>
             <wp:effectExtent l="0" t="0" r="0" b="0"/>
             <wp:docPr id="19" name="Picture 19"/>
@@ -15926,7 +16332,7 @@
       <w:pPr>
         <w:pStyle w:val="Heading2"/>
       </w:pPr>
-      <w:bookmarkStart w:id="50" w:name="_Toc243342806"/>
+      <w:bookmarkStart w:id="50" w:name="_Toc243470032"/>
       <w:r>
         <w:rPr>
           <w:rFonts w:ascii="Times New Roman" w:hAnsi="Times New Roman"/>
@@ -16006,7 +16412,7 @@
       <w:pPr>
         <w:pStyle w:val="Heading2"/>
       </w:pPr>
-      <w:bookmarkStart w:id="51" w:name="_Toc243342807"/>
+      <w:bookmarkStart w:id="51" w:name="_Toc243470033"/>
       <w:r>
         <w:rPr>
           <w:rFonts w:ascii="Times New Roman" w:hAnsi="Times New Roman"/>
@@ -16605,7 +17011,7 @@
         <w:pageBreakBefore/>
         <w:jc w:val="center"/>
       </w:pPr>
-      <w:bookmarkStart w:id="52" w:name="_Toc243342808"/>
+      <w:bookmarkStart w:id="52" w:name="_Toc243470034"/>
       <w:r>
         <w:rPr>
           <w:rFonts w:ascii="Times New Roman" w:hAnsi="Times New Roman"/>
@@ -16634,7 +17040,7 @@
       <w:pPr>
         <w:pStyle w:val="Heading2"/>
       </w:pPr>
-      <w:bookmarkStart w:id="53" w:name="_Toc243342809"/>
+      <w:bookmarkStart w:id="53" w:name="_Toc243470035"/>
       <w:r>
         <w:rPr>
           <w:rFonts w:ascii="Times New Roman" w:hAnsi="Times New Roman"/>
@@ -16698,7 +17104,7 @@
       <w:pPr>
         <w:pStyle w:val="Heading2"/>
       </w:pPr>
-      <w:bookmarkStart w:id="54" w:name="_Toc243342810"/>
+      <w:bookmarkStart w:id="54" w:name="_Toc243470036"/>
       <w:r>
         <w:rPr>
           <w:rFonts w:ascii="Times New Roman" w:hAnsi="Times New Roman"/>
@@ -16750,7 +17156,7 @@
         <w:pStyle w:val="Heading1"/>
         <w:jc w:val="center"/>
       </w:pPr>
-      <w:bookmarkStart w:id="55" w:name="_Toc243342811"/>
+      <w:bookmarkStart w:id="55" w:name="_Toc243470037"/>
       <w:r>
         <w:rPr>
           <w:rFonts w:ascii="Times New Roman" w:hAnsi="Times New Roman"/>
@@ -16978,7 +17384,7 @@
         <w:pStyle w:val="Heading1"/>
         <w:jc w:val="center"/>
       </w:pPr>
-      <w:bookmarkStart w:id="56" w:name="_Toc243342812"/>
+      <w:bookmarkStart w:id="56" w:name="_Toc243470038"/>
       <w:r>
         <w:rPr>
           <w:rFonts w:ascii="Times New Roman" w:hAnsi="Times New Roman"/>
@@ -16994,7 +17400,7 @@
       <w:pPr>
         <w:pStyle w:val="Heading2"/>
       </w:pPr>
-      <w:bookmarkStart w:id="57" w:name="_Toc243342813"/>
+      <w:bookmarkStart w:id="57" w:name="_Toc243470039"/>
       <w:r>
         <w:rPr>
           <w:rFonts w:ascii="Times New Roman" w:hAnsi="Times New Roman"/>
@@ -17024,7 +17430,7 @@
       <w:pPr>
         <w:pStyle w:val="Heading2"/>
       </w:pPr>
-      <w:bookmarkStart w:id="58" w:name="_Toc243342814"/>
+      <w:bookmarkStart w:id="58" w:name="_Toc243470040"/>
       <w:r>
         <w:rPr>
           <w:rFonts w:ascii="Times New Roman" w:hAnsi="Times New Roman"/>
@@ -17128,7 +17534,7 @@
       <w:pPr>
         <w:pStyle w:val="Heading2"/>
       </w:pPr>
-      <w:bookmarkStart w:id="59" w:name="_Toc243342815"/>
+      <w:bookmarkStart w:id="59" w:name="_Toc243470041"/>
       <w:r>
         <w:rPr>
           <w:rFonts w:ascii="Times New Roman" w:hAnsi="Times New Roman"/>
@@ -17232,7 +17638,7 @@
       <w:pPr>
         <w:pStyle w:val="Heading2"/>
       </w:pPr>
-      <w:bookmarkStart w:id="60" w:name="_Toc243342816"/>
+      <w:bookmarkStart w:id="60" w:name="_Toc243470042"/>
       <w:r>
         <w:rPr>
           <w:rFonts w:ascii="Times New Roman" w:hAnsi="Times New Roman"/>
@@ -17390,7 +17796,7 @@
       <w:pPr>
         <w:pStyle w:val="Heading2"/>
       </w:pPr>
-      <w:bookmarkStart w:id="61" w:name="_Toc243342817"/>
+      <w:bookmarkStart w:id="61" w:name="_Toc243470043"/>
       <w:r>
         <w:rPr>
           <w:rFonts w:ascii="Times New Roman" w:hAnsi="Times New Roman"/>
@@ -17638,7 +18044,7 @@
       <w:pPr>
         <w:pStyle w:val="Heading2"/>
       </w:pPr>
-      <w:bookmarkStart w:id="62" w:name="_Toc243342818"/>
+      <w:bookmarkStart w:id="62" w:name="_Toc243470044"/>
       <w:r>
         <w:rPr>
           <w:rFonts w:ascii="Times New Roman" w:hAnsi="Times New Roman"/>
@@ -17790,7 +18196,7 @@
       <w:pPr>
         <w:pStyle w:val="Heading2"/>
       </w:pPr>
-      <w:bookmarkStart w:id="63" w:name="_Toc243342819"/>
+      <w:bookmarkStart w:id="63" w:name="_Toc243470045"/>
       <w:r>
         <w:rPr>
           <w:rFonts w:ascii="Times New Roman" w:hAnsi="Times New Roman"/>
@@ -17955,7 +18361,7 @@
       <w:pPr>
         <w:pStyle w:val="Heading2"/>
       </w:pPr>
-      <w:bookmarkStart w:id="64" w:name="_Toc243342820"/>
+      <w:bookmarkStart w:id="64" w:name="_Toc243470046"/>
       <w:r>
         <w:rPr>
           <w:rFonts w:ascii="Times New Roman" w:hAnsi="Times New Roman"/>
@@ -18136,7 +18542,7 @@
       <w:pPr>
         <w:pStyle w:val="Heading2"/>
       </w:pPr>
-      <w:bookmarkStart w:id="65" w:name="_Toc243342821"/>
+      <w:bookmarkStart w:id="65" w:name="_Toc243470047"/>
       <w:r>
         <w:rPr>
           <w:rFonts w:ascii="Times New Roman" w:hAnsi="Times New Roman"/>
@@ -18276,7 +18682,7 @@
       <w:pPr>
         <w:pStyle w:val="Heading2"/>
       </w:pPr>
-      <w:bookmarkStart w:id="66" w:name="_Toc243342822"/>
+      <w:bookmarkStart w:id="66" w:name="_Toc243470048"/>
       <w:r>
         <w:rPr>
           <w:rFonts w:ascii="Times New Roman" w:hAnsi="Times New Roman"/>
@@ -18465,7 +18871,7 @@
       <w:pPr>
         <w:pStyle w:val="Heading2"/>
       </w:pPr>
-      <w:bookmarkStart w:id="67" w:name="_Toc243342823"/>
+      <w:bookmarkStart w:id="67" w:name="_Toc243470049"/>
       <w:r>
         <w:rPr>
           <w:rFonts w:ascii="Times New Roman" w:hAnsi="Times New Roman"/>
@@ -18617,7 +19023,7 @@
       <w:pPr>
         <w:pStyle w:val="Heading2"/>
       </w:pPr>
-      <w:bookmarkStart w:id="68" w:name="_Toc243342824"/>
+      <w:bookmarkStart w:id="68" w:name="_Toc243470050"/>
       <w:r>
         <w:rPr>
           <w:rFonts w:ascii="Times New Roman" w:hAnsi="Times New Roman"/>
@@ -18781,7 +19187,7 @@
       <w:pPr>
         <w:pStyle w:val="Heading2"/>
       </w:pPr>
-      <w:bookmarkStart w:id="69" w:name="_Toc243342825"/>
+      <w:bookmarkStart w:id="69" w:name="_Toc243470051"/>
       <w:r>
         <w:rPr>
           <w:rFonts w:ascii="Times New Roman" w:hAnsi="Times New Roman"/>
@@ -18975,7 +19381,7 @@
       <w:pPr>
         <w:pStyle w:val="Heading2"/>
       </w:pPr>
-      <w:bookmarkStart w:id="70" w:name="_Toc243342826"/>
+      <w:bookmarkStart w:id="70" w:name="_Toc243470052"/>
       <w:r>
         <w:rPr>
           <w:rFonts w:ascii="Times New Roman" w:hAnsi="Times New Roman"/>
@@ -19115,7 +19521,7 @@
       <w:pPr>
         <w:pStyle w:val="Heading2"/>
       </w:pPr>
-      <w:bookmarkStart w:id="71" w:name="_Toc243342827"/>
+      <w:bookmarkStart w:id="71" w:name="_Toc243470053"/>
       <w:r>
         <w:rPr>
           <w:rFonts w:ascii="Times New Roman" w:hAnsi="Times New Roman"/>
@@ -19315,7 +19721,7 @@
       <w:pPr>
         <w:pStyle w:val="Heading2"/>
       </w:pPr>
-      <w:bookmarkStart w:id="72" w:name="_Toc243342828"/>
+      <w:bookmarkStart w:id="72" w:name="_Toc243470054"/>
       <w:r>
         <w:rPr>
           <w:rFonts w:ascii="Times New Roman" w:hAnsi="Times New Roman"/>
@@ -19394,7 +19800,7 @@
       <w:pPr>
         <w:pStyle w:val="Heading2"/>
       </w:pPr>
-      <w:bookmarkStart w:id="73" w:name="_Toc243342829"/>
+      <w:bookmarkStart w:id="73" w:name="_Toc243470055"/>
       <w:r>
         <w:rPr>
           <w:rFonts w:ascii="Times New Roman" w:hAnsi="Times New Roman"/>
@@ -19458,7 +19864,7 @@
       <w:pPr>
         <w:pStyle w:val="Heading2"/>
       </w:pPr>
-      <w:bookmarkStart w:id="74" w:name="_Toc243342830"/>
+      <w:bookmarkStart w:id="74" w:name="_Toc243470056"/>
       <w:r>
         <w:rPr>
           <w:rFonts w:ascii="Times New Roman" w:hAnsi="Times New Roman"/>
@@ -19528,7 +19934,7 @@
       <w:pPr>
         <w:pStyle w:val="Heading2"/>
       </w:pPr>
-      <w:bookmarkStart w:id="75" w:name="_Toc243342831"/>
+      <w:bookmarkStart w:id="75" w:name="_Toc243470057"/>
       <w:r>
         <w:rPr>
           <w:rFonts w:ascii="Times New Roman" w:hAnsi="Times New Roman"/>
@@ -19729,7 +20135,7 @@
       <w:pPr>
         <w:pStyle w:val="Heading2"/>
       </w:pPr>
-      <w:bookmarkStart w:id="76" w:name="_Toc243342832"/>
+      <w:bookmarkStart w:id="76" w:name="_Toc243470058"/>
       <w:r>
         <w:rPr>
           <w:rFonts w:ascii="Times New Roman" w:hAnsi="Times New Roman"/>
@@ -19953,7 +20359,7 @@
       <w:pPr>
         <w:pStyle w:val="Heading2"/>
       </w:pPr>
-      <w:bookmarkStart w:id="77" w:name="_Toc243342833"/>
+      <w:bookmarkStart w:id="77" w:name="_Toc243470059"/>
       <w:r>
         <w:rPr>
           <w:rFonts w:ascii="Times New Roman" w:hAnsi="Times New Roman"/>
@@ -20388,31 +20794,31 @@
       </w:rPr>
     </w:lvl>
   </w:abstractNum>
-  <w:num w:numId="1" w16cid:durableId="2033913383">
+  <w:num w:numId="1" w16cid:durableId="1256133194">
     <w:abstractNumId w:val="8"/>
   </w:num>
-  <w:num w:numId="2" w16cid:durableId="1577084748">
+  <w:num w:numId="2" w16cid:durableId="1801267110">
     <w:abstractNumId w:val="6"/>
   </w:num>
-  <w:num w:numId="3" w16cid:durableId="1145898456">
+  <w:num w:numId="3" w16cid:durableId="1548948915">
     <w:abstractNumId w:val="5"/>
   </w:num>
-  <w:num w:numId="4" w16cid:durableId="1059935965">
+  <w:num w:numId="4" w16cid:durableId="1342856426">
     <w:abstractNumId w:val="4"/>
   </w:num>
-  <w:num w:numId="5" w16cid:durableId="241910485">
+  <w:num w:numId="5" w16cid:durableId="217863132">
     <w:abstractNumId w:val="7"/>
   </w:num>
-  <w:num w:numId="6" w16cid:durableId="1692367002">
+  <w:num w:numId="6" w16cid:durableId="448015070">
     <w:abstractNumId w:val="3"/>
   </w:num>
-  <w:num w:numId="7" w16cid:durableId="1755853561">
+  <w:num w:numId="7" w16cid:durableId="1792822198">
     <w:abstractNumId w:val="2"/>
   </w:num>
-  <w:num w:numId="8" w16cid:durableId="939340608">
+  <w:num w:numId="8" w16cid:durableId="785927023">
     <w:abstractNumId w:val="1"/>
   </w:num>
-  <w:num w:numId="9" w16cid:durableId="1887644975">
+  <w:num w:numId="9" w16cid:durableId="957877541">
     <w:abstractNumId w:val="0"/>
   </w:num>
 </w:numbering>
@@ -31812,7 +32218,7 @@
     <w:autoRedefine/>
     <w:uiPriority w:val="39"/>
     <w:unhideWhenUsed/>
-    <w:rsid w:val="00012CE8"/>
+    <w:rsid w:val="00A95C8B"/>
     <w:pPr>
       <w:spacing w:after="100"/>
     </w:pPr>
@@ -31824,7 +32230,7 @@
     <w:autoRedefine/>
     <w:uiPriority w:val="39"/>
     <w:unhideWhenUsed/>
-    <w:rsid w:val="00012CE8"/>
+    <w:rsid w:val="00A95C8B"/>
     <w:pPr>
       <w:spacing w:after="100"/>
       <w:ind w:left="240"/>

</xml_diff>